<commit_message>
excel import and identify_checking logic, customer_related features
</commit_message>
<xml_diff>
--- a/crystal-backend/docs/crm-logic.docx
+++ b/crystal-backend/docs/crm-logic.docx
@@ -2541,7 +2541,7 @@
                 <w:sz w:val="18"/>
                 <w:szCs w:val="18"/>
               </w:rPr>
-              <w:t xml:space="preserve"> (a short public code) is kept but not used for links yet.</w:t>
+              <w:t xml:space="preserve"> is reserved for a later phase: nothing generates or reads it in phase 1, so it is empty.</w:t>
             </w:r>
           </w:p>
         </w:tc>
@@ -2858,9 +2858,9 @@
         </w:tblBorders>
       </w:tblPr>
       <w:tblGrid>
-        <w:gridCol w:w="1435"/>
-        <w:gridCol w:w="5242"/>
-        <w:gridCol w:w="2961"/>
+        <w:gridCol w:w="1716"/>
+        <w:gridCol w:w="5063"/>
+        <w:gridCol w:w="2859"/>
       </w:tblGrid>
       <w:tr>
         <w:trPr>
@@ -2868,7 +2868,7 @@
         </w:trPr>
         <w:tc>
           <w:tcPr>
-            <w:tcW w:type="dxa" w:w="1435"/>
+            <w:tcW w:type="dxa" w:w="1716"/>
             <w:tcBorders>
               <w:top w:val="single" w:color="BFC5CE" w:sz="4"/>
               <w:left w:val="single" w:color="BFC5CE" w:sz="4"/>
@@ -2902,7 +2902,7 @@
         </w:tc>
         <w:tc>
           <w:tcPr>
-            <w:tcW w:type="dxa" w:w="5242"/>
+            <w:tcW w:type="dxa" w:w="5063"/>
             <w:tcBorders>
               <w:top w:val="single" w:color="BFC5CE" w:sz="4"/>
               <w:left w:val="single" w:color="BFC5CE" w:sz="4"/>
@@ -2936,7 +2936,7 @@
         </w:tc>
         <w:tc>
           <w:tcPr>
-            <w:tcW w:type="dxa" w:w="2961"/>
+            <w:tcW w:type="dxa" w:w="2859"/>
             <w:tcBorders>
               <w:top w:val="single" w:color="BFC5CE" w:sz="4"/>
               <w:left w:val="single" w:color="BFC5CE" w:sz="4"/>
@@ -2975,7 +2975,7 @@
         </w:trPr>
         <w:tc>
           <w:tcPr>
-            <w:tcW w:type="dxa" w:w="1435"/>
+            <w:tcW w:type="dxa" w:w="1716"/>
             <w:tcBorders>
               <w:top w:val="single" w:color="BFC5CE" w:sz="4"/>
               <w:left w:val="single" w:color="BFC5CE" w:sz="4"/>
@@ -3006,7 +3006,7 @@
         </w:tc>
         <w:tc>
           <w:tcPr>
-            <w:tcW w:type="dxa" w:w="5242"/>
+            <w:tcW w:type="dxa" w:w="5063"/>
             <w:tcBorders>
               <w:top w:val="single" w:color="BFC5CE" w:sz="4"/>
               <w:left w:val="single" w:color="BFC5CE" w:sz="4"/>
@@ -3037,7 +3037,7 @@
         </w:tc>
         <w:tc>
           <w:tcPr>
-            <w:tcW w:type="dxa" w:w="2961"/>
+            <w:tcW w:type="dxa" w:w="2859"/>
             <w:tcBorders>
               <w:top w:val="single" w:color="BFC5CE" w:sz="4"/>
               <w:left w:val="single" w:color="BFC5CE" w:sz="4"/>
@@ -3105,7 +3105,7 @@
         </w:trPr>
         <w:tc>
           <w:tcPr>
-            <w:tcW w:type="dxa" w:w="1435"/>
+            <w:tcW w:type="dxa" w:w="1716"/>
             <w:tcBorders>
               <w:top w:val="single" w:color="BFC5CE" w:sz="4"/>
               <w:left w:val="single" w:color="BFC5CE" w:sz="4"/>
@@ -3136,7 +3136,7 @@
         </w:tc>
         <w:tc>
           <w:tcPr>
-            <w:tcW w:type="dxa" w:w="5242"/>
+            <w:tcW w:type="dxa" w:w="5063"/>
             <w:tcBorders>
               <w:top w:val="single" w:color="BFC5CE" w:sz="4"/>
               <w:left w:val="single" w:color="BFC5CE" w:sz="4"/>
@@ -3167,7 +3167,7 @@
         </w:tc>
         <w:tc>
           <w:tcPr>
-            <w:tcW w:type="dxa" w:w="2961"/>
+            <w:tcW w:type="dxa" w:w="2859"/>
             <w:tcBorders>
               <w:top w:val="single" w:color="BFC5CE" w:sz="4"/>
               <w:left w:val="single" w:color="BFC5CE" w:sz="4"/>
@@ -3235,7 +3235,7 @@
         </w:trPr>
         <w:tc>
           <w:tcPr>
-            <w:tcW w:type="dxa" w:w="1435"/>
+            <w:tcW w:type="dxa" w:w="1716"/>
             <w:tcBorders>
               <w:top w:val="single" w:color="BFC5CE" w:sz="4"/>
               <w:left w:val="single" w:color="BFC5CE" w:sz="4"/>
@@ -3266,7 +3266,7 @@
         </w:tc>
         <w:tc>
           <w:tcPr>
-            <w:tcW w:type="dxa" w:w="5242"/>
+            <w:tcW w:type="dxa" w:w="5063"/>
             <w:tcBorders>
               <w:top w:val="single" w:color="BFC5CE" w:sz="4"/>
               <w:left w:val="single" w:color="BFC5CE" w:sz="4"/>
@@ -3297,7 +3297,7 @@
         </w:tc>
         <w:tc>
           <w:tcPr>
-            <w:tcW w:type="dxa" w:w="2961"/>
+            <w:tcW w:type="dxa" w:w="2859"/>
             <w:tcBorders>
               <w:top w:val="single" w:color="BFC5CE" w:sz="4"/>
               <w:left w:val="single" w:color="BFC5CE" w:sz="4"/>
@@ -3333,7 +3333,7 @@
         </w:trPr>
         <w:tc>
           <w:tcPr>
-            <w:tcW w:type="dxa" w:w="1435"/>
+            <w:tcW w:type="dxa" w:w="1716"/>
             <w:tcBorders>
               <w:top w:val="single" w:color="BFC5CE" w:sz="4"/>
               <w:left w:val="single" w:color="BFC5CE" w:sz="4"/>
@@ -3364,7 +3364,7 @@
         </w:tc>
         <w:tc>
           <w:tcPr>
-            <w:tcW w:type="dxa" w:w="5242"/>
+            <w:tcW w:type="dxa" w:w="5063"/>
             <w:tcBorders>
               <w:top w:val="single" w:color="BFC5CE" w:sz="4"/>
               <w:left w:val="single" w:color="BFC5CE" w:sz="4"/>
@@ -3395,7 +3395,7 @@
         </w:tc>
         <w:tc>
           <w:tcPr>
-            <w:tcW w:type="dxa" w:w="2961"/>
+            <w:tcW w:type="dxa" w:w="2859"/>
             <w:tcBorders>
               <w:top w:val="single" w:color="BFC5CE" w:sz="4"/>
               <w:left w:val="single" w:color="BFC5CE" w:sz="4"/>
@@ -3431,7 +3431,7 @@
         </w:trPr>
         <w:tc>
           <w:tcPr>
-            <w:tcW w:type="dxa" w:w="1435"/>
+            <w:tcW w:type="dxa" w:w="1716"/>
             <w:tcBorders>
               <w:top w:val="single" w:color="BFC5CE" w:sz="4"/>
               <w:left w:val="single" w:color="BFC5CE" w:sz="4"/>
@@ -3462,7 +3462,7 @@
         </w:tc>
         <w:tc>
           <w:tcPr>
-            <w:tcW w:type="dxa" w:w="5242"/>
+            <w:tcW w:type="dxa" w:w="5063"/>
             <w:tcBorders>
               <w:top w:val="single" w:color="BFC5CE" w:sz="4"/>
               <w:left w:val="single" w:color="BFC5CE" w:sz="4"/>
@@ -3493,7 +3493,7 @@
         </w:tc>
         <w:tc>
           <w:tcPr>
-            <w:tcW w:type="dxa" w:w="2961"/>
+            <w:tcW w:type="dxa" w:w="2859"/>
             <w:tcBorders>
               <w:top w:val="single" w:color="BFC5CE" w:sz="4"/>
               <w:left w:val="single" w:color="BFC5CE" w:sz="4"/>
@@ -3529,7 +3529,7 @@
         </w:trPr>
         <w:tc>
           <w:tcPr>
-            <w:tcW w:type="dxa" w:w="1435"/>
+            <w:tcW w:type="dxa" w:w="1716"/>
             <w:tcBorders>
               <w:top w:val="single" w:color="BFC5CE" w:sz="4"/>
               <w:left w:val="single" w:color="BFC5CE" w:sz="4"/>
@@ -3560,7 +3560,7 @@
         </w:tc>
         <w:tc>
           <w:tcPr>
-            <w:tcW w:type="dxa" w:w="5242"/>
+            <w:tcW w:type="dxa" w:w="5063"/>
             <w:tcBorders>
               <w:top w:val="single" w:color="BFC5CE" w:sz="4"/>
               <w:left w:val="single" w:color="BFC5CE" w:sz="4"/>
@@ -3591,7 +3591,7 @@
         </w:tc>
         <w:tc>
           <w:tcPr>
-            <w:tcW w:type="dxa" w:w="2961"/>
+            <w:tcW w:type="dxa" w:w="2859"/>
             <w:tcBorders>
               <w:top w:val="single" w:color="BFC5CE" w:sz="4"/>
               <w:left w:val="single" w:color="BFC5CE" w:sz="4"/>
@@ -3627,7 +3627,7 @@
         </w:trPr>
         <w:tc>
           <w:tcPr>
-            <w:tcW w:type="dxa" w:w="1435"/>
+            <w:tcW w:type="dxa" w:w="1716"/>
             <w:tcBorders>
               <w:top w:val="single" w:color="BFC5CE" w:sz="4"/>
               <w:left w:val="single" w:color="BFC5CE" w:sz="4"/>
@@ -3658,7 +3658,7 @@
         </w:tc>
         <w:tc>
           <w:tcPr>
-            <w:tcW w:type="dxa" w:w="5242"/>
+            <w:tcW w:type="dxa" w:w="5063"/>
             <w:tcBorders>
               <w:top w:val="single" w:color="BFC5CE" w:sz="4"/>
               <w:left w:val="single" w:color="BFC5CE" w:sz="4"/>
@@ -3689,7 +3689,7 @@
         </w:tc>
         <w:tc>
           <w:tcPr>
-            <w:tcW w:type="dxa" w:w="2961"/>
+            <w:tcW w:type="dxa" w:w="2859"/>
             <w:tcBorders>
               <w:top w:val="single" w:color="BFC5CE" w:sz="4"/>
               <w:left w:val="single" w:color="BFC5CE" w:sz="4"/>
@@ -3741,7 +3741,7 @@
         </w:trPr>
         <w:tc>
           <w:tcPr>
-            <w:tcW w:type="dxa" w:w="1435"/>
+            <w:tcW w:type="dxa" w:w="1716"/>
             <w:tcBorders>
               <w:top w:val="single" w:color="BFC5CE" w:sz="4"/>
               <w:left w:val="single" w:color="BFC5CE" w:sz="4"/>
@@ -3772,7 +3772,7 @@
         </w:tc>
         <w:tc>
           <w:tcPr>
-            <w:tcW w:type="dxa" w:w="5242"/>
+            <w:tcW w:type="dxa" w:w="5063"/>
             <w:tcBorders>
               <w:top w:val="single" w:color="BFC5CE" w:sz="4"/>
               <w:left w:val="single" w:color="BFC5CE" w:sz="4"/>
@@ -3803,7 +3803,7 @@
         </w:tc>
         <w:tc>
           <w:tcPr>
-            <w:tcW w:type="dxa" w:w="2961"/>
+            <w:tcW w:type="dxa" w:w="2859"/>
             <w:tcBorders>
               <w:top w:val="single" w:color="BFC5CE" w:sz="4"/>
               <w:left w:val="single" w:color="BFC5CE" w:sz="4"/>
@@ -3839,38 +3839,38 @@
         </w:trPr>
         <w:tc>
           <w:tcPr>
-            <w:tcW w:type="dxa" w:w="1435"/>
-            <w:tcBorders>
-              <w:top w:val="single" w:color="BFC5CE" w:sz="4"/>
-              <w:left w:val="single" w:color="BFC5CE" w:sz="4"/>
-              <w:bottom w:val="single" w:color="BFC5CE" w:sz="4"/>
-              <w:right w:val="single" w:color="BFC5CE" w:sz="4"/>
-            </w:tcBorders>
-            <w:tcMar>
-              <w:top w:type="dxa" w:w="40"/>
-              <w:left w:type="dxa" w:w="80"/>
-              <w:bottom w:type="dxa" w:w="40"/>
-              <w:right w:type="dxa" w:w="80"/>
-            </w:tcMar>
-          </w:tcPr>
-          <w:p>
-            <w:pPr>
-              <w:spacing w:after="0" w:before="0"/>
-              <w:jc w:val="left"/>
-            </w:pPr>
-            <w:r>
-              <w:rPr>
-                <w:rFonts w:ascii="Calibri" w:cs="Calibri" w:eastAsia="Calibri" w:hAnsi="Calibri"/>
-                <w:sz w:val="18"/>
-                <w:szCs w:val="18"/>
-              </w:rPr>
-              <w:t xml:space="preserve">Sites / Site activity</w:t>
-            </w:r>
-          </w:p>
-        </w:tc>
-        <w:tc>
-          <w:tcPr>
-            <w:tcW w:type="dxa" w:w="5242"/>
+            <w:tcW w:type="dxa" w:w="1716"/>
+            <w:tcBorders>
+              <w:top w:val="single" w:color="BFC5CE" w:sz="4"/>
+              <w:left w:val="single" w:color="BFC5CE" w:sz="4"/>
+              <w:bottom w:val="single" w:color="BFC5CE" w:sz="4"/>
+              <w:right w:val="single" w:color="BFC5CE" w:sz="4"/>
+            </w:tcBorders>
+            <w:tcMar>
+              <w:top w:type="dxa" w:w="40"/>
+              <w:left w:type="dxa" w:w="80"/>
+              <w:bottom w:type="dxa" w:w="40"/>
+              <w:right w:type="dxa" w:w="80"/>
+            </w:tcMar>
+          </w:tcPr>
+          <w:p>
+            <w:pPr>
+              <w:spacing w:after="0" w:before="0"/>
+              <w:jc w:val="left"/>
+            </w:pPr>
+            <w:r>
+              <w:rPr>
+                <w:rFonts w:ascii="Calibri" w:cs="Calibri" w:eastAsia="Calibri" w:hAnsi="Calibri"/>
+                <w:sz w:val="18"/>
+                <w:szCs w:val="18"/>
+              </w:rPr>
+              <w:t xml:space="preserve">Sites / Service center activity</w:t>
+            </w:r>
+          </w:p>
+        </w:tc>
+        <w:tc>
+          <w:tcPr>
+            <w:tcW w:type="dxa" w:w="5063"/>
             <w:tcBorders>
               <w:top w:val="single" w:color="BFC5CE" w:sz="4"/>
               <w:left w:val="single" w:color="BFC5CE" w:sz="4"/>
@@ -3901,7 +3901,7 @@
         </w:tc>
         <w:tc>
           <w:tcPr>
-            <w:tcW w:type="dxa" w:w="2961"/>
+            <w:tcW w:type="dxa" w:w="2859"/>
             <w:tcBorders>
               <w:top w:val="single" w:color="BFC5CE" w:sz="4"/>
               <w:left w:val="single" w:color="BFC5CE" w:sz="4"/>
@@ -3937,7 +3937,7 @@
         </w:trPr>
         <w:tc>
           <w:tcPr>
-            <w:tcW w:type="dxa" w:w="1435"/>
+            <w:tcW w:type="dxa" w:w="1716"/>
             <w:tcBorders>
               <w:top w:val="single" w:color="BFC5CE" w:sz="4"/>
               <w:left w:val="single" w:color="BFC5CE" w:sz="4"/>
@@ -3968,7 +3968,7 @@
         </w:tc>
         <w:tc>
           <w:tcPr>
-            <w:tcW w:type="dxa" w:w="5242"/>
+            <w:tcW w:type="dxa" w:w="5063"/>
             <w:tcBorders>
               <w:top w:val="single" w:color="BFC5CE" w:sz="4"/>
               <w:left w:val="single" w:color="BFC5CE" w:sz="4"/>
@@ -3999,7 +3999,7 @@
         </w:tc>
         <w:tc>
           <w:tcPr>
-            <w:tcW w:type="dxa" w:w="2961"/>
+            <w:tcW w:type="dxa" w:w="2859"/>
             <w:tcBorders>
               <w:top w:val="single" w:color="BFC5CE" w:sz="4"/>
               <w:left w:val="single" w:color="BFC5CE" w:sz="4"/>
@@ -4035,7 +4035,7 @@
         </w:trPr>
         <w:tc>
           <w:tcPr>
-            <w:tcW w:type="dxa" w:w="1435"/>
+            <w:tcW w:type="dxa" w:w="1716"/>
             <w:tcBorders>
               <w:top w:val="single" w:color="BFC5CE" w:sz="4"/>
               <w:left w:val="single" w:color="BFC5CE" w:sz="4"/>
@@ -4066,7 +4066,7 @@
         </w:tc>
         <w:tc>
           <w:tcPr>
-            <w:tcW w:type="dxa" w:w="5242"/>
+            <w:tcW w:type="dxa" w:w="5063"/>
             <w:tcBorders>
               <w:top w:val="single" w:color="BFC5CE" w:sz="4"/>
               <w:left w:val="single" w:color="BFC5CE" w:sz="4"/>
@@ -4097,7 +4097,7 @@
         </w:tc>
         <w:tc>
           <w:tcPr>
-            <w:tcW w:type="dxa" w:w="2961"/>
+            <w:tcW w:type="dxa" w:w="2859"/>
             <w:tcBorders>
               <w:top w:val="single" w:color="BFC5CE" w:sz="4"/>
               <w:left w:val="single" w:color="BFC5CE" w:sz="4"/>
@@ -4133,7 +4133,7 @@
         </w:trPr>
         <w:tc>
           <w:tcPr>
-            <w:tcW w:type="dxa" w:w="1435"/>
+            <w:tcW w:type="dxa" w:w="1716"/>
             <w:tcBorders>
               <w:top w:val="single" w:color="BFC5CE" w:sz="4"/>
               <w:left w:val="single" w:color="BFC5CE" w:sz="4"/>
@@ -4164,7 +4164,7 @@
         </w:tc>
         <w:tc>
           <w:tcPr>
-            <w:tcW w:type="dxa" w:w="5242"/>
+            <w:tcW w:type="dxa" w:w="5063"/>
             <w:tcBorders>
               <w:top w:val="single" w:color="BFC5CE" w:sz="4"/>
               <w:left w:val="single" w:color="BFC5CE" w:sz="4"/>
@@ -4195,7 +4195,7 @@
         </w:tc>
         <w:tc>
           <w:tcPr>
-            <w:tcW w:type="dxa" w:w="2961"/>
+            <w:tcW w:type="dxa" w:w="2859"/>
             <w:tcBorders>
               <w:top w:val="single" w:color="BFC5CE" w:sz="4"/>
               <w:left w:val="single" w:color="BFC5CE" w:sz="4"/>
@@ -4247,7 +4247,7 @@
         </w:trPr>
         <w:tc>
           <w:tcPr>
-            <w:tcW w:type="dxa" w:w="1435"/>
+            <w:tcW w:type="dxa" w:w="1716"/>
             <w:tcBorders>
               <w:top w:val="single" w:color="BFC5CE" w:sz="4"/>
               <w:left w:val="single" w:color="BFC5CE" w:sz="4"/>
@@ -4278,7 +4278,7 @@
         </w:tc>
         <w:tc>
           <w:tcPr>
-            <w:tcW w:type="dxa" w:w="5242"/>
+            <w:tcW w:type="dxa" w:w="5063"/>
             <w:tcBorders>
               <w:top w:val="single" w:color="BFC5CE" w:sz="4"/>
               <w:left w:val="single" w:color="BFC5CE" w:sz="4"/>
@@ -4309,7 +4309,7 @@
         </w:tc>
         <w:tc>
           <w:tcPr>
-            <w:tcW w:type="dxa" w:w="2961"/>
+            <w:tcW w:type="dxa" w:w="2859"/>
             <w:tcBorders>
               <w:top w:val="single" w:color="BFC5CE" w:sz="4"/>
               <w:left w:val="single" w:color="BFC5CE" w:sz="4"/>
@@ -5002,7 +5002,7 @@
         <w:rPr>
           <w:rFonts w:ascii="Calibri" w:cs="Calibri" w:eastAsia="Calibri" w:hAnsi="Calibri"/>
         </w:rPr>
-        <w:t xml:space="preserve">, the vendor location list), street address, and </w:t>
+        <w:t xml:space="preserve">, the vendor location list), a written address (</w:t>
       </w:r>
       <w:r>
         <w:rPr>
@@ -5010,6 +5010,20 @@
           <w:sz w:val="19"/>
           <w:szCs w:val="19"/>
         </w:rPr>
+        <w:t xml:space="preserve">address_line</w:t>
+      </w:r>
+      <w:r>
+        <w:rPr>
+          <w:rFonts w:ascii="Calibri" w:cs="Calibri" w:eastAsia="Calibri" w:hAnsi="Calibri"/>
+        </w:rPr>
+        <w:t xml:space="preserve">, free text kept for search), and </w:t>
+      </w:r>
+      <w:r>
+        <w:rPr>
+          <w:rFonts w:ascii="Consolas" w:cs="Consolas" w:eastAsia="Consolas" w:hAnsi="Consolas"/>
+          <w:sz w:val="19"/>
+          <w:szCs w:val="19"/>
+        </w:rPr>
         <w:t xml:space="preserve">is_checked_manually</w:t>
       </w:r>
       <w:r>
@@ -5017,6 +5031,52 @@
           <w:rFonts w:ascii="Calibri" w:cs="Calibri" w:eastAsia="Calibri" w:hAnsi="Calibri"/>
         </w:rPr>
         <w:t xml:space="preserve"> (set when a manager has reviewed the person by hand).</w:t>
+      </w:r>
+    </w:p>
+    <w:p>
+      <w:pPr>
+        <w:pStyle w:val="ListParagraph"/>
+        <w:numPr>
+          <w:ilvl w:val="0"/>
+          <w:numId w:val="2"/>
+        </w:numPr>
+        <w:spacing w:after="40"/>
+      </w:pPr>
+      <w:r>
+        <w:rPr>
+          <w:rFonts w:ascii="Calibri" w:cs="Calibri" w:eastAsia="Calibri" w:hAnsi="Calibri"/>
+        </w:rPr>
+        <w:t xml:space="preserve">The address is shown once: the written address when there is one, otherwise the location name.</w:t>
+      </w:r>
+    </w:p>
+    <w:p>
+      <w:pPr>
+        <w:pStyle w:val="ListParagraph"/>
+        <w:numPr>
+          <w:ilvl w:val="0"/>
+          <w:numId w:val="2"/>
+        </w:numPr>
+        <w:spacing w:after="40"/>
+      </w:pPr>
+      <w:r>
+        <w:rPr>
+          <w:rFonts w:ascii="Calibri" w:cs="Calibri" w:eastAsia="Calibri" w:hAnsi="Calibri"/>
+        </w:rPr>
+        <w:t xml:space="preserve">The project a customer came from (</w:t>
+      </w:r>
+      <w:r>
+        <w:rPr>
+          <w:rFonts w:ascii="Consolas" w:cs="Consolas" w:eastAsia="Consolas" w:hAnsi="Consolas"/>
+          <w:sz w:val="19"/>
+          <w:szCs w:val="19"/>
+        </w:rPr>
+        <w:t xml:space="preserve">origin_project_id</w:t>
+      </w:r>
+      <w:r>
+        <w:rPr>
+          <w:rFonts w:ascii="Calibri" w:cs="Calibri" w:eastAsia="Calibri" w:hAnsi="Calibri"/>
+        </w:rPr>
+        <w:t xml:space="preserve">) is always chosen - on the New customer form, or per Excel row - and never assumed.</w:t>
       </w:r>
     </w:p>
     <w:p>
@@ -6003,8 +6063,8 @@
         </w:tblBorders>
       </w:tblPr>
       <w:tblGrid>
-        <w:gridCol w:w="8952"/>
-        <w:gridCol w:w="686"/>
+        <w:gridCol w:w="8990"/>
+        <w:gridCol w:w="648"/>
       </w:tblGrid>
       <w:tr>
         <w:trPr>
@@ -6012,7 +6072,7 @@
         </w:trPr>
         <w:tc>
           <w:tcPr>
-            <w:tcW w:type="dxa" w:w="8952"/>
+            <w:tcW w:type="dxa" w:w="8990"/>
             <w:tcBorders>
               <w:top w:val="single" w:color="BFC5CE" w:sz="4"/>
               <w:left w:val="single" w:color="BFC5CE" w:sz="4"/>
@@ -6046,7 +6106,7 @@
         </w:tc>
         <w:tc>
           <w:tcPr>
-            <w:tcW w:type="dxa" w:w="686"/>
+            <w:tcW w:type="dxa" w:w="648"/>
             <w:tcBorders>
               <w:top w:val="single" w:color="BFC5CE" w:sz="4"/>
               <w:left w:val="single" w:color="BFC5CE" w:sz="4"/>
@@ -6085,7 +6145,7 @@
         </w:trPr>
         <w:tc>
           <w:tcPr>
-            <w:tcW w:type="dxa" w:w="8952"/>
+            <w:tcW w:type="dxa" w:w="8990"/>
             <w:tcBorders>
               <w:top w:val="single" w:color="BFC5CE" w:sz="4"/>
               <w:left w:val="single" w:color="BFC5CE" w:sz="4"/>
@@ -6116,7 +6176,7 @@
         </w:tc>
         <w:tc>
           <w:tcPr>
-            <w:tcW w:type="dxa" w:w="686"/>
+            <w:tcW w:type="dxa" w:w="648"/>
             <w:tcBorders>
               <w:top w:val="single" w:color="BFC5CE" w:sz="4"/>
               <w:left w:val="single" w:color="BFC5CE" w:sz="4"/>
@@ -6152,7 +6212,7 @@
         </w:trPr>
         <w:tc>
           <w:tcPr>
-            <w:tcW w:type="dxa" w:w="8952"/>
+            <w:tcW w:type="dxa" w:w="8990"/>
             <w:tcBorders>
               <w:top w:val="single" w:color="BFC5CE" w:sz="4"/>
               <w:left w:val="single" w:color="BFC5CE" w:sz="4"/>
@@ -6183,7 +6243,7 @@
         </w:tc>
         <w:tc>
           <w:tcPr>
-            <w:tcW w:type="dxa" w:w="686"/>
+            <w:tcW w:type="dxa" w:w="648"/>
             <w:tcBorders>
               <w:top w:val="single" w:color="BFC5CE" w:sz="4"/>
               <w:left w:val="single" w:color="BFC5CE" w:sz="4"/>
@@ -6219,7 +6279,7 @@
         </w:trPr>
         <w:tc>
           <w:tcPr>
-            <w:tcW w:type="dxa" w:w="8952"/>
+            <w:tcW w:type="dxa" w:w="8990"/>
             <w:tcBorders>
               <w:top w:val="single" w:color="BFC5CE" w:sz="4"/>
               <w:left w:val="single" w:color="BFC5CE" w:sz="4"/>
@@ -6250,7 +6310,7 @@
         </w:tc>
         <w:tc>
           <w:tcPr>
-            <w:tcW w:type="dxa" w:w="686"/>
+            <w:tcW w:type="dxa" w:w="648"/>
             <w:tcBorders>
               <w:top w:val="single" w:color="BFC5CE" w:sz="4"/>
               <w:left w:val="single" w:color="BFC5CE" w:sz="4"/>
@@ -6286,38 +6346,38 @@
         </w:trPr>
         <w:tc>
           <w:tcPr>
-            <w:tcW w:type="dxa" w:w="8952"/>
-            <w:tcBorders>
-              <w:top w:val="single" w:color="BFC5CE" w:sz="4"/>
-              <w:left w:val="single" w:color="BFC5CE" w:sz="4"/>
-              <w:bottom w:val="single" w:color="BFC5CE" w:sz="4"/>
-              <w:right w:val="single" w:color="BFC5CE" w:sz="4"/>
-            </w:tcBorders>
-            <w:tcMar>
-              <w:top w:type="dxa" w:w="40"/>
-              <w:left w:type="dxa" w:w="80"/>
-              <w:bottom w:type="dxa" w:w="40"/>
-              <w:right w:type="dxa" w:w="80"/>
-            </w:tcMar>
-          </w:tcPr>
-          <w:p>
-            <w:pPr>
-              <w:spacing w:after="0" w:before="0"/>
-              <w:jc w:val="left"/>
-            </w:pPr>
-            <w:r>
-              <w:rPr>
-                <w:rFonts w:ascii="Calibri" w:cs="Calibri" w:eastAsia="Calibri" w:hAnsi="Calibri"/>
-                <w:sz w:val="18"/>
-                <w:szCs w:val="18"/>
-              </w:rPr>
-              <w:t xml:space="preserve">Same home address (street + location; a shared town alone is not an address)</w:t>
-            </w:r>
-          </w:p>
-        </w:tc>
-        <w:tc>
-          <w:tcPr>
-            <w:tcW w:type="dxa" w:w="686"/>
+            <w:tcW w:type="dxa" w:w="8990"/>
+            <w:tcBorders>
+              <w:top w:val="single" w:color="BFC5CE" w:sz="4"/>
+              <w:left w:val="single" w:color="BFC5CE" w:sz="4"/>
+              <w:bottom w:val="single" w:color="BFC5CE" w:sz="4"/>
+              <w:right w:val="single" w:color="BFC5CE" w:sz="4"/>
+            </w:tcBorders>
+            <w:tcMar>
+              <w:top w:type="dxa" w:w="40"/>
+              <w:left w:type="dxa" w:w="80"/>
+              <w:bottom w:type="dxa" w:w="40"/>
+              <w:right w:type="dxa" w:w="80"/>
+            </w:tcMar>
+          </w:tcPr>
+          <w:p>
+            <w:pPr>
+              <w:spacing w:after="0" w:before="0"/>
+              <w:jc w:val="left"/>
+            </w:pPr>
+            <w:r>
+              <w:rPr>
+                <w:rFonts w:ascii="Calibri" w:cs="Calibri" w:eastAsia="Calibri" w:hAnsi="Calibri"/>
+                <w:sz w:val="18"/>
+                <w:szCs w:val="18"/>
+              </w:rPr>
+              <w:t xml:space="preserve">Same home location (the Location ID on the vendor list; the written address text is not compared)</w:t>
+            </w:r>
+          </w:p>
+        </w:tc>
+        <w:tc>
+          <w:tcPr>
+            <w:tcW w:type="dxa" w:w="648"/>
             <w:tcBorders>
               <w:top w:val="single" w:color="BFC5CE" w:sz="4"/>
               <w:left w:val="single" w:color="BFC5CE" w:sz="4"/>
@@ -6353,7 +6413,7 @@
         </w:trPr>
         <w:tc>
           <w:tcPr>
-            <w:tcW w:type="dxa" w:w="8952"/>
+            <w:tcW w:type="dxa" w:w="8990"/>
             <w:tcBorders>
               <w:top w:val="single" w:color="BFC5CE" w:sz="4"/>
               <w:left w:val="single" w:color="BFC5CE" w:sz="4"/>
@@ -6384,7 +6444,7 @@
         </w:tc>
         <w:tc>
           <w:tcPr>
-            <w:tcW w:type="dxa" w:w="686"/>
+            <w:tcW w:type="dxa" w:w="648"/>
             <w:tcBorders>
               <w:top w:val="single" w:color="BFC5CE" w:sz="4"/>
               <w:left w:val="single" w:color="BFC5CE" w:sz="4"/>
@@ -6433,8 +6493,8 @@
         </w:tblBorders>
       </w:tblPr>
       <w:tblGrid>
-        <w:gridCol w:w="695"/>
-        <w:gridCol w:w="8943"/>
+        <w:gridCol w:w="822"/>
+        <w:gridCol w:w="8816"/>
       </w:tblGrid>
       <w:tr>
         <w:trPr>
@@ -6442,7 +6502,7 @@
         </w:trPr>
         <w:tc>
           <w:tcPr>
-            <w:tcW w:type="dxa" w:w="695"/>
+            <w:tcW w:type="dxa" w:w="822"/>
             <w:tcBorders>
               <w:top w:val="single" w:color="BFC5CE" w:sz="4"/>
               <w:left w:val="single" w:color="BFC5CE" w:sz="4"/>
@@ -6476,7 +6536,7 @@
         </w:tc>
         <w:tc>
           <w:tcPr>
-            <w:tcW w:type="dxa" w:w="8943"/>
+            <w:tcW w:type="dxa" w:w="8816"/>
             <w:tcBorders>
               <w:top w:val="single" w:color="BFC5CE" w:sz="4"/>
               <w:left w:val="single" w:color="BFC5CE" w:sz="4"/>
@@ -6515,38 +6575,38 @@
         </w:trPr>
         <w:tc>
           <w:tcPr>
-            <w:tcW w:type="dxa" w:w="695"/>
-            <w:tcBorders>
-              <w:top w:val="single" w:color="BFC5CE" w:sz="4"/>
-              <w:left w:val="single" w:color="BFC5CE" w:sz="4"/>
-              <w:bottom w:val="single" w:color="BFC5CE" w:sz="4"/>
-              <w:right w:val="single" w:color="BFC5CE" w:sz="4"/>
-            </w:tcBorders>
-            <w:tcMar>
-              <w:top w:type="dxa" w:w="40"/>
-              <w:left w:type="dxa" w:w="80"/>
-              <w:bottom w:type="dxa" w:w="40"/>
-              <w:right w:type="dxa" w:w="80"/>
-            </w:tcMar>
-          </w:tcPr>
-          <w:p>
-            <w:pPr>
-              <w:spacing w:after="0" w:before="0"/>
-              <w:jc w:val="left"/>
-            </w:pPr>
-            <w:r>
-              <w:rPr>
-                <w:rFonts w:ascii="Calibri" w:cs="Calibri" w:eastAsia="Calibri" w:hAnsi="Calibri"/>
-                <w:sz w:val="18"/>
-                <w:szCs w:val="18"/>
-              </w:rPr>
-              <w:t xml:space="preserve">0-40</w:t>
-            </w:r>
-          </w:p>
-        </w:tc>
-        <w:tc>
-          <w:tcPr>
-            <w:tcW w:type="dxa" w:w="8943"/>
+            <w:tcW w:type="dxa" w:w="822"/>
+            <w:tcBorders>
+              <w:top w:val="single" w:color="BFC5CE" w:sz="4"/>
+              <w:left w:val="single" w:color="BFC5CE" w:sz="4"/>
+              <w:bottom w:val="single" w:color="BFC5CE" w:sz="4"/>
+              <w:right w:val="single" w:color="BFC5CE" w:sz="4"/>
+            </w:tcBorders>
+            <w:tcMar>
+              <w:top w:type="dxa" w:w="40"/>
+              <w:left w:type="dxa" w:w="80"/>
+              <w:bottom w:type="dxa" w:w="40"/>
+              <w:right w:type="dxa" w:w="80"/>
+            </w:tcMar>
+          </w:tcPr>
+          <w:p>
+            <w:pPr>
+              <w:spacing w:after="0" w:before="0"/>
+              <w:jc w:val="left"/>
+            </w:pPr>
+            <w:r>
+              <w:rPr>
+                <w:rFonts w:ascii="Calibri" w:cs="Calibri" w:eastAsia="Calibri" w:hAnsi="Calibri"/>
+                <w:sz w:val="18"/>
+                <w:szCs w:val="18"/>
+              </w:rPr>
+              <w:t xml:space="preserve">below 50</w:t>
+            </w:r>
+          </w:p>
+        </w:tc>
+        <w:tc>
+          <w:tcPr>
+            <w:tcW w:type="dxa" w:w="8816"/>
             <w:tcBorders>
               <w:top w:val="single" w:color="BFC5CE" w:sz="4"/>
               <w:left w:val="single" w:color="BFC5CE" w:sz="4"/>
@@ -6582,38 +6642,38 @@
         </w:trPr>
         <w:tc>
           <w:tcPr>
-            <w:tcW w:type="dxa" w:w="695"/>
-            <w:tcBorders>
-              <w:top w:val="single" w:color="BFC5CE" w:sz="4"/>
-              <w:left w:val="single" w:color="BFC5CE" w:sz="4"/>
-              <w:bottom w:val="single" w:color="BFC5CE" w:sz="4"/>
-              <w:right w:val="single" w:color="BFC5CE" w:sz="4"/>
-            </w:tcBorders>
-            <w:tcMar>
-              <w:top w:type="dxa" w:w="40"/>
-              <w:left w:type="dxa" w:w="80"/>
-              <w:bottom w:type="dxa" w:w="40"/>
-              <w:right w:type="dxa" w:w="80"/>
-            </w:tcMar>
-          </w:tcPr>
-          <w:p>
-            <w:pPr>
-              <w:spacing w:after="0" w:before="0"/>
-              <w:jc w:val="left"/>
-            </w:pPr>
-            <w:r>
-              <w:rPr>
-                <w:rFonts w:ascii="Calibri" w:cs="Calibri" w:eastAsia="Calibri" w:hAnsi="Calibri"/>
-                <w:sz w:val="18"/>
-                <w:szCs w:val="18"/>
-              </w:rPr>
-              <w:t xml:space="preserve">41-69</w:t>
-            </w:r>
-          </w:p>
-        </w:tc>
-        <w:tc>
-          <w:tcPr>
-            <w:tcW w:type="dxa" w:w="8943"/>
+            <w:tcW w:type="dxa" w:w="822"/>
+            <w:tcBorders>
+              <w:top w:val="single" w:color="BFC5CE" w:sz="4"/>
+              <w:left w:val="single" w:color="BFC5CE" w:sz="4"/>
+              <w:bottom w:val="single" w:color="BFC5CE" w:sz="4"/>
+              <w:right w:val="single" w:color="BFC5CE" w:sz="4"/>
+            </w:tcBorders>
+            <w:tcMar>
+              <w:top w:type="dxa" w:w="40"/>
+              <w:left w:type="dxa" w:w="80"/>
+              <w:bottom w:type="dxa" w:w="40"/>
+              <w:right w:type="dxa" w:w="80"/>
+            </w:tcMar>
+          </w:tcPr>
+          <w:p>
+            <w:pPr>
+              <w:spacing w:after="0" w:before="0"/>
+              <w:jc w:val="left"/>
+            </w:pPr>
+            <w:r>
+              <w:rPr>
+                <w:rFonts w:ascii="Calibri" w:cs="Calibri" w:eastAsia="Calibri" w:hAnsi="Calibri"/>
+                <w:sz w:val="18"/>
+                <w:szCs w:val="18"/>
+              </w:rPr>
+              <w:t xml:space="preserve">50-69</w:t>
+            </w:r>
+          </w:p>
+        </w:tc>
+        <w:tc>
+          <w:tcPr>
+            <w:tcW w:type="dxa" w:w="8816"/>
             <w:tcBorders>
               <w:top w:val="single" w:color="BFC5CE" w:sz="4"/>
               <w:left w:val="single" w:color="BFC5CE" w:sz="4"/>
@@ -6701,7 +6761,7 @@
         </w:trPr>
         <w:tc>
           <w:tcPr>
-            <w:tcW w:type="dxa" w:w="695"/>
+            <w:tcW w:type="dxa" w:w="822"/>
             <w:tcBorders>
               <w:top w:val="single" w:color="BFC5CE" w:sz="4"/>
               <w:left w:val="single" w:color="BFC5CE" w:sz="4"/>
@@ -6732,7 +6792,7 @@
         </w:tc>
         <w:tc>
           <w:tcPr>
-            <w:tcW w:type="dxa" w:w="8943"/>
+            <w:tcW w:type="dxa" w:w="8816"/>
             <w:tcBorders>
               <w:top w:val="single" w:color="BFC5CE" w:sz="4"/>
               <w:left w:val="single" w:color="BFC5CE" w:sz="4"/>
@@ -6798,6 +6858,90 @@
       <w:r>
         <w:rPr>
           <w:rFonts w:ascii="Calibri" w:cs="Calibri" w:eastAsia="Calibri" w:hAnsi="Calibri"/>
+          <w:b/>
+          <w:bCs/>
+        </w:rPr>
+        <w:t xml:space="preserve">Excel imports only:</w:t>
+      </w:r>
+      <w:r>
+        <w:rPr>
+          <w:rFonts w:ascii="Calibri" w:cs="Calibri" w:eastAsia="Calibri" w:hAnsi="Calibri"/>
+        </w:rPr>
+        <w:t xml:space="preserve"> the same </w:t>
+      </w:r>
+      <w:r>
+        <w:rPr>
+          <w:rFonts w:ascii="Calibri" w:cs="Calibri" w:eastAsia="Calibri" w:hAnsi="Calibri"/>
+          <w:b/>
+          <w:bCs/>
+        </w:rPr>
+        <w:t xml:space="preserve">User PK</w:t>
+      </w:r>
+      <w:r>
+        <w:rPr>
+          <w:rFonts w:ascii="Calibri" w:cs="Calibri" w:eastAsia="Calibri" w:hAnsi="Calibri"/>
+        </w:rPr>
+        <w:t xml:space="preserve"> (with the same User ID) is the same person whatever the phone, because a sheet lists one row per phone number. Such rows are merged automatically (scored 70) and every phone is kept on the one customer; the account is staged once. This also matches a customer who already carries that User PK - a linked user-management account, or a candidate ID from an earlier import. Without it, the score table decides.</w:t>
+      </w:r>
+    </w:p>
+    <w:p>
+      <w:pPr>
+        <w:pStyle w:val="ListParagraph"/>
+        <w:numPr>
+          <w:ilvl w:val="0"/>
+          <w:numId w:val="2"/>
+        </w:numPr>
+        <w:spacing w:after="40"/>
+      </w:pPr>
+      <w:r>
+        <w:rPr>
+          <w:rFonts w:ascii="Calibri" w:cs="Calibri" w:eastAsia="Calibri" w:hAnsi="Calibri"/>
+        </w:rPr>
+        <w:t xml:space="preserve">*Source record* on the review tabs is the key the registration has in the system it came from: the account id for a department API registration, the identifier for an account assignment, "Excel row N" for a spreadsheet row (stored as </w:t>
+      </w:r>
+      <w:r>
+        <w:rPr>
+          <w:rFonts w:ascii="Consolas" w:cs="Consolas" w:eastAsia="Consolas" w:hAnsi="Consolas"/>
+          <w:sz w:val="19"/>
+          <w:szCs w:val="19"/>
+        </w:rPr>
+        <w:t xml:space="preserve">excel:&lt;file hash&gt;:&lt;row&gt;</w:t>
+      </w:r>
+      <w:r>
+        <w:rPr>
+          <w:rFonts w:ascii="Calibri" w:cs="Calibri" w:eastAsia="Calibri" w:hAnsi="Calibri"/>
+        </w:rPr>
+        <w:t xml:space="preserve">), and a dash for a console entry.</w:t>
+      </w:r>
+    </w:p>
+    <w:p>
+      <w:pPr>
+        <w:pStyle w:val="ListParagraph"/>
+        <w:numPr>
+          <w:ilvl w:val="0"/>
+          <w:numId w:val="2"/>
+        </w:numPr>
+        <w:spacing w:after="40"/>
+      </w:pPr>
+      <w:r>
+        <w:rPr>
+          <w:rFonts w:ascii="Calibri" w:cs="Calibri" w:eastAsia="Calibri" w:hAnsi="Calibri"/>
+        </w:rPr>
+        <w:t xml:space="preserve">Every review tab (and Existing duplicate records, Import errors) has a search box: name, phone, birthday, an e-shop or user identifier, the registration or customer number, or the source.</w:t>
+      </w:r>
+    </w:p>
+    <w:p>
+      <w:pPr>
+        <w:pStyle w:val="ListParagraph"/>
+        <w:numPr>
+          <w:ilvl w:val="0"/>
+          <w:numId w:val="2"/>
+        </w:numPr>
+        <w:spacing w:after="40"/>
+      </w:pPr>
+      <w:r>
+        <w:rPr>
+          <w:rFonts w:ascii="Calibri" w:cs="Calibri" w:eastAsia="Calibri" w:hAnsi="Calibri"/>
         </w:rPr>
         <w:t xml:space="preserve">Matching also compares against pending intakes, so two uncertain copies of one person cannot both slip through.</w:t>
       </w:r>
@@ -6859,9 +7003,9 @@
         </w:tblBorders>
       </w:tblPr>
       <w:tblGrid>
-        <w:gridCol w:w="1469"/>
-        <w:gridCol w:w="4400"/>
-        <w:gridCol w:w="3769"/>
+        <w:gridCol w:w="1387"/>
+        <w:gridCol w:w="4802"/>
+        <w:gridCol w:w="3449"/>
       </w:tblGrid>
       <w:tr>
         <w:trPr>
@@ -6869,7 +7013,7 @@
         </w:trPr>
         <w:tc>
           <w:tcPr>
-            <w:tcW w:type="dxa" w:w="1469"/>
+            <w:tcW w:type="dxa" w:w="1387"/>
             <w:tcBorders>
               <w:top w:val="single" w:color="BFC5CE" w:sz="4"/>
               <w:left w:val="single" w:color="BFC5CE" w:sz="4"/>
@@ -6903,7 +7047,7 @@
         </w:tc>
         <w:tc>
           <w:tcPr>
-            <w:tcW w:type="dxa" w:w="4400"/>
+            <w:tcW w:type="dxa" w:w="4802"/>
             <w:tcBorders>
               <w:top w:val="single" w:color="BFC5CE" w:sz="4"/>
               <w:left w:val="single" w:color="BFC5CE" w:sz="4"/>
@@ -6937,7 +7081,7 @@
         </w:tc>
         <w:tc>
           <w:tcPr>
-            <w:tcW w:type="dxa" w:w="3769"/>
+            <w:tcW w:type="dxa" w:w="3449"/>
             <w:tcBorders>
               <w:top w:val="single" w:color="BFC5CE" w:sz="4"/>
               <w:left w:val="single" w:color="BFC5CE" w:sz="4"/>
@@ -6976,7 +7120,7 @@
         </w:trPr>
         <w:tc>
           <w:tcPr>
-            <w:tcW w:type="dxa" w:w="1469"/>
+            <w:tcW w:type="dxa" w:w="1387"/>
             <w:tcBorders>
               <w:top w:val="single" w:color="BFC5CE" w:sz="4"/>
               <w:left w:val="single" w:color="BFC5CE" w:sz="4"/>
@@ -7007,38 +7151,38 @@
         </w:tc>
         <w:tc>
           <w:tcPr>
-            <w:tcW w:type="dxa" w:w="4400"/>
-            <w:tcBorders>
-              <w:top w:val="single" w:color="BFC5CE" w:sz="4"/>
-              <w:left w:val="single" w:color="BFC5CE" w:sz="4"/>
-              <w:bottom w:val="single" w:color="BFC5CE" w:sz="4"/>
-              <w:right w:val="single" w:color="BFC5CE" w:sz="4"/>
-            </w:tcBorders>
-            <w:tcMar>
-              <w:top w:type="dxa" w:w="40"/>
-              <w:left w:type="dxa" w:w="80"/>
-              <w:bottom w:type="dxa" w:w="40"/>
-              <w:right w:type="dxa" w:w="80"/>
-            </w:tcMar>
-          </w:tcPr>
-          <w:p>
-            <w:pPr>
-              <w:spacing w:after="0" w:before="0"/>
-              <w:jc w:val="left"/>
-            </w:pPr>
-            <w:r>
-              <w:rPr>
-                <w:rFonts w:ascii="Calibri" w:cs="Calibri" w:eastAsia="Calibri" w:hAnsi="Calibri"/>
-                <w:sz w:val="18"/>
-                <w:szCs w:val="18"/>
-              </w:rPr>
-              <w:t xml:space="preserve">Staged people with their candidates, scores and evidence.</w:t>
-            </w:r>
-          </w:p>
-        </w:tc>
-        <w:tc>
-          <w:tcPr>
-            <w:tcW w:type="dxa" w:w="3769"/>
+            <w:tcW w:type="dxa" w:w="4802"/>
+            <w:tcBorders>
+              <w:top w:val="single" w:color="BFC5CE" w:sz="4"/>
+              <w:left w:val="single" w:color="BFC5CE" w:sz="4"/>
+              <w:bottom w:val="single" w:color="BFC5CE" w:sz="4"/>
+              <w:right w:val="single" w:color="BFC5CE" w:sz="4"/>
+            </w:tcBorders>
+            <w:tcMar>
+              <w:top w:type="dxa" w:w="40"/>
+              <w:left w:type="dxa" w:w="80"/>
+              <w:bottom w:type="dxa" w:w="40"/>
+              <w:right w:type="dxa" w:w="80"/>
+            </w:tcMar>
+          </w:tcPr>
+          <w:p>
+            <w:pPr>
+              <w:spacing w:after="0" w:before="0"/>
+              <w:jc w:val="left"/>
+            </w:pPr>
+            <w:r>
+              <w:rPr>
+                <w:rFonts w:ascii="Calibri" w:cs="Calibri" w:eastAsia="Calibri" w:hAnsi="Calibri"/>
+                <w:sz w:val="18"/>
+                <w:szCs w:val="18"/>
+              </w:rPr>
+              <w:t xml:space="preserve">Staged people with their candidates, scores and evidence. Opening one shows the incoming person's basic information (name, gender, birthday, every phone, location, address, job, origin project) with the project and identifiers (Account PK / ID) it came with, and the same for every candidate: its linked project accounts and the candidate IDs an Excel import listed for it.</w:t>
+            </w:r>
+          </w:p>
+        </w:tc>
+        <w:tc>
+          <w:tcPr>
+            <w:tcW w:type="dxa" w:w="3449"/>
             <w:tcBorders>
               <w:top w:val="single" w:color="BFC5CE" w:sz="4"/>
               <w:left w:val="single" w:color="BFC5CE" w:sz="4"/>
@@ -7074,69 +7218,69 @@
         </w:trPr>
         <w:tc>
           <w:tcPr>
-            <w:tcW w:type="dxa" w:w="1469"/>
-            <w:tcBorders>
-              <w:top w:val="single" w:color="BFC5CE" w:sz="4"/>
-              <w:left w:val="single" w:color="BFC5CE" w:sz="4"/>
-              <w:bottom w:val="single" w:color="BFC5CE" w:sz="4"/>
-              <w:right w:val="single" w:color="BFC5CE" w:sz="4"/>
-            </w:tcBorders>
-            <w:tcMar>
-              <w:top w:type="dxa" w:w="40"/>
-              <w:left w:type="dxa" w:w="80"/>
-              <w:bottom w:type="dxa" w:w="40"/>
-              <w:right w:type="dxa" w:w="80"/>
-            </w:tcMar>
-          </w:tcPr>
-          <w:p>
-            <w:pPr>
-              <w:spacing w:after="0" w:before="0"/>
-              <w:jc w:val="left"/>
-            </w:pPr>
-            <w:r>
-              <w:rPr>
-                <w:rFonts w:ascii="Calibri" w:cs="Calibri" w:eastAsia="Calibri" w:hAnsi="Calibri"/>
-                <w:sz w:val="18"/>
-                <w:szCs w:val="18"/>
-              </w:rPr>
-              <w:t xml:space="preserve">E-shop assignments</w:t>
-            </w:r>
-          </w:p>
-        </w:tc>
-        <w:tc>
-          <w:tcPr>
-            <w:tcW w:type="dxa" w:w="4400"/>
-            <w:tcBorders>
-              <w:top w:val="single" w:color="BFC5CE" w:sz="4"/>
-              <w:left w:val="single" w:color="BFC5CE" w:sz="4"/>
-              <w:bottom w:val="single" w:color="BFC5CE" w:sz="4"/>
-              <w:right w:val="single" w:color="BFC5CE" w:sz="4"/>
-            </w:tcBorders>
-            <w:tcMar>
-              <w:top w:type="dxa" w:w="40"/>
-              <w:left w:type="dxa" w:w="80"/>
-              <w:bottom w:type="dxa" w:w="40"/>
-              <w:right w:type="dxa" w:w="80"/>
-            </w:tcMar>
-          </w:tcPr>
-          <w:p>
-            <w:pPr>
-              <w:spacing w:after="0" w:before="0"/>
-              <w:jc w:val="left"/>
-            </w:pPr>
-            <w:r>
-              <w:rPr>
-                <w:rFonts w:ascii="Calibri" w:cs="Calibri" w:eastAsia="Calibri" w:hAnsi="Calibri"/>
-                <w:sz w:val="18"/>
-                <w:szCs w:val="18"/>
-              </w:rPr>
-              <w:t xml:space="preserve">E-shop identifiers waiting to be confirmed.</w:t>
-            </w:r>
-          </w:p>
-        </w:tc>
-        <w:tc>
-          <w:tcPr>
-            <w:tcW w:type="dxa" w:w="3769"/>
+            <w:tcW w:type="dxa" w:w="1387"/>
+            <w:tcBorders>
+              <w:top w:val="single" w:color="BFC5CE" w:sz="4"/>
+              <w:left w:val="single" w:color="BFC5CE" w:sz="4"/>
+              <w:bottom w:val="single" w:color="BFC5CE" w:sz="4"/>
+              <w:right w:val="single" w:color="BFC5CE" w:sz="4"/>
+            </w:tcBorders>
+            <w:tcMar>
+              <w:top w:type="dxa" w:w="40"/>
+              <w:left w:type="dxa" w:w="80"/>
+              <w:bottom w:type="dxa" w:w="40"/>
+              <w:right w:type="dxa" w:w="80"/>
+            </w:tcMar>
+          </w:tcPr>
+          <w:p>
+            <w:pPr>
+              <w:spacing w:after="0" w:before="0"/>
+              <w:jc w:val="left"/>
+            </w:pPr>
+            <w:r>
+              <w:rPr>
+                <w:rFonts w:ascii="Calibri" w:cs="Calibri" w:eastAsia="Calibri" w:hAnsi="Calibri"/>
+                <w:sz w:val="18"/>
+                <w:szCs w:val="18"/>
+              </w:rPr>
+              <w:t xml:space="preserve">Account assignments</w:t>
+            </w:r>
+          </w:p>
+        </w:tc>
+        <w:tc>
+          <w:tcPr>
+            <w:tcW w:type="dxa" w:w="4802"/>
+            <w:tcBorders>
+              <w:top w:val="single" w:color="BFC5CE" w:sz="4"/>
+              <w:left w:val="single" w:color="BFC5CE" w:sz="4"/>
+              <w:bottom w:val="single" w:color="BFC5CE" w:sz="4"/>
+              <w:right w:val="single" w:color="BFC5CE" w:sz="4"/>
+            </w:tcBorders>
+            <w:tcMar>
+              <w:top w:type="dxa" w:w="40"/>
+              <w:left w:type="dxa" w:w="80"/>
+              <w:bottom w:type="dxa" w:w="40"/>
+              <w:right w:type="dxa" w:w="80"/>
+            </w:tcMar>
+          </w:tcPr>
+          <w:p>
+            <w:pPr>
+              <w:spacing w:after="0" w:before="0"/>
+              <w:jc w:val="left"/>
+            </w:pPr>
+            <w:r>
+              <w:rPr>
+                <w:rFonts w:ascii="Calibri" w:cs="Calibri" w:eastAsia="Calibri" w:hAnsi="Calibri"/>
+                <w:sz w:val="18"/>
+                <w:szCs w:val="18"/>
+              </w:rPr>
+              <w:t xml:space="preserve">E-shop and user-management identifiers waiting to be confirmed.</w:t>
+            </w:r>
+          </w:p>
+        </w:tc>
+        <w:tc>
+          <w:tcPr>
+            <w:tcW w:type="dxa" w:w="3449"/>
             <w:tcBorders>
               <w:top w:val="single" w:color="BFC5CE" w:sz="4"/>
               <w:left w:val="single" w:color="BFC5CE" w:sz="4"/>
@@ -7172,7 +7316,7 @@
         </w:trPr>
         <w:tc>
           <w:tcPr>
-            <w:tcW w:type="dxa" w:w="1469"/>
+            <w:tcW w:type="dxa" w:w="1387"/>
             <w:tcBorders>
               <w:top w:val="single" w:color="BFC5CE" w:sz="4"/>
               <w:left w:val="single" w:color="BFC5CE" w:sz="4"/>
@@ -7203,7 +7347,7 @@
         </w:tc>
         <w:tc>
           <w:tcPr>
-            <w:tcW w:type="dxa" w:w="4400"/>
+            <w:tcW w:type="dxa" w:w="4802"/>
             <w:tcBorders>
               <w:top w:val="single" w:color="BFC5CE" w:sz="4"/>
               <w:left w:val="single" w:color="BFC5CE" w:sz="4"/>
@@ -7234,7 +7378,7 @@
         </w:tc>
         <w:tc>
           <w:tcPr>
-            <w:tcW w:type="dxa" w:w="3769"/>
+            <w:tcW w:type="dxa" w:w="3449"/>
             <w:tcBorders>
               <w:top w:val="single" w:color="BFC5CE" w:sz="4"/>
               <w:left w:val="single" w:color="BFC5CE" w:sz="4"/>
@@ -7270,7 +7414,7 @@
         </w:trPr>
         <w:tc>
           <w:tcPr>
-            <w:tcW w:type="dxa" w:w="1469"/>
+            <w:tcW w:type="dxa" w:w="1387"/>
             <w:tcBorders>
               <w:top w:val="single" w:color="BFC5CE" w:sz="4"/>
               <w:left w:val="single" w:color="BFC5CE" w:sz="4"/>
@@ -7301,7 +7445,7 @@
         </w:tc>
         <w:tc>
           <w:tcPr>
-            <w:tcW w:type="dxa" w:w="4400"/>
+            <w:tcW w:type="dxa" w:w="4802"/>
             <w:tcBorders>
               <w:top w:val="single" w:color="BFC5CE" w:sz="4"/>
               <w:left w:val="single" w:color="BFC5CE" w:sz="4"/>
@@ -7348,7 +7492,7 @@
         </w:tc>
         <w:tc>
           <w:tcPr>
-            <w:tcW w:type="dxa" w:w="3769"/>
+            <w:tcW w:type="dxa" w:w="3449"/>
             <w:tcBorders>
               <w:top w:val="single" w:color="BFC5CE" w:sz="4"/>
               <w:left w:val="single" w:color="BFC5CE" w:sz="4"/>
@@ -7374,6 +7518,120 @@
                 <w:szCs w:val="18"/>
               </w:rPr>
               <w:t xml:space="preserve">Merge, or keep apart.</w:t>
+            </w:r>
+          </w:p>
+        </w:tc>
+      </w:tr>
+      <w:tr>
+        <w:trPr>
+          <w:cantSplit/>
+        </w:trPr>
+        <w:tc>
+          <w:tcPr>
+            <w:tcW w:type="dxa" w:w="1387"/>
+            <w:tcBorders>
+              <w:top w:val="single" w:color="BFC5CE" w:sz="4"/>
+              <w:left w:val="single" w:color="BFC5CE" w:sz="4"/>
+              <w:bottom w:val="single" w:color="BFC5CE" w:sz="4"/>
+              <w:right w:val="single" w:color="BFC5CE" w:sz="4"/>
+            </w:tcBorders>
+            <w:tcMar>
+              <w:top w:type="dxa" w:w="40"/>
+              <w:left w:type="dxa" w:w="80"/>
+              <w:bottom w:type="dxa" w:w="40"/>
+              <w:right w:type="dxa" w:w="80"/>
+            </w:tcMar>
+          </w:tcPr>
+          <w:p>
+            <w:pPr>
+              <w:spacing w:after="0" w:before="0"/>
+              <w:jc w:val="left"/>
+            </w:pPr>
+            <w:r>
+              <w:rPr>
+                <w:rFonts w:ascii="Calibri" w:cs="Calibri" w:eastAsia="Calibri" w:hAnsi="Calibri"/>
+                <w:sz w:val="18"/>
+                <w:szCs w:val="18"/>
+              </w:rPr>
+              <w:t xml:space="preserve">Import errors</w:t>
+            </w:r>
+          </w:p>
+        </w:tc>
+        <w:tc>
+          <w:tcPr>
+            <w:tcW w:type="dxa" w:w="4802"/>
+            <w:tcBorders>
+              <w:top w:val="single" w:color="BFC5CE" w:sz="4"/>
+              <w:left w:val="single" w:color="BFC5CE" w:sz="4"/>
+              <w:bottom w:val="single" w:color="BFC5CE" w:sz="4"/>
+              <w:right w:val="single" w:color="BFC5CE" w:sz="4"/>
+            </w:tcBorders>
+            <w:tcMar>
+              <w:top w:type="dxa" w:w="40"/>
+              <w:left w:type="dxa" w:w="80"/>
+              <w:bottom w:type="dxa" w:w="40"/>
+              <w:right w:type="dxa" w:w="80"/>
+            </w:tcMar>
+          </w:tcPr>
+          <w:p>
+            <w:pPr>
+              <w:spacing w:after="0" w:before="0"/>
+              <w:jc w:val="left"/>
+            </w:pPr>
+            <w:r>
+              <w:rPr>
+                <w:rFonts w:ascii="Calibri" w:cs="Calibri" w:eastAsia="Calibri" w:hAnsi="Calibri"/>
+                <w:sz w:val="18"/>
+                <w:szCs w:val="18"/>
+              </w:rPr>
+              <w:t xml:space="preserve">Rows of customer Excel imports that failed the file check (</w:t>
+            </w:r>
+            <w:r>
+              <w:rPr>
+                <w:rFonts w:ascii="Consolas" w:cs="Consolas" w:eastAsia="Consolas" w:hAnsi="Consolas"/>
+                <w:sz w:val="17"/>
+                <w:szCs w:val="17"/>
+              </w:rPr>
+              <w:t xml:space="preserve">crm_person_import_error</w:t>
+            </w:r>
+            <w:r>
+              <w:rPr>
+                <w:rFonts w:ascii="Calibri" w:cs="Calibri" w:eastAsia="Calibri" w:hAnsi="Calibri"/>
+                <w:sz w:val="18"/>
+                <w:szCs w:val="18"/>
+              </w:rPr>
+              <w:t xml:space="preserve">), with the cells as written and every reason.</w:t>
+            </w:r>
+          </w:p>
+        </w:tc>
+        <w:tc>
+          <w:tcPr>
+            <w:tcW w:type="dxa" w:w="3449"/>
+            <w:tcBorders>
+              <w:top w:val="single" w:color="BFC5CE" w:sz="4"/>
+              <w:left w:val="single" w:color="BFC5CE" w:sz="4"/>
+              <w:bottom w:val="single" w:color="BFC5CE" w:sz="4"/>
+              <w:right w:val="single" w:color="BFC5CE" w:sz="4"/>
+            </w:tcBorders>
+            <w:tcMar>
+              <w:top w:type="dxa" w:w="40"/>
+              <w:left w:type="dxa" w:w="80"/>
+              <w:bottom w:type="dxa" w:w="40"/>
+              <w:right w:type="dxa" w:w="80"/>
+            </w:tcMar>
+          </w:tcPr>
+          <w:p>
+            <w:pPr>
+              <w:spacing w:after="0" w:before="0"/>
+              <w:jc w:val="left"/>
+            </w:pPr>
+            <w:r>
+              <w:rPr>
+                <w:rFonts w:ascii="Calibri" w:cs="Calibri" w:eastAsia="Calibri" w:hAnsi="Calibri"/>
+                <w:sz w:val="18"/>
+                <w:szCs w:val="18"/>
+              </w:rPr>
+              <w:t xml:space="preserve">Correct and import again, then *Dismiss*.</w:t>
             </w:r>
           </w:p>
         </w:tc>
@@ -7482,7 +7740,7 @@
         <w:rPr>
           <w:rFonts w:ascii="Calibri" w:cs="Calibri" w:eastAsia="Calibri" w:hAnsi="Calibri"/>
         </w:rPr>
-        <w:t xml:space="preserve">, without going to the E-shop assignments tab (</w:t>
+        <w:t xml:space="preserve">, without going to the Account assignments tab (</w:t>
       </w:r>
       <w:r>
         <w:rPr>
@@ -7831,9 +8089,9 @@
         </w:tblBorders>
       </w:tblPr>
       <w:tblGrid>
-        <w:gridCol w:w="3087"/>
-        <w:gridCol w:w="904"/>
-        <w:gridCol w:w="5647"/>
+        <w:gridCol w:w="2020"/>
+        <w:gridCol w:w="621"/>
+        <w:gridCol w:w="6997"/>
       </w:tblGrid>
       <w:tr>
         <w:trPr>
@@ -7841,7 +8099,7 @@
         </w:trPr>
         <w:tc>
           <w:tcPr>
-            <w:tcW w:type="dxa" w:w="3087"/>
+            <w:tcW w:type="dxa" w:w="2020"/>
             <w:tcBorders>
               <w:top w:val="single" w:color="BFC5CE" w:sz="4"/>
               <w:left w:val="single" w:color="BFC5CE" w:sz="4"/>
@@ -7875,7 +8133,7 @@
         </w:tc>
         <w:tc>
           <w:tcPr>
-            <w:tcW w:type="dxa" w:w="904"/>
+            <w:tcW w:type="dxa" w:w="621"/>
             <w:tcBorders>
               <w:top w:val="single" w:color="BFC5CE" w:sz="4"/>
               <w:left w:val="single" w:color="BFC5CE" w:sz="4"/>
@@ -7909,7 +8167,7 @@
         </w:tc>
         <w:tc>
           <w:tcPr>
-            <w:tcW w:type="dxa" w:w="5647"/>
+            <w:tcW w:type="dxa" w:w="6997"/>
             <w:tcBorders>
               <w:top w:val="single" w:color="BFC5CE" w:sz="4"/>
               <w:left w:val="single" w:color="BFC5CE" w:sz="4"/>
@@ -7948,7 +8206,7 @@
         </w:trPr>
         <w:tc>
           <w:tcPr>
-            <w:tcW w:type="dxa" w:w="3087"/>
+            <w:tcW w:type="dxa" w:w="2020"/>
             <w:tcBorders>
               <w:top w:val="single" w:color="BFC5CE" w:sz="4"/>
               <w:left w:val="single" w:color="BFC5CE" w:sz="4"/>
@@ -7979,7 +8237,7 @@
         </w:tc>
         <w:tc>
           <w:tcPr>
-            <w:tcW w:type="dxa" w:w="904"/>
+            <w:tcW w:type="dxa" w:w="621"/>
             <w:tcBorders>
               <w:top w:val="single" w:color="BFC5CE" w:sz="4"/>
               <w:left w:val="single" w:color="BFC5CE" w:sz="4"/>
@@ -8010,7 +8268,7 @@
         </w:tc>
         <w:tc>
           <w:tcPr>
-            <w:tcW w:type="dxa" w:w="5647"/>
+            <w:tcW w:type="dxa" w:w="6997"/>
             <w:tcBorders>
               <w:top w:val="single" w:color="BFC5CE" w:sz="4"/>
               <w:left w:val="single" w:color="BFC5CE" w:sz="4"/>
@@ -8046,7 +8304,7 @@
         </w:trPr>
         <w:tc>
           <w:tcPr>
-            <w:tcW w:type="dxa" w:w="3087"/>
+            <w:tcW w:type="dxa" w:w="2020"/>
             <w:tcBorders>
               <w:top w:val="single" w:color="BFC5CE" w:sz="4"/>
               <w:left w:val="single" w:color="BFC5CE" w:sz="4"/>
@@ -8077,7 +8335,7 @@
         </w:tc>
         <w:tc>
           <w:tcPr>
-            <w:tcW w:type="dxa" w:w="904"/>
+            <w:tcW w:type="dxa" w:w="621"/>
             <w:tcBorders>
               <w:top w:val="single" w:color="BFC5CE" w:sz="4"/>
               <w:left w:val="single" w:color="BFC5CE" w:sz="4"/>
@@ -8108,7 +8366,7 @@
         </w:tc>
         <w:tc>
           <w:tcPr>
-            <w:tcW w:type="dxa" w:w="5647"/>
+            <w:tcW w:type="dxa" w:w="6997"/>
             <w:tcBorders>
               <w:top w:val="single" w:color="BFC5CE" w:sz="4"/>
               <w:left w:val="single" w:color="BFC5CE" w:sz="4"/>
@@ -8144,38 +8402,38 @@
         </w:trPr>
         <w:tc>
           <w:tcPr>
-            <w:tcW w:type="dxa" w:w="3087"/>
-            <w:tcBorders>
-              <w:top w:val="single" w:color="BFC5CE" w:sz="4"/>
-              <w:left w:val="single" w:color="BFC5CE" w:sz="4"/>
-              <w:bottom w:val="single" w:color="BFC5CE" w:sz="4"/>
-              <w:right w:val="single" w:color="BFC5CE" w:sz="4"/>
-            </w:tcBorders>
-            <w:tcMar>
-              <w:top w:type="dxa" w:w="40"/>
-              <w:left w:type="dxa" w:w="80"/>
-              <w:bottom w:type="dxa" w:w="40"/>
-              <w:right w:type="dxa" w:w="80"/>
-            </w:tcMar>
-          </w:tcPr>
-          <w:p>
-            <w:pPr>
-              <w:spacing w:after="0" w:before="0"/>
-              <w:jc w:val="left"/>
-            </w:pPr>
-            <w:r>
-              <w:rPr>
-                <w:rFonts w:ascii="Calibri" w:cs="Calibri" w:eastAsia="Calibri" w:hAnsi="Calibri"/>
-                <w:sz w:val="18"/>
-                <w:szCs w:val="18"/>
-              </w:rPr>
-              <w:t xml:space="preserve">Full name, Gender (M/F), Birthday (YYYY-MM-DD), Mobile</w:t>
-            </w:r>
-          </w:p>
-        </w:tc>
-        <w:tc>
-          <w:tcPr>
-            <w:tcW w:type="dxa" w:w="904"/>
+            <w:tcW w:type="dxa" w:w="2020"/>
+            <w:tcBorders>
+              <w:top w:val="single" w:color="BFC5CE" w:sz="4"/>
+              <w:left w:val="single" w:color="BFC5CE" w:sz="4"/>
+              <w:bottom w:val="single" w:color="BFC5CE" w:sz="4"/>
+              <w:right w:val="single" w:color="BFC5CE" w:sz="4"/>
+            </w:tcBorders>
+            <w:tcMar>
+              <w:top w:type="dxa" w:w="40"/>
+              <w:left w:type="dxa" w:w="80"/>
+              <w:bottom w:type="dxa" w:w="40"/>
+              <w:right w:type="dxa" w:w="80"/>
+            </w:tcMar>
+          </w:tcPr>
+          <w:p>
+            <w:pPr>
+              <w:spacing w:after="0" w:before="0"/>
+              <w:jc w:val="left"/>
+            </w:pPr>
+            <w:r>
+              <w:rPr>
+                <w:rFonts w:ascii="Calibri" w:cs="Calibri" w:eastAsia="Calibri" w:hAnsi="Calibri"/>
+                <w:sz w:val="18"/>
+                <w:szCs w:val="18"/>
+              </w:rPr>
+              <w:t xml:space="preserve">User PK</w:t>
+            </w:r>
+          </w:p>
+        </w:tc>
+        <w:tc>
+          <w:tcPr>
+            <w:tcW w:type="dxa" w:w="621"/>
             <w:tcBorders>
               <w:top w:val="single" w:color="BFC5CE" w:sz="4"/>
               <w:left w:val="single" w:color="BFC5CE" w:sz="4"/>
@@ -8206,32 +8464,32 @@
         </w:tc>
         <w:tc>
           <w:tcPr>
-            <w:tcW w:type="dxa" w:w="5647"/>
-            <w:tcBorders>
-              <w:top w:val="single" w:color="BFC5CE" w:sz="4"/>
-              <w:left w:val="single" w:color="BFC5CE" w:sz="4"/>
-              <w:bottom w:val="single" w:color="BFC5CE" w:sz="4"/>
-              <w:right w:val="single" w:color="BFC5CE" w:sz="4"/>
-            </w:tcBorders>
-            <w:tcMar>
-              <w:top w:type="dxa" w:w="40"/>
-              <w:left w:type="dxa" w:w="80"/>
-              <w:bottom w:type="dxa" w:w="40"/>
-              <w:right w:type="dxa" w:w="80"/>
-            </w:tcMar>
-          </w:tcPr>
-          <w:p>
-            <w:pPr>
-              <w:spacing w:after="0" w:before="0"/>
-              <w:jc w:val="left"/>
-            </w:pPr>
-            <w:r>
-              <w:rPr>
-                <w:rFonts w:ascii="Calibri" w:cs="Calibri" w:eastAsia="Calibri" w:hAnsi="Calibri"/>
-                <w:sz w:val="18"/>
-                <w:szCs w:val="18"/>
-              </w:rPr>
-              <w:t xml:space="preserve">Used by the duplicate check.</w:t>
+            <w:tcW w:type="dxa" w:w="6997"/>
+            <w:tcBorders>
+              <w:top w:val="single" w:color="BFC5CE" w:sz="4"/>
+              <w:left w:val="single" w:color="BFC5CE" w:sz="4"/>
+              <w:bottom w:val="single" w:color="BFC5CE" w:sz="4"/>
+              <w:right w:val="single" w:color="BFC5CE" w:sz="4"/>
+            </w:tcBorders>
+            <w:tcMar>
+              <w:top w:type="dxa" w:w="40"/>
+              <w:left w:type="dxa" w:w="80"/>
+              <w:bottom w:type="dxa" w:w="40"/>
+              <w:right w:type="dxa" w:w="80"/>
+            </w:tcMar>
+          </w:tcPr>
+          <w:p>
+            <w:pPr>
+              <w:spacing w:after="0" w:before="0"/>
+              <w:jc w:val="left"/>
+            </w:pPr>
+            <w:r>
+              <w:rPr>
+                <w:rFonts w:ascii="Calibri" w:cs="Calibri" w:eastAsia="Calibri" w:hAnsi="Calibri"/>
+                <w:sz w:val="18"/>
+                <w:szCs w:val="18"/>
+              </w:rPr>
+              <w:t xml:space="preserve">The customer's user_pk in the user management system (the PLATFORM project). Becomes the Account PK of that identifier.</w:t>
             </w:r>
           </w:p>
         </w:tc>
@@ -8242,38 +8500,38 @@
         </w:trPr>
         <w:tc>
           <w:tcPr>
-            <w:tcW w:type="dxa" w:w="3087"/>
-            <w:tcBorders>
-              <w:top w:val="single" w:color="BFC5CE" w:sz="4"/>
-              <w:left w:val="single" w:color="BFC5CE" w:sz="4"/>
-              <w:bottom w:val="single" w:color="BFC5CE" w:sz="4"/>
-              <w:right w:val="single" w:color="BFC5CE" w:sz="4"/>
-            </w:tcBorders>
-            <w:tcMar>
-              <w:top w:type="dxa" w:w="40"/>
-              <w:left w:type="dxa" w:w="80"/>
-              <w:bottom w:type="dxa" w:w="40"/>
-              <w:right w:type="dxa" w:w="80"/>
-            </w:tcMar>
-          </w:tcPr>
-          <w:p>
-            <w:pPr>
-              <w:spacing w:after="0" w:before="0"/>
-              <w:jc w:val="left"/>
-            </w:pPr>
-            <w:r>
-              <w:rPr>
-                <w:rFonts w:ascii="Calibri" w:cs="Calibri" w:eastAsia="Calibri" w:hAnsi="Calibri"/>
-                <w:sz w:val="18"/>
-                <w:szCs w:val="18"/>
-              </w:rPr>
-              <w:t xml:space="preserve">Location ID, Address</w:t>
-            </w:r>
-          </w:p>
-        </w:tc>
-        <w:tc>
-          <w:tcPr>
-            <w:tcW w:type="dxa" w:w="904"/>
+            <w:tcW w:type="dxa" w:w="2020"/>
+            <w:tcBorders>
+              <w:top w:val="single" w:color="BFC5CE" w:sz="4"/>
+              <w:left w:val="single" w:color="BFC5CE" w:sz="4"/>
+              <w:bottom w:val="single" w:color="BFC5CE" w:sz="4"/>
+              <w:right w:val="single" w:color="BFC5CE" w:sz="4"/>
+            </w:tcBorders>
+            <w:tcMar>
+              <w:top w:type="dxa" w:w="40"/>
+              <w:left w:type="dxa" w:w="80"/>
+              <w:bottom w:type="dxa" w:w="40"/>
+              <w:right w:type="dxa" w:w="80"/>
+            </w:tcMar>
+          </w:tcPr>
+          <w:p>
+            <w:pPr>
+              <w:spacing w:after="0" w:before="0"/>
+              <w:jc w:val="left"/>
+            </w:pPr>
+            <w:r>
+              <w:rPr>
+                <w:rFonts w:ascii="Calibri" w:cs="Calibri" w:eastAsia="Calibri" w:hAnsi="Calibri"/>
+                <w:sz w:val="18"/>
+                <w:szCs w:val="18"/>
+              </w:rPr>
+              <w:t xml:space="preserve">User ID</w:t>
+            </w:r>
+          </w:p>
+        </w:tc>
+        <w:tc>
+          <w:tcPr>
+            <w:tcW w:type="dxa" w:w="621"/>
             <w:tcBorders>
               <w:top w:val="single" w:color="BFC5CE" w:sz="4"/>
               <w:left w:val="single" w:color="BFC5CE" w:sz="4"/>
@@ -8304,32 +8562,32 @@
         </w:tc>
         <w:tc>
           <w:tcPr>
-            <w:tcW w:type="dxa" w:w="5647"/>
-            <w:tcBorders>
-              <w:top w:val="single" w:color="BFC5CE" w:sz="4"/>
-              <w:left w:val="single" w:color="BFC5CE" w:sz="4"/>
-              <w:bottom w:val="single" w:color="BFC5CE" w:sz="4"/>
-              <w:right w:val="single" w:color="BFC5CE" w:sz="4"/>
-            </w:tcBorders>
-            <w:tcMar>
-              <w:top w:type="dxa" w:w="40"/>
-              <w:left w:type="dxa" w:w="80"/>
-              <w:bottom w:type="dxa" w:w="40"/>
-              <w:right w:type="dxa" w:w="80"/>
-            </w:tcMar>
-          </w:tcPr>
-          <w:p>
-            <w:pPr>
-              <w:spacing w:after="0" w:before="0"/>
-              <w:jc w:val="left"/>
-            </w:pPr>
-            <w:r>
-              <w:rPr>
-                <w:rFonts w:ascii="Calibri" w:cs="Calibri" w:eastAsia="Calibri" w:hAnsi="Calibri"/>
-                <w:sz w:val="18"/>
-                <w:szCs w:val="18"/>
-              </w:rPr>
-              <w:t xml:space="preserve">Location IDs come from the template's Locations sheet.</w:t>
+            <w:tcW w:type="dxa" w:w="6997"/>
+            <w:tcBorders>
+              <w:top w:val="single" w:color="BFC5CE" w:sz="4"/>
+              <w:left w:val="single" w:color="BFC5CE" w:sz="4"/>
+              <w:bottom w:val="single" w:color="BFC5CE" w:sz="4"/>
+              <w:right w:val="single" w:color="BFC5CE" w:sz="4"/>
+            </w:tcBorders>
+            <w:tcMar>
+              <w:top w:type="dxa" w:w="40"/>
+              <w:left w:type="dxa" w:w="80"/>
+              <w:bottom w:type="dxa" w:w="40"/>
+              <w:right w:type="dxa" w:w="80"/>
+            </w:tcMar>
+          </w:tcPr>
+          <w:p>
+            <w:pPr>
+              <w:spacing w:after="0" w:before="0"/>
+              <w:jc w:val="left"/>
+            </w:pPr>
+            <w:r>
+              <w:rPr>
+                <w:rFonts w:ascii="Calibri" w:cs="Calibri" w:eastAsia="Calibri" w:hAnsi="Calibri"/>
+                <w:sz w:val="18"/>
+                <w:szCs w:val="18"/>
+              </w:rPr>
+              <w:t xml:space="preserve">The customer's user_id (login) there. Becomes the Account ID.</w:t>
             </w:r>
           </w:p>
         </w:tc>
@@ -8340,38 +8598,38 @@
         </w:trPr>
         <w:tc>
           <w:tcPr>
-            <w:tcW w:type="dxa" w:w="3087"/>
-            <w:tcBorders>
-              <w:top w:val="single" w:color="BFC5CE" w:sz="4"/>
-              <w:left w:val="single" w:color="BFC5CE" w:sz="4"/>
-              <w:bottom w:val="single" w:color="BFC5CE" w:sz="4"/>
-              <w:right w:val="single" w:color="BFC5CE" w:sz="4"/>
-            </w:tcBorders>
-            <w:tcMar>
-              <w:top w:type="dxa" w:w="40"/>
-              <w:left w:type="dxa" w:w="80"/>
-              <w:bottom w:type="dxa" w:w="40"/>
-              <w:right w:type="dxa" w:w="80"/>
-            </w:tcMar>
-          </w:tcPr>
-          <w:p>
-            <w:pPr>
-              <w:spacing w:after="0" w:before="0"/>
-              <w:jc w:val="left"/>
-            </w:pPr>
-            <w:r>
-              <w:rPr>
-                <w:rFonts w:ascii="Calibri" w:cs="Calibri" w:eastAsia="Calibri" w:hAnsi="Calibri"/>
-                <w:sz w:val="18"/>
-                <w:szCs w:val="18"/>
-              </w:rPr>
-              <w:t xml:space="preserve">Job title ID, Email</w:t>
-            </w:r>
-          </w:p>
-        </w:tc>
-        <w:tc>
-          <w:tcPr>
-            <w:tcW w:type="dxa" w:w="904"/>
+            <w:tcW w:type="dxa" w:w="2020"/>
+            <w:tcBorders>
+              <w:top w:val="single" w:color="BFC5CE" w:sz="4"/>
+              <w:left w:val="single" w:color="BFC5CE" w:sz="4"/>
+              <w:bottom w:val="single" w:color="BFC5CE" w:sz="4"/>
+              <w:right w:val="single" w:color="BFC5CE" w:sz="4"/>
+            </w:tcBorders>
+            <w:tcMar>
+              <w:top w:type="dxa" w:w="40"/>
+              <w:left w:type="dxa" w:w="80"/>
+              <w:bottom w:type="dxa" w:w="40"/>
+              <w:right w:type="dxa" w:w="80"/>
+            </w:tcMar>
+          </w:tcPr>
+          <w:p>
+            <w:pPr>
+              <w:spacing w:after="0" w:before="0"/>
+              <w:jc w:val="left"/>
+            </w:pPr>
+            <w:r>
+              <w:rPr>
+                <w:rFonts w:ascii="Calibri" w:cs="Calibri" w:eastAsia="Calibri" w:hAnsi="Calibri"/>
+                <w:sz w:val="18"/>
+                <w:szCs w:val="18"/>
+              </w:rPr>
+              <w:t xml:space="preserve">Full name, Gender (M/F), Birthday (YYYY-MM-DD), Mobile</w:t>
+            </w:r>
+          </w:p>
+        </w:tc>
+        <w:tc>
+          <w:tcPr>
+            <w:tcW w:type="dxa" w:w="621"/>
             <w:tcBorders>
               <w:top w:val="single" w:color="BFC5CE" w:sz="4"/>
               <w:left w:val="single" w:color="BFC5CE" w:sz="4"/>
@@ -8396,13 +8654,325 @@
                 <w:sz w:val="18"/>
                 <w:szCs w:val="18"/>
               </w:rPr>
+              <w:t xml:space="preserve">yes</w:t>
+            </w:r>
+          </w:p>
+        </w:tc>
+        <w:tc>
+          <w:tcPr>
+            <w:tcW w:type="dxa" w:w="6997"/>
+            <w:tcBorders>
+              <w:top w:val="single" w:color="BFC5CE" w:sz="4"/>
+              <w:left w:val="single" w:color="BFC5CE" w:sz="4"/>
+              <w:bottom w:val="single" w:color="BFC5CE" w:sz="4"/>
+              <w:right w:val="single" w:color="BFC5CE" w:sz="4"/>
+            </w:tcBorders>
+            <w:tcMar>
+              <w:top w:type="dxa" w:w="40"/>
+              <w:left w:type="dxa" w:w="80"/>
+              <w:bottom w:type="dxa" w:w="40"/>
+              <w:right w:type="dxa" w:w="80"/>
+            </w:tcMar>
+          </w:tcPr>
+          <w:p>
+            <w:pPr>
+              <w:spacing w:after="0" w:before="0"/>
+              <w:jc w:val="left"/>
+            </w:pPr>
+            <w:r>
+              <w:rPr>
+                <w:rFonts w:ascii="Calibri" w:cs="Calibri" w:eastAsia="Calibri" w:hAnsi="Calibri"/>
+                <w:sz w:val="18"/>
+                <w:szCs w:val="18"/>
+              </w:rPr>
+              <w:t xml:space="preserve">Used by the duplicate check.</w:t>
+            </w:r>
+          </w:p>
+        </w:tc>
+      </w:tr>
+      <w:tr>
+        <w:trPr>
+          <w:cantSplit/>
+        </w:trPr>
+        <w:tc>
+          <w:tcPr>
+            <w:tcW w:type="dxa" w:w="2020"/>
+            <w:tcBorders>
+              <w:top w:val="single" w:color="BFC5CE" w:sz="4"/>
+              <w:left w:val="single" w:color="BFC5CE" w:sz="4"/>
+              <w:bottom w:val="single" w:color="BFC5CE" w:sz="4"/>
+              <w:right w:val="single" w:color="BFC5CE" w:sz="4"/>
+            </w:tcBorders>
+            <w:tcMar>
+              <w:top w:type="dxa" w:w="40"/>
+              <w:left w:type="dxa" w:w="80"/>
+              <w:bottom w:type="dxa" w:w="40"/>
+              <w:right w:type="dxa" w:w="80"/>
+            </w:tcMar>
+          </w:tcPr>
+          <w:p>
+            <w:pPr>
+              <w:spacing w:after="0" w:before="0"/>
+              <w:jc w:val="left"/>
+            </w:pPr>
+            <w:r>
+              <w:rPr>
+                <w:rFonts w:ascii="Calibri" w:cs="Calibri" w:eastAsia="Calibri" w:hAnsi="Calibri"/>
+                <w:sz w:val="18"/>
+                <w:szCs w:val="18"/>
+              </w:rPr>
+              <w:t xml:space="preserve">Location ID, Address</w:t>
+            </w:r>
+          </w:p>
+        </w:tc>
+        <w:tc>
+          <w:tcPr>
+            <w:tcW w:type="dxa" w:w="621"/>
+            <w:tcBorders>
+              <w:top w:val="single" w:color="BFC5CE" w:sz="4"/>
+              <w:left w:val="single" w:color="BFC5CE" w:sz="4"/>
+              <w:bottom w:val="single" w:color="BFC5CE" w:sz="4"/>
+              <w:right w:val="single" w:color="BFC5CE" w:sz="4"/>
+            </w:tcBorders>
+            <w:tcMar>
+              <w:top w:type="dxa" w:w="40"/>
+              <w:left w:type="dxa" w:w="80"/>
+              <w:bottom w:type="dxa" w:w="40"/>
+              <w:right w:type="dxa" w:w="80"/>
+            </w:tcMar>
+          </w:tcPr>
+          <w:p>
+            <w:pPr>
+              <w:spacing w:after="0" w:before="0"/>
+              <w:jc w:val="center"/>
+            </w:pPr>
+            <w:r>
+              <w:rPr>
+                <w:rFonts w:ascii="Calibri" w:cs="Calibri" w:eastAsia="Calibri" w:hAnsi="Calibri"/>
+                <w:sz w:val="18"/>
+                <w:szCs w:val="18"/>
+              </w:rPr>
+              <w:t xml:space="preserve">yes</w:t>
+            </w:r>
+          </w:p>
+        </w:tc>
+        <w:tc>
+          <w:tcPr>
+            <w:tcW w:type="dxa" w:w="6997"/>
+            <w:tcBorders>
+              <w:top w:val="single" w:color="BFC5CE" w:sz="4"/>
+              <w:left w:val="single" w:color="BFC5CE" w:sz="4"/>
+              <w:bottom w:val="single" w:color="BFC5CE" w:sz="4"/>
+              <w:right w:val="single" w:color="BFC5CE" w:sz="4"/>
+            </w:tcBorders>
+            <w:tcMar>
+              <w:top w:type="dxa" w:w="40"/>
+              <w:left w:type="dxa" w:w="80"/>
+              <w:bottom w:type="dxa" w:w="40"/>
+              <w:right w:type="dxa" w:w="80"/>
+            </w:tcMar>
+          </w:tcPr>
+          <w:p>
+            <w:pPr>
+              <w:spacing w:after="0" w:before="0"/>
+              <w:jc w:val="left"/>
+            </w:pPr>
+            <w:r>
+              <w:rPr>
+                <w:rFonts w:ascii="Calibri" w:cs="Calibri" w:eastAsia="Calibri" w:hAnsi="Calibri"/>
+                <w:sz w:val="18"/>
+                <w:szCs w:val="18"/>
+              </w:rPr>
+              <w:t xml:space="preserve">Location IDs come from the template's Locations sheet; the duplicate check compares the Location ID. The Address text is kept for search and display.</w:t>
+            </w:r>
+          </w:p>
+        </w:tc>
+      </w:tr>
+      <w:tr>
+        <w:trPr>
+          <w:cantSplit/>
+        </w:trPr>
+        <w:tc>
+          <w:tcPr>
+            <w:tcW w:type="dxa" w:w="2020"/>
+            <w:tcBorders>
+              <w:top w:val="single" w:color="BFC5CE" w:sz="4"/>
+              <w:left w:val="single" w:color="BFC5CE" w:sz="4"/>
+              <w:bottom w:val="single" w:color="BFC5CE" w:sz="4"/>
+              <w:right w:val="single" w:color="BFC5CE" w:sz="4"/>
+            </w:tcBorders>
+            <w:tcMar>
+              <w:top w:type="dxa" w:w="40"/>
+              <w:left w:type="dxa" w:w="80"/>
+              <w:bottom w:type="dxa" w:w="40"/>
+              <w:right w:type="dxa" w:w="80"/>
+            </w:tcMar>
+          </w:tcPr>
+          <w:p>
+            <w:pPr>
+              <w:spacing w:after="0" w:before="0"/>
+              <w:jc w:val="left"/>
+            </w:pPr>
+            <w:r>
+              <w:rPr>
+                <w:rFonts w:ascii="Calibri" w:cs="Calibri" w:eastAsia="Calibri" w:hAnsi="Calibri"/>
+                <w:sz w:val="18"/>
+                <w:szCs w:val="18"/>
+              </w:rPr>
+              <w:t xml:space="preserve">Origin project</w:t>
+            </w:r>
+          </w:p>
+        </w:tc>
+        <w:tc>
+          <w:tcPr>
+            <w:tcW w:type="dxa" w:w="621"/>
+            <w:tcBorders>
+              <w:top w:val="single" w:color="BFC5CE" w:sz="4"/>
+              <w:left w:val="single" w:color="BFC5CE" w:sz="4"/>
+              <w:bottom w:val="single" w:color="BFC5CE" w:sz="4"/>
+              <w:right w:val="single" w:color="BFC5CE" w:sz="4"/>
+            </w:tcBorders>
+            <w:tcMar>
+              <w:top w:type="dxa" w:w="40"/>
+              <w:left w:type="dxa" w:w="80"/>
+              <w:bottom w:type="dxa" w:w="40"/>
+              <w:right w:type="dxa" w:w="80"/>
+            </w:tcMar>
+          </w:tcPr>
+          <w:p>
+            <w:pPr>
+              <w:spacing w:after="0" w:before="0"/>
+              <w:jc w:val="center"/>
+            </w:pPr>
+            <w:r>
+              <w:rPr>
+                <w:rFonts w:ascii="Calibri" w:cs="Calibri" w:eastAsia="Calibri" w:hAnsi="Calibri"/>
+                <w:sz w:val="18"/>
+                <w:szCs w:val="18"/>
+              </w:rPr>
               <w:t xml:space="preserve">no</w:t>
             </w:r>
           </w:p>
         </w:tc>
         <w:tc>
           <w:tcPr>
-            <w:tcW w:type="dxa" w:w="5647"/>
+            <w:tcW w:type="dxa" w:w="6997"/>
+            <w:tcBorders>
+              <w:top w:val="single" w:color="BFC5CE" w:sz="4"/>
+              <w:left w:val="single" w:color="BFC5CE" w:sz="4"/>
+              <w:bottom w:val="single" w:color="BFC5CE" w:sz="4"/>
+              <w:right w:val="single" w:color="BFC5CE" w:sz="4"/>
+            </w:tcBorders>
+            <w:tcMar>
+              <w:top w:type="dxa" w:w="40"/>
+              <w:left w:type="dxa" w:w="80"/>
+              <w:bottom w:type="dxa" w:w="40"/>
+              <w:right w:type="dxa" w:w="80"/>
+            </w:tcMar>
+          </w:tcPr>
+          <w:p>
+            <w:pPr>
+              <w:spacing w:after="0" w:before="0"/>
+              <w:jc w:val="left"/>
+            </w:pPr>
+            <w:r>
+              <w:rPr>
+                <w:rFonts w:ascii="Calibri" w:cs="Calibri" w:eastAsia="Calibri" w:hAnsi="Calibri"/>
+                <w:sz w:val="18"/>
+                <w:szCs w:val="18"/>
+              </w:rPr>
+              <w:t xml:space="preserve">A project code or ID from the template's Projects sheet. Empty cells take the </w:t>
+            </w:r>
+            <w:r>
+              <w:rPr>
+                <w:rFonts w:ascii="Calibri" w:cs="Calibri" w:eastAsia="Calibri" w:hAnsi="Calibri"/>
+                <w:b/>
+                <w:bCs/>
+                <w:sz w:val="18"/>
+                <w:szCs w:val="18"/>
+              </w:rPr>
+              <w:t xml:space="preserve">origin project chosen on the import screen</w:t>
+            </w:r>
+            <w:r>
+              <w:rPr>
+                <w:rFonts w:ascii="Calibri" w:cs="Calibri" w:eastAsia="Calibri" w:hAnsi="Calibri"/>
+                <w:sz w:val="18"/>
+                <w:szCs w:val="18"/>
+              </w:rPr>
+              <w:t xml:space="preserve">; with neither, the row is an error.</w:t>
+            </w:r>
+          </w:p>
+        </w:tc>
+      </w:tr>
+      <w:tr>
+        <w:trPr>
+          <w:cantSplit/>
+        </w:trPr>
+        <w:tc>
+          <w:tcPr>
+            <w:tcW w:type="dxa" w:w="2020"/>
+            <w:tcBorders>
+              <w:top w:val="single" w:color="BFC5CE" w:sz="4"/>
+              <w:left w:val="single" w:color="BFC5CE" w:sz="4"/>
+              <w:bottom w:val="single" w:color="BFC5CE" w:sz="4"/>
+              <w:right w:val="single" w:color="BFC5CE" w:sz="4"/>
+            </w:tcBorders>
+            <w:tcMar>
+              <w:top w:type="dxa" w:w="40"/>
+              <w:left w:type="dxa" w:w="80"/>
+              <w:bottom w:type="dxa" w:w="40"/>
+              <w:right w:type="dxa" w:w="80"/>
+            </w:tcMar>
+          </w:tcPr>
+          <w:p>
+            <w:pPr>
+              <w:spacing w:after="0" w:before="0"/>
+              <w:jc w:val="left"/>
+            </w:pPr>
+            <w:r>
+              <w:rPr>
+                <w:rFonts w:ascii="Calibri" w:cs="Calibri" w:eastAsia="Calibri" w:hAnsi="Calibri"/>
+                <w:sz w:val="18"/>
+                <w:szCs w:val="18"/>
+              </w:rPr>
+              <w:t xml:space="preserve">Job title ID</w:t>
+            </w:r>
+          </w:p>
+        </w:tc>
+        <w:tc>
+          <w:tcPr>
+            <w:tcW w:type="dxa" w:w="621"/>
+            <w:tcBorders>
+              <w:top w:val="single" w:color="BFC5CE" w:sz="4"/>
+              <w:left w:val="single" w:color="BFC5CE" w:sz="4"/>
+              <w:bottom w:val="single" w:color="BFC5CE" w:sz="4"/>
+              <w:right w:val="single" w:color="BFC5CE" w:sz="4"/>
+            </w:tcBorders>
+            <w:tcMar>
+              <w:top w:type="dxa" w:w="40"/>
+              <w:left w:type="dxa" w:w="80"/>
+              <w:bottom w:type="dxa" w:w="40"/>
+              <w:right w:type="dxa" w:w="80"/>
+            </w:tcMar>
+          </w:tcPr>
+          <w:p>
+            <w:pPr>
+              <w:spacing w:after="0" w:before="0"/>
+              <w:jc w:val="center"/>
+            </w:pPr>
+            <w:r>
+              <w:rPr>
+                <w:rFonts w:ascii="Calibri" w:cs="Calibri" w:eastAsia="Calibri" w:hAnsi="Calibri"/>
+                <w:sz w:val="18"/>
+                <w:szCs w:val="18"/>
+              </w:rPr>
+              <w:t xml:space="preserve">no</w:t>
+            </w:r>
+          </w:p>
+        </w:tc>
+        <w:tc>
+          <w:tcPr>
+            <w:tcW w:type="dxa" w:w="6997"/>
             <w:tcBorders>
               <w:top w:val="single" w:color="BFC5CE" w:sz="4"/>
               <w:left w:val="single" w:color="BFC5CE" w:sz="4"/>
@@ -8473,7 +9043,7 @@
           <w:b/>
           <w:bCs/>
         </w:rPr>
-        <w:t xml:space="preserve">already have an e-shop account</w:t>
+        <w:t xml:space="preserve">already have an e-shop account and a user-management account</w:t>
       </w:r>
       <w:r>
         <w:rPr>
@@ -8495,7 +9065,63 @@
         <w:rPr>
           <w:rFonts w:ascii="Calibri" w:cs="Calibri" w:eastAsia="Calibri" w:hAnsi="Calibri"/>
         </w:rPr>
-        <w:t xml:space="preserve">*Check the file* previews every row as NEW, DUPLICATE (same as a customer or an earlier row), REVIEW or ERROR and writes nothing. A file with any error is not imported; every bad row is listed with its reasons.</w:t>
+        <w:t xml:space="preserve">*Check the file* writes nothing. It sorts every row into tabs: </w:t>
+      </w:r>
+      <w:r>
+        <w:rPr>
+          <w:rFonts w:ascii="Calibri" w:cs="Calibri" w:eastAsia="Calibri" w:hAnsi="Calibri"/>
+          <w:b/>
+          <w:bCs/>
+        </w:rPr>
+        <w:t xml:space="preserve">New customers</w:t>
+      </w:r>
+      <w:r>
+        <w:rPr>
+          <w:rFonts w:ascii="Calibri" w:cs="Calibri" w:eastAsia="Calibri" w:hAnsi="Calibri"/>
+        </w:rPr>
+        <w:t xml:space="preserve">, </w:t>
+      </w:r>
+      <w:r>
+        <w:rPr>
+          <w:rFonts w:ascii="Calibri" w:cs="Calibri" w:eastAsia="Calibri" w:hAnsi="Calibri"/>
+          <w:b/>
+          <w:bCs/>
+        </w:rPr>
+        <w:t xml:space="preserve">Review customers</w:t>
+      </w:r>
+      <w:r>
+        <w:rPr>
+          <w:rFonts w:ascii="Calibri" w:cs="Calibri" w:eastAsia="Calibri" w:hAnsi="Calibri"/>
+        </w:rPr>
+        <w:t xml:space="preserve">, </w:t>
+      </w:r>
+      <w:r>
+        <w:rPr>
+          <w:rFonts w:ascii="Calibri" w:cs="Calibri" w:eastAsia="Calibri" w:hAnsi="Calibri"/>
+          <w:b/>
+          <w:bCs/>
+        </w:rPr>
+        <w:t xml:space="preserve">Already customers</w:t>
+      </w:r>
+      <w:r>
+        <w:rPr>
+          <w:rFonts w:ascii="Calibri" w:cs="Calibri" w:eastAsia="Calibri" w:hAnsi="Calibri"/>
+        </w:rPr>
+        <w:t xml:space="preserve"> (a unique 70+ match with someone on file, shown only when there is one) and </w:t>
+      </w:r>
+      <w:r>
+        <w:rPr>
+          <w:rFonts w:ascii="Calibri" w:cs="Calibri" w:eastAsia="Calibri" w:hAnsi="Calibri"/>
+          <w:b/>
+          <w:bCs/>
+        </w:rPr>
+        <w:t xml:space="preserve">Errors</w:t>
+      </w:r>
+      <w:r>
+        <w:rPr>
+          <w:rFonts w:ascii="Calibri" w:cs="Calibri" w:eastAsia="Calibri" w:hAnsi="Calibri"/>
+        </w:rPr>
+        <w:t xml:space="preserve"> (every reason, with the cells as written).</w:t>
       </w:r>
     </w:p>
     <w:p>
@@ -8511,7 +9137,49 @@
         <w:rPr>
           <w:rFonts w:ascii="Calibri" w:cs="Calibri" w:eastAsia="Calibri" w:hAnsi="Calibri"/>
         </w:rPr>
-        <w:t xml:space="preserve">Rows are checked against the file itself, existing customers and pending registrations, with the same scoring. Two rows with the same E-shop PK must be the same person (70+) with the same E-shop ID, otherwise it is an error.</w:t>
+        <w:t xml:space="preserve">*Add new users* is offered as soon as any row is valid; errors do not block it. New rows become customers with a new </w:t>
+      </w:r>
+      <w:r>
+        <w:rPr>
+          <w:rFonts w:ascii="Consolas" w:cs="Consolas" w:eastAsia="Consolas" w:hAnsi="Consolas"/>
+          <w:sz w:val="19"/>
+          <w:szCs w:val="19"/>
+        </w:rPr>
+        <w:t xml:space="preserve">party_pk</w:t>
+      </w:r>
+      <w:r>
+        <w:rPr>
+          <w:rFonts w:ascii="Calibri" w:cs="Calibri" w:eastAsia="Calibri" w:hAnsi="Calibri"/>
+        </w:rPr>
+        <w:t xml:space="preserve">, review rows wait under *Pending registrations*, matches are merged, and error rows are kept in </w:t>
+      </w:r>
+      <w:r>
+        <w:rPr>
+          <w:rFonts w:ascii="Consolas" w:cs="Consolas" w:eastAsia="Consolas" w:hAnsi="Consolas"/>
+          <w:sz w:val="19"/>
+          <w:szCs w:val="19"/>
+        </w:rPr>
+        <w:t xml:space="preserve">crm_person_import_error</w:t>
+      </w:r>
+      <w:r>
+        <w:rPr>
+          <w:rFonts w:ascii="Calibri" w:cs="Calibri" w:eastAsia="Calibri" w:hAnsi="Calibri"/>
+        </w:rPr>
+        <w:t xml:space="preserve"> and listed under </w:t>
+      </w:r>
+      <w:r>
+        <w:rPr>
+          <w:rFonts w:ascii="Calibri" w:cs="Calibri" w:eastAsia="Calibri" w:hAnsi="Calibri"/>
+          <w:b/>
+          <w:bCs/>
+        </w:rPr>
+        <w:t xml:space="preserve">Customers &gt; Import errors</w:t>
+      </w:r>
+      <w:r>
+        <w:rPr>
+          <w:rFonts w:ascii="Calibri" w:cs="Calibri" w:eastAsia="Calibri" w:hAnsi="Calibri"/>
+        </w:rPr>
+        <w:t xml:space="preserve"> until dismissed. Nothing is saved before the button is clicked.</w:t>
       </w:r>
     </w:p>
     <w:p>
@@ -8527,7 +9195,7 @@
         <w:rPr>
           <w:rFonts w:ascii="Calibri" w:cs="Calibri" w:eastAsia="Calibri" w:hAnsi="Calibri"/>
         </w:rPr>
-        <w:t xml:space="preserve">Re-importing the same file is safe: each row's intake is keyed by the file's hash and row number.</w:t>
+        <w:t xml:space="preserve">Rows are checked against the file itself, existing customers and pending registrations, with the same scoring. Two rows with the same E-shop PK (or the same User PK) must be the same person (70+) with the same E-shop ID (or User ID), otherwise it is an error.</w:t>
       </w:r>
     </w:p>
     <w:p>
@@ -8543,7 +9211,37 @@
         <w:rPr>
           <w:rFonts w:ascii="Calibri" w:cs="Calibri" w:eastAsia="Calibri" w:hAnsi="Calibri"/>
         </w:rPr>
-        <w:t xml:space="preserve">The e-shop identifiers become *Previously linked identifiers* (section 5.5); they are not linked directly.</w:t>
+        <w:t xml:space="preserve">Re-importing the same file is safe: each row's intake is keyed by the file's hash and row number.</w:t>
+      </w:r>
+    </w:p>
+    <w:p>
+      <w:pPr>
+        <w:pStyle w:val="ListParagraph"/>
+        <w:numPr>
+          <w:ilvl w:val="0"/>
+          <w:numId w:val="2"/>
+        </w:numPr>
+        <w:spacing w:after="40"/>
+      </w:pPr>
+      <w:r>
+        <w:rPr>
+          <w:rFonts w:ascii="Calibri" w:cs="Calibri" w:eastAsia="Calibri" w:hAnsi="Calibri"/>
+        </w:rPr>
+        <w:t xml:space="preserve">Both identifiers - e-shop and user management - become *Previously linked identifiers* (section 5.5) and wait under </w:t>
+      </w:r>
+      <w:r>
+        <w:rPr>
+          <w:rFonts w:ascii="Calibri" w:cs="Calibri" w:eastAsia="Calibri" w:hAnsi="Calibri"/>
+          <w:b/>
+          <w:bCs/>
+        </w:rPr>
+        <w:t xml:space="preserve">Account assignments</w:t>
+      </w:r>
+      <w:r>
+        <w:rPr>
+          <w:rFonts w:ascii="Calibri" w:cs="Calibri" w:eastAsia="Calibri" w:hAnsi="Calibri"/>
+        </w:rPr>
+        <w:t xml:space="preserve">; neither is linked directly.</w:t>
       </w:r>
     </w:p>
     <w:p>
@@ -9070,8 +9768,8 @@
         </w:tblBorders>
       </w:tblPr>
       <w:tblGrid>
-        <w:gridCol w:w="1964"/>
-        <w:gridCol w:w="7674"/>
+        <w:gridCol w:w="1935"/>
+        <w:gridCol w:w="7703"/>
       </w:tblGrid>
       <w:tr>
         <w:trPr>
@@ -9079,7 +9777,7 @@
         </w:trPr>
         <w:tc>
           <w:tcPr>
-            <w:tcW w:type="dxa" w:w="1964"/>
+            <w:tcW w:type="dxa" w:w="1935"/>
             <w:tcBorders>
               <w:top w:val="single" w:color="BFC5CE" w:sz="4"/>
               <w:left w:val="single" w:color="BFC5CE" w:sz="4"/>
@@ -9113,7 +9811,7 @@
         </w:tc>
         <w:tc>
           <w:tcPr>
-            <w:tcW w:type="dxa" w:w="7674"/>
+            <w:tcW w:type="dxa" w:w="7703"/>
             <w:tcBorders>
               <w:top w:val="single" w:color="BFC5CE" w:sz="4"/>
               <w:left w:val="single" w:color="BFC5CE" w:sz="4"/>
@@ -9152,7 +9850,7 @@
         </w:trPr>
         <w:tc>
           <w:tcPr>
-            <w:tcW w:type="dxa" w:w="1964"/>
+            <w:tcW w:type="dxa" w:w="1935"/>
             <w:tcBorders>
               <w:top w:val="single" w:color="BFC5CE" w:sz="4"/>
               <w:left w:val="single" w:color="BFC5CE" w:sz="4"/>
@@ -9183,7 +9881,7 @@
         </w:tc>
         <w:tc>
           <w:tcPr>
-            <w:tcW w:type="dxa" w:w="7674"/>
+            <w:tcW w:type="dxa" w:w="7703"/>
             <w:tcBorders>
               <w:top w:val="single" w:color="BFC5CE" w:sz="4"/>
               <w:left w:val="single" w:color="BFC5CE" w:sz="4"/>
@@ -9235,7 +9933,7 @@
         </w:trPr>
         <w:tc>
           <w:tcPr>
-            <w:tcW w:type="dxa" w:w="1964"/>
+            <w:tcW w:type="dxa" w:w="1935"/>
             <w:tcBorders>
               <w:top w:val="single" w:color="BFC5CE" w:sz="4"/>
               <w:left w:val="single" w:color="BFC5CE" w:sz="4"/>
@@ -9266,7 +9964,7 @@
         </w:tc>
         <w:tc>
           <w:tcPr>
-            <w:tcW w:type="dxa" w:w="7674"/>
+            <w:tcW w:type="dxa" w:w="7703"/>
             <w:tcBorders>
               <w:top w:val="single" w:color="BFC5CE" w:sz="4"/>
               <w:left w:val="single" w:color="BFC5CE" w:sz="4"/>
@@ -9302,7 +10000,7 @@
         </w:trPr>
         <w:tc>
           <w:tcPr>
-            <w:tcW w:type="dxa" w:w="1964"/>
+            <w:tcW w:type="dxa" w:w="1935"/>
             <w:tcBorders>
               <w:top w:val="single" w:color="BFC5CE" w:sz="4"/>
               <w:left w:val="single" w:color="BFC5CE" w:sz="4"/>
@@ -9333,32 +10031,32 @@
         </w:tc>
         <w:tc>
           <w:tcPr>
-            <w:tcW w:type="dxa" w:w="7674"/>
-            <w:tcBorders>
-              <w:top w:val="single" w:color="BFC5CE" w:sz="4"/>
-              <w:left w:val="single" w:color="BFC5CE" w:sz="4"/>
-              <w:bottom w:val="single" w:color="BFC5CE" w:sz="4"/>
-              <w:right w:val="single" w:color="BFC5CE" w:sz="4"/>
-            </w:tcBorders>
-            <w:tcMar>
-              <w:top w:type="dxa" w:w="40"/>
-              <w:left w:type="dxa" w:w="80"/>
-              <w:bottom w:type="dxa" w:w="40"/>
-              <w:right w:type="dxa" w:w="80"/>
-            </w:tcMar>
-          </w:tcPr>
-          <w:p>
-            <w:pPr>
-              <w:spacing w:after="0" w:before="0"/>
-              <w:jc w:val="left"/>
-            </w:pPr>
-            <w:r>
-              <w:rPr>
-                <w:rFonts w:ascii="Calibri" w:cs="Calibri" w:eastAsia="Calibri" w:hAnsi="Calibri"/>
-                <w:sz w:val="18"/>
-                <w:szCs w:val="18"/>
-              </w:rPr>
-              <w:t xml:space="preserve">No match above 40; a new customer is created with the account.</w:t>
+            <w:tcW w:type="dxa" w:w="7703"/>
+            <w:tcBorders>
+              <w:top w:val="single" w:color="BFC5CE" w:sz="4"/>
+              <w:left w:val="single" w:color="BFC5CE" w:sz="4"/>
+              <w:bottom w:val="single" w:color="BFC5CE" w:sz="4"/>
+              <w:right w:val="single" w:color="BFC5CE" w:sz="4"/>
+            </w:tcBorders>
+            <w:tcMar>
+              <w:top w:type="dxa" w:w="40"/>
+              <w:left w:type="dxa" w:w="80"/>
+              <w:bottom w:type="dxa" w:w="40"/>
+              <w:right w:type="dxa" w:w="80"/>
+            </w:tcMar>
+          </w:tcPr>
+          <w:p>
+            <w:pPr>
+              <w:spacing w:after="0" w:before="0"/>
+              <w:jc w:val="left"/>
+            </w:pPr>
+            <w:r>
+              <w:rPr>
+                <w:rFonts w:ascii="Calibri" w:cs="Calibri" w:eastAsia="Calibri" w:hAnsi="Calibri"/>
+                <w:sz w:val="18"/>
+                <w:szCs w:val="18"/>
+              </w:rPr>
+              <w:t xml:space="preserve">No match of 50 or more; a new customer is created with the account.</w:t>
             </w:r>
           </w:p>
         </w:tc>
@@ -9369,7 +10067,7 @@
         </w:trPr>
         <w:tc>
           <w:tcPr>
-            <w:tcW w:type="dxa" w:w="1964"/>
+            <w:tcW w:type="dxa" w:w="1935"/>
             <w:tcBorders>
               <w:top w:val="single" w:color="BFC5CE" w:sz="4"/>
               <w:left w:val="single" w:color="BFC5CE" w:sz="4"/>
@@ -9400,32 +10098,32 @@
         </w:tc>
         <w:tc>
           <w:tcPr>
-            <w:tcW w:type="dxa" w:w="7674"/>
-            <w:tcBorders>
-              <w:top w:val="single" w:color="BFC5CE" w:sz="4"/>
-              <w:left w:val="single" w:color="BFC5CE" w:sz="4"/>
-              <w:bottom w:val="single" w:color="BFC5CE" w:sz="4"/>
-              <w:right w:val="single" w:color="BFC5CE" w:sz="4"/>
-            </w:tcBorders>
-            <w:tcMar>
-              <w:top w:type="dxa" w:w="40"/>
-              <w:left w:type="dxa" w:w="80"/>
-              <w:bottom w:type="dxa" w:w="40"/>
-              <w:right w:type="dxa" w:w="80"/>
-            </w:tcMar>
-          </w:tcPr>
-          <w:p>
-            <w:pPr>
-              <w:spacing w:after="0" w:before="0"/>
-              <w:jc w:val="left"/>
-            </w:pPr>
-            <w:r>
-              <w:rPr>
-                <w:rFonts w:ascii="Calibri" w:cs="Calibri" w:eastAsia="Calibri" w:hAnsi="Calibri"/>
-                <w:sz w:val="18"/>
-                <w:szCs w:val="18"/>
-              </w:rPr>
-              <w:t xml:space="preserve">41-69 or conflicting matches; an administrator decides, then the account is linked.</w:t>
+            <w:tcW w:type="dxa" w:w="7703"/>
+            <w:tcBorders>
+              <w:top w:val="single" w:color="BFC5CE" w:sz="4"/>
+              <w:left w:val="single" w:color="BFC5CE" w:sz="4"/>
+              <w:bottom w:val="single" w:color="BFC5CE" w:sz="4"/>
+              <w:right w:val="single" w:color="BFC5CE" w:sz="4"/>
+            </w:tcBorders>
+            <w:tcMar>
+              <w:top w:type="dxa" w:w="40"/>
+              <w:left w:type="dxa" w:w="80"/>
+              <w:bottom w:type="dxa" w:w="40"/>
+              <w:right w:type="dxa" w:w="80"/>
+            </w:tcMar>
+          </w:tcPr>
+          <w:p>
+            <w:pPr>
+              <w:spacing w:after="0" w:before="0"/>
+              <w:jc w:val="left"/>
+            </w:pPr>
+            <w:r>
+              <w:rPr>
+                <w:rFonts w:ascii="Calibri" w:cs="Calibri" w:eastAsia="Calibri" w:hAnsi="Calibri"/>
+                <w:sz w:val="18"/>
+                <w:szCs w:val="18"/>
+              </w:rPr>
+              <w:t xml:space="preserve">50-69 or conflicting matches; an administrator decides, then the account is linked.</w:t>
             </w:r>
           </w:p>
         </w:tc>
@@ -12490,7 +13188,7 @@
         <w:rPr>
           <w:rFonts w:ascii="Calibri" w:cs="Calibri" w:eastAsia="Calibri" w:hAnsi="Calibri"/>
         </w:rPr>
-        <w:t xml:space="preserve">11.1 Sites and site activity</w:t>
+        <w:t xml:space="preserve">11.1 Sites and service center activity</w:t>
       </w:r>
     </w:p>
     <w:p>
@@ -12523,13 +13221,13 @@
           <w:b/>
           <w:bCs/>
         </w:rPr>
-        <w:t xml:space="preserve">Site activity</w:t>
-      </w:r>
-      <w:r>
-        <w:rPr>
-          <w:rFonts w:ascii="Calibri" w:cs="Calibri" w:eastAsia="Calibri" w:hAnsi="Calibri"/>
-        </w:rPr>
-        <w:t xml:space="preserve">. Code: </w:t>
+        <w:t xml:space="preserve">Service center activity</w:t>
+      </w:r>
+      <w:r>
+        <w:rPr>
+          <w:rFonts w:ascii="Calibri" w:cs="Calibri" w:eastAsia="Calibri" w:hAnsi="Calibri"/>
+        </w:rPr>
+        <w:t xml:space="preserve"> (formerly "Location activity"). Code: </w:t>
       </w:r>
       <w:r>
         <w:rPr>
@@ -13161,7 +13859,23 @@
                 <w:sz w:val="18"/>
                 <w:szCs w:val="18"/>
               </w:rPr>
-              <w:t xml:space="preserve">Who may take part and how many entries each may take, built from the eligibility basis: a segment, a points ranking (top N by balance at a cutoff date), a corporate grade (the effective grade, section 12.3), products registered, site activity, a manual list, an import, or open to everyone. Each target records why it qualified.</w:t>
+              <w:t xml:space="preserve">Who may take part and how many entries each may take, built from the eligibility basis: a segment, a points ranking (top N by balance at a cutoff date), a corporate grade (the effective grade, section 12.3), products registered, service center activity (</w:t>
+            </w:r>
+            <w:r>
+              <w:rPr>
+                <w:rFonts w:ascii="Consolas" w:cs="Consolas" w:eastAsia="Consolas" w:hAnsi="Consolas"/>
+                <w:sz w:val="17"/>
+                <w:szCs w:val="17"/>
+              </w:rPr>
+              <w:t xml:space="preserve">SERVICE_CENTER_ACTIVITY</w:t>
+            </w:r>
+            <w:r>
+              <w:rPr>
+                <w:rFonts w:ascii="Calibri" w:cs="Calibri" w:eastAsia="Calibri" w:hAnsi="Calibri"/>
+                <w:sz w:val="18"/>
+                <w:szCs w:val="18"/>
+              </w:rPr>
+              <w:t xml:space="preserve">), a manual list, an import, or open to everyone. Each target records why it qualified.</w:t>
             </w:r>
           </w:p>
         </w:tc>
@@ -15708,7 +16422,7 @@
         <w:rPr>
           <w:rFonts w:ascii="Calibri" w:cs="Calibri" w:eastAsia="Calibri" w:hAnsi="Calibri"/>
         </w:rPr>
-        <w:t xml:space="preserve"> edits the basic lists: projects, currencies, product classes, project tiers, point types and point event types, site activity types, case types, service statuses and the status map, priorities, issue, fault, root-cause and resolution categories, corporate grades, relationship types, purchase purposes, usage and acquisition types, registration questions, channels, communication purposes and options, organization types, contact roles, industries, tags, job titles, locations (refreshed from the vendor), metric definitions and departments.</w:t>
+        <w:t xml:space="preserve"> edits the basic lists: projects, currencies, product classes, project tiers, point types and point event types, service center activity types, case types, service statuses and the status map, priorities, issue, fault, root-cause and resolution categories, corporate grades, relationship types, purchase purposes, usage and acquisition types, registration questions, channels, communication purposes and options, organization types, contact roles, industries, tags, job titles, locations (refreshed from the vendor), metric definitions and departments.</w:t>
       </w:r>
     </w:p>
     <w:tbl>

</xml_diff>

<commit_message>
update excel importing logic, crm-translate
</commit_message>
<xml_diff>
--- a/crystal-backend/docs/crm-logic.docx
+++ b/crystal-backend/docs/crm-logic.docx
@@ -154,9 +154,9 @@
         </w:tblBorders>
       </w:tblPr>
       <w:tblGrid>
-        <w:gridCol w:w="1062"/>
-        <w:gridCol w:w="2346"/>
-        <w:gridCol w:w="6230"/>
+        <w:gridCol w:w="1315"/>
+        <w:gridCol w:w="2404"/>
+        <w:gridCol w:w="5919"/>
       </w:tblGrid>
       <w:tr>
         <w:trPr>
@@ -164,7 +164,7 @@
         </w:trPr>
         <w:tc>
           <w:tcPr>
-            <w:tcW w:type="dxa" w:w="1062"/>
+            <w:tcW w:type="dxa" w:w="1315"/>
             <w:tcBorders>
               <w:top w:val="single" w:color="BFC5CE" w:sz="4"/>
               <w:left w:val="single" w:color="BFC5CE" w:sz="4"/>
@@ -198,7 +198,7 @@
         </w:tc>
         <w:tc>
           <w:tcPr>
-            <w:tcW w:type="dxa" w:w="2346"/>
+            <w:tcW w:type="dxa" w:w="2404"/>
             <w:tcBorders>
               <w:top w:val="single" w:color="BFC5CE" w:sz="4"/>
               <w:left w:val="single" w:color="BFC5CE" w:sz="4"/>
@@ -232,7 +232,7 @@
         </w:tc>
         <w:tc>
           <w:tcPr>
-            <w:tcW w:type="dxa" w:w="6230"/>
+            <w:tcW w:type="dxa" w:w="5919"/>
             <w:tcBorders>
               <w:top w:val="single" w:color="BFC5CE" w:sz="4"/>
               <w:left w:val="single" w:color="BFC5CE" w:sz="4"/>
@@ -271,7 +271,7 @@
         </w:trPr>
         <w:tc>
           <w:tcPr>
-            <w:tcW w:type="dxa" w:w="1062"/>
+            <w:tcW w:type="dxa" w:w="1315"/>
             <w:tcBorders>
               <w:top w:val="single" w:color="BFC5CE" w:sz="4"/>
               <w:left w:val="single" w:color="BFC5CE" w:sz="4"/>
@@ -302,7 +302,7 @@
         </w:tc>
         <w:tc>
           <w:tcPr>
-            <w:tcW w:type="dxa" w:w="2346"/>
+            <w:tcW w:type="dxa" w:w="2404"/>
             <w:tcBorders>
               <w:top w:val="single" w:color="BFC5CE" w:sz="4"/>
               <w:left w:val="single" w:color="BFC5CE" w:sz="4"/>
@@ -333,7 +333,7 @@
         </w:tc>
         <w:tc>
           <w:tcPr>
-            <w:tcW w:type="dxa" w:w="6230"/>
+            <w:tcW w:type="dxa" w:w="5919"/>
             <w:tcBorders>
               <w:top w:val="single" w:color="BFC5CE" w:sz="4"/>
               <w:left w:val="single" w:color="BFC5CE" w:sz="4"/>
@@ -369,7 +369,7 @@
         </w:trPr>
         <w:tc>
           <w:tcPr>
-            <w:tcW w:type="dxa" w:w="1062"/>
+            <w:tcW w:type="dxa" w:w="1315"/>
             <w:tcBorders>
               <w:top w:val="single" w:color="BFC5CE" w:sz="4"/>
               <w:left w:val="single" w:color="BFC5CE" w:sz="4"/>
@@ -400,7 +400,7 @@
         </w:tc>
         <w:tc>
           <w:tcPr>
-            <w:tcW w:type="dxa" w:w="2346"/>
+            <w:tcW w:type="dxa" w:w="2404"/>
             <w:tcBorders>
               <w:top w:val="single" w:color="BFC5CE" w:sz="4"/>
               <w:left w:val="single" w:color="BFC5CE" w:sz="4"/>
@@ -431,7 +431,7 @@
         </w:tc>
         <w:tc>
           <w:tcPr>
-            <w:tcW w:type="dxa" w:w="6230"/>
+            <w:tcW w:type="dxa" w:w="5919"/>
             <w:tcBorders>
               <w:top w:val="single" w:color="BFC5CE" w:sz="4"/>
               <w:left w:val="single" w:color="BFC5CE" w:sz="4"/>
@@ -483,7 +483,7 @@
         </w:trPr>
         <w:tc>
           <w:tcPr>
-            <w:tcW w:type="dxa" w:w="1062"/>
+            <w:tcW w:type="dxa" w:w="1315"/>
             <w:tcBorders>
               <w:top w:val="single" w:color="BFC5CE" w:sz="4"/>
               <w:left w:val="single" w:color="BFC5CE" w:sz="4"/>
@@ -514,7 +514,7 @@
         </w:tc>
         <w:tc>
           <w:tcPr>
-            <w:tcW w:type="dxa" w:w="2346"/>
+            <w:tcW w:type="dxa" w:w="2404"/>
             <w:tcBorders>
               <w:top w:val="single" w:color="BFC5CE" w:sz="4"/>
               <w:left w:val="single" w:color="BFC5CE" w:sz="4"/>
@@ -545,7 +545,7 @@
         </w:tc>
         <w:tc>
           <w:tcPr>
-            <w:tcW w:type="dxa" w:w="6230"/>
+            <w:tcW w:type="dxa" w:w="5919"/>
             <w:tcBorders>
               <w:top w:val="single" w:color="BFC5CE" w:sz="4"/>
               <w:left w:val="single" w:color="BFC5CE" w:sz="4"/>
@@ -597,7 +597,7 @@
         </w:trPr>
         <w:tc>
           <w:tcPr>
-            <w:tcW w:type="dxa" w:w="1062"/>
+            <w:tcW w:type="dxa" w:w="1315"/>
             <w:tcBorders>
               <w:top w:val="single" w:color="BFC5CE" w:sz="4"/>
               <w:left w:val="single" w:color="BFC5CE" w:sz="4"/>
@@ -628,7 +628,7 @@
         </w:tc>
         <w:tc>
           <w:tcPr>
-            <w:tcW w:type="dxa" w:w="2346"/>
+            <w:tcW w:type="dxa" w:w="2404"/>
             <w:tcBorders>
               <w:top w:val="single" w:color="BFC5CE" w:sz="4"/>
               <w:left w:val="single" w:color="BFC5CE" w:sz="4"/>
@@ -659,7 +659,7 @@
         </w:tc>
         <w:tc>
           <w:tcPr>
-            <w:tcW w:type="dxa" w:w="6230"/>
+            <w:tcW w:type="dxa" w:w="5919"/>
             <w:tcBorders>
               <w:top w:val="single" w:color="BFC5CE" w:sz="4"/>
               <w:left w:val="single" w:color="BFC5CE" w:sz="4"/>
@@ -713,7 +713,7 @@
         </w:trPr>
         <w:tc>
           <w:tcPr>
-            <w:tcW w:type="dxa" w:w="1062"/>
+            <w:tcW w:type="dxa" w:w="1315"/>
             <w:tcBorders>
               <w:top w:val="single" w:color="BFC5CE" w:sz="4"/>
               <w:left w:val="single" w:color="BFC5CE" w:sz="4"/>
@@ -744,7 +744,7 @@
         </w:tc>
         <w:tc>
           <w:tcPr>
-            <w:tcW w:type="dxa" w:w="2346"/>
+            <w:tcW w:type="dxa" w:w="2404"/>
             <w:tcBorders>
               <w:top w:val="single" w:color="BFC5CE" w:sz="4"/>
               <w:left w:val="single" w:color="BFC5CE" w:sz="4"/>
@@ -775,7 +775,7 @@
         </w:tc>
         <w:tc>
           <w:tcPr>
-            <w:tcW w:type="dxa" w:w="6230"/>
+            <w:tcW w:type="dxa" w:w="5919"/>
             <w:tcBorders>
               <w:top w:val="single" w:color="BFC5CE" w:sz="4"/>
               <w:left w:val="single" w:color="BFC5CE" w:sz="4"/>
@@ -833,6 +833,514 @@
                 <w:szCs w:val="18"/>
               </w:rPr>
               <w:t xml:space="preserve">.</w:t>
+            </w:r>
+          </w:p>
+        </w:tc>
+      </w:tr>
+      <w:tr>
+        <w:trPr>
+          <w:cantSplit/>
+        </w:trPr>
+        <w:tc>
+          <w:tcPr>
+            <w:tcW w:type="dxa" w:w="1315"/>
+            <w:tcBorders>
+              <w:top w:val="single" w:color="BFC5CE" w:sz="4"/>
+              <w:left w:val="single" w:color="BFC5CE" w:sz="4"/>
+              <w:bottom w:val="single" w:color="BFC5CE" w:sz="4"/>
+              <w:right w:val="single" w:color="BFC5CE" w:sz="4"/>
+            </w:tcBorders>
+            <w:tcMar>
+              <w:top w:type="dxa" w:w="40"/>
+              <w:left w:type="dxa" w:w="80"/>
+              <w:bottom w:type="dxa" w:w="40"/>
+              <w:right w:type="dxa" w:w="80"/>
+            </w:tcMar>
+          </w:tcPr>
+          <w:p>
+            <w:pPr>
+              <w:spacing w:after="0" w:before="0"/>
+              <w:jc w:val="left"/>
+            </w:pPr>
+            <w:r>
+              <w:rPr>
+                <w:rFonts w:ascii="Calibri" w:cs="Calibri" w:eastAsia="Calibri" w:hAnsi="Calibri"/>
+                <w:sz w:val="18"/>
+                <w:szCs w:val="18"/>
+              </w:rPr>
+              <w:t xml:space="preserve">Console translations</w:t>
+            </w:r>
+          </w:p>
+        </w:tc>
+        <w:tc>
+          <w:tcPr>
+            <w:tcW w:type="dxa" w:w="2404"/>
+            <w:tcBorders>
+              <w:top w:val="single" w:color="BFC5CE" w:sz="4"/>
+              <w:left w:val="single" w:color="BFC5CE" w:sz="4"/>
+              <w:bottom w:val="single" w:color="BFC5CE" w:sz="4"/>
+              <w:right w:val="single" w:color="BFC5CE" w:sz="4"/>
+            </w:tcBorders>
+            <w:tcMar>
+              <w:top w:type="dxa" w:w="40"/>
+              <w:left w:type="dxa" w:w="80"/>
+              <w:bottom w:type="dxa" w:w="40"/>
+              <w:right w:type="dxa" w:w="80"/>
+            </w:tcMar>
+          </w:tcPr>
+          <w:p>
+            <w:pPr>
+              <w:spacing w:after="0" w:before="0"/>
+              <w:jc w:val="left"/>
+            </w:pPr>
+            <w:r>
+              <w:rPr>
+                <w:rFonts w:ascii="Consolas" w:cs="Consolas" w:eastAsia="Consolas" w:hAnsi="Consolas"/>
+                <w:sz w:val="17"/>
+                <w:szCs w:val="17"/>
+              </w:rPr>
+              <w:t xml:space="preserve">crystal-admin/src/i18n/crm.js</w:t>
+            </w:r>
+          </w:p>
+        </w:tc>
+        <w:tc>
+          <w:tcPr>
+            <w:tcW w:type="dxa" w:w="5919"/>
+            <w:tcBorders>
+              <w:top w:val="single" w:color="BFC5CE" w:sz="4"/>
+              <w:left w:val="single" w:color="BFC5CE" w:sz="4"/>
+              <w:bottom w:val="single" w:color="BFC5CE" w:sz="4"/>
+              <w:right w:val="single" w:color="BFC5CE" w:sz="4"/>
+            </w:tcBorders>
+            <w:tcMar>
+              <w:top w:type="dxa" w:w="40"/>
+              <w:left w:type="dxa" w:w="80"/>
+              <w:bottom w:type="dxa" w:w="40"/>
+              <w:right w:type="dxa" w:w="80"/>
+            </w:tcMar>
+          </w:tcPr>
+          <w:p>
+            <w:pPr>
+              <w:spacing w:after="0" w:before="0"/>
+              <w:jc w:val="left"/>
+            </w:pPr>
+            <w:r>
+              <w:rPr>
+                <w:rFonts w:ascii="Calibri" w:cs="Calibri" w:eastAsia="Calibri" w:hAnsi="Calibri"/>
+                <w:sz w:val="18"/>
+                <w:szCs w:val="18"/>
+              </w:rPr>
+              <w:t xml:space="preserve">One section per screen, named after its file: </w:t>
+            </w:r>
+            <w:r>
+              <w:rPr>
+                <w:rFonts w:ascii="Consolas" w:cs="Consolas" w:eastAsia="Consolas" w:hAnsi="Consolas"/>
+                <w:sz w:val="17"/>
+                <w:szCs w:val="17"/>
+              </w:rPr>
+              <w:t xml:space="preserve">crm.customers</w:t>
+            </w:r>
+            <w:r>
+              <w:rPr>
+                <w:rFonts w:ascii="Calibri" w:cs="Calibri" w:eastAsia="Calibri" w:hAnsi="Calibri"/>
+                <w:sz w:val="18"/>
+                <w:szCs w:val="18"/>
+              </w:rPr>
+              <w:t xml:space="preserve">, </w:t>
+            </w:r>
+            <w:r>
+              <w:rPr>
+                <w:rFonts w:ascii="Consolas" w:cs="Consolas" w:eastAsia="Consolas" w:hAnsi="Consolas"/>
+                <w:sz w:val="17"/>
+                <w:szCs w:val="17"/>
+              </w:rPr>
+              <w:t xml:space="preserve">crm.customerImport</w:t>
+            </w:r>
+            <w:r>
+              <w:rPr>
+                <w:rFonts w:ascii="Calibri" w:cs="Calibri" w:eastAsia="Calibri" w:hAnsi="Calibri"/>
+                <w:sz w:val="18"/>
+                <w:szCs w:val="18"/>
+              </w:rPr>
+              <w:t xml:space="preserve">, </w:t>
+            </w:r>
+            <w:r>
+              <w:rPr>
+                <w:rFonts w:ascii="Consolas" w:cs="Consolas" w:eastAsia="Consolas" w:hAnsi="Consolas"/>
+                <w:sz w:val="17"/>
+                <w:szCs w:val="17"/>
+              </w:rPr>
+              <w:t xml:space="preserve">crm.registrationReview</w:t>
+            </w:r>
+            <w:r>
+              <w:rPr>
+                <w:rFonts w:ascii="Calibri" w:cs="Calibri" w:eastAsia="Calibri" w:hAnsi="Calibri"/>
+                <w:sz w:val="18"/>
+                <w:szCs w:val="18"/>
+              </w:rPr>
+              <w:t xml:space="preserve">, </w:t>
+            </w:r>
+            <w:r>
+              <w:rPr>
+                <w:rFonts w:ascii="Consolas" w:cs="Consolas" w:eastAsia="Consolas" w:hAnsi="Consolas"/>
+                <w:sz w:val="17"/>
+                <w:szCs w:val="17"/>
+              </w:rPr>
+              <w:t xml:space="preserve">crm.customer360</w:t>
+            </w:r>
+            <w:r>
+              <w:rPr>
+                <w:rFonts w:ascii="Calibri" w:cs="Calibri" w:eastAsia="Calibri" w:hAnsi="Calibri"/>
+                <w:sz w:val="18"/>
+                <w:szCs w:val="18"/>
+              </w:rPr>
+              <w:t xml:space="preserve"> (with </w:t>
+            </w:r>
+            <w:r>
+              <w:rPr>
+                <w:rFonts w:ascii="Consolas" w:cs="Consolas" w:eastAsia="Consolas" w:hAnsi="Consolas"/>
+                <w:sz w:val="17"/>
+                <w:szCs w:val="17"/>
+              </w:rPr>
+              <w:t xml:space="preserve">customer360Tabs</w:t>
+            </w:r>
+            <w:r>
+              <w:rPr>
+                <w:rFonts w:ascii="Calibri" w:cs="Calibri" w:eastAsia="Calibri" w:hAnsi="Calibri"/>
+                <w:sz w:val="18"/>
+                <w:szCs w:val="18"/>
+              </w:rPr>
+              <w:t xml:space="preserve">, </w:t>
+            </w:r>
+            <w:r>
+              <w:rPr>
+                <w:rFonts w:ascii="Consolas" w:cs="Consolas" w:eastAsia="Consolas" w:hAnsi="Consolas"/>
+                <w:sz w:val="17"/>
+                <w:szCs w:val="17"/>
+              </w:rPr>
+              <w:t xml:space="preserve">customer360Cards</w:t>
+            </w:r>
+            <w:r>
+              <w:rPr>
+                <w:rFonts w:ascii="Calibri" w:cs="Calibri" w:eastAsia="Calibri" w:hAnsi="Calibri"/>
+                <w:sz w:val="18"/>
+                <w:szCs w:val="18"/>
+              </w:rPr>
+              <w:t xml:space="preserve">), </w:t>
+            </w:r>
+            <w:r>
+              <w:rPr>
+                <w:rFonts w:ascii="Consolas" w:cs="Consolas" w:eastAsia="Consolas" w:hAnsi="Consolas"/>
+                <w:sz w:val="17"/>
+                <w:szCs w:val="17"/>
+              </w:rPr>
+              <w:t xml:space="preserve">crm.events</w:t>
+            </w:r>
+            <w:r>
+              <w:rPr>
+                <w:rFonts w:ascii="Calibri" w:cs="Calibri" w:eastAsia="Calibri" w:hAnsi="Calibri"/>
+                <w:sz w:val="18"/>
+                <w:szCs w:val="18"/>
+              </w:rPr>
+              <w:t xml:space="preserve">, ...; </w:t>
+            </w:r>
+            <w:r>
+              <w:rPr>
+                <w:rFonts w:ascii="Consolas" w:cs="Consolas" w:eastAsia="Consolas" w:hAnsi="Consolas"/>
+                <w:sz w:val="17"/>
+                <w:szCs w:val="17"/>
+              </w:rPr>
+              <w:t xml:space="preserve">crm.common</w:t>
+            </w:r>
+            <w:r>
+              <w:rPr>
+                <w:rFonts w:ascii="Calibri" w:cs="Calibri" w:eastAsia="Calibri" w:hAnsi="Calibri"/>
+                <w:sz w:val="18"/>
+                <w:szCs w:val="18"/>
+              </w:rPr>
+              <w:t xml:space="preserve"> for sentences several screens use, </w:t>
+            </w:r>
+            <w:r>
+              <w:rPr>
+                <w:rFonts w:ascii="Consolas" w:cs="Consolas" w:eastAsia="Consolas" w:hAnsi="Consolas"/>
+                <w:sz w:val="17"/>
+                <w:szCs w:val="17"/>
+              </w:rPr>
+              <w:t xml:space="preserve">crm.components</w:t>
+            </w:r>
+            <w:r>
+              <w:rPr>
+                <w:rFonts w:ascii="Calibri" w:cs="Calibri" w:eastAsia="Calibri" w:hAnsi="Calibri"/>
+                <w:sz w:val="18"/>
+                <w:szCs w:val="18"/>
+              </w:rPr>
+              <w:t xml:space="preserve"> for the shared pickers and tables. Words matched by their English (column labels, codes, data names) are </w:t>
+            </w:r>
+            <w:r>
+              <w:rPr>
+                <w:rFonts w:ascii="Consolas" w:cs="Consolas" w:eastAsia="Consolas" w:hAnsi="Consolas"/>
+                <w:sz w:val="17"/>
+                <w:szCs w:val="17"/>
+              </w:rPr>
+              <w:t xml:space="preserve">vocabulary.crm.&lt;screen&gt;</w:t>
+            </w:r>
+            <w:r>
+              <w:rPr>
+                <w:rFonts w:ascii="Calibri" w:cs="Calibri" w:eastAsia="Calibri" w:hAnsi="Calibri"/>
+                <w:sz w:val="18"/>
+                <w:szCs w:val="18"/>
+              </w:rPr>
+              <w:t xml:space="preserve">, plus </w:t>
+            </w:r>
+            <w:r>
+              <w:rPr>
+                <w:rFonts w:ascii="Consolas" w:cs="Consolas" w:eastAsia="Consolas" w:hAnsi="Consolas"/>
+                <w:sz w:val="17"/>
+                <w:szCs w:val="17"/>
+              </w:rPr>
+              <w:t xml:space="preserve">codes</w:t>
+            </w:r>
+            <w:r>
+              <w:rPr>
+                <w:rFonts w:ascii="Calibri" w:cs="Calibri" w:eastAsia="Calibri" w:hAnsi="Calibri"/>
+                <w:sz w:val="18"/>
+                <w:szCs w:val="18"/>
+              </w:rPr>
+              <w:t xml:space="preserve">, </w:t>
+            </w:r>
+            <w:r>
+              <w:rPr>
+                <w:rFonts w:ascii="Consolas" w:cs="Consolas" w:eastAsia="Consolas" w:hAnsi="Consolas"/>
+                <w:sz w:val="17"/>
+                <w:szCs w:val="17"/>
+              </w:rPr>
+              <w:t xml:space="preserve">common</w:t>
+            </w:r>
+            <w:r>
+              <w:rPr>
+                <w:rFonts w:ascii="Calibri" w:cs="Calibri" w:eastAsia="Calibri" w:hAnsi="Calibri"/>
+                <w:sz w:val="18"/>
+                <w:szCs w:val="18"/>
+              </w:rPr>
+              <w:t xml:space="preserve"> and </w:t>
+            </w:r>
+            <w:r>
+              <w:rPr>
+                <w:rFonts w:ascii="Consolas" w:cs="Consolas" w:eastAsia="Consolas" w:hAnsi="Consolas"/>
+                <w:sz w:val="17"/>
+                <w:szCs w:val="17"/>
+              </w:rPr>
+              <w:t xml:space="preserve">data</w:t>
+            </w:r>
+            <w:r>
+              <w:rPr>
+                <w:rFonts w:ascii="Calibri" w:cs="Calibri" w:eastAsia="Calibri" w:hAnsi="Calibri"/>
+                <w:sz w:val="18"/>
+                <w:szCs w:val="18"/>
+              </w:rPr>
+              <w:t xml:space="preserve">. A new string goes in its screen's section, in all three languages.</w:t>
+            </w:r>
+          </w:p>
+        </w:tc>
+      </w:tr>
+      <w:tr>
+        <w:trPr>
+          <w:cantSplit/>
+        </w:trPr>
+        <w:tc>
+          <w:tcPr>
+            <w:tcW w:type="dxa" w:w="1315"/>
+            <w:tcBorders>
+              <w:top w:val="single" w:color="BFC5CE" w:sz="4"/>
+              <w:left w:val="single" w:color="BFC5CE" w:sz="4"/>
+              <w:bottom w:val="single" w:color="BFC5CE" w:sz="4"/>
+              <w:right w:val="single" w:color="BFC5CE" w:sz="4"/>
+            </w:tcBorders>
+            <w:tcMar>
+              <w:top w:type="dxa" w:w="40"/>
+              <w:left w:type="dxa" w:w="80"/>
+              <w:bottom w:type="dxa" w:w="40"/>
+              <w:right w:type="dxa" w:w="80"/>
+            </w:tcMar>
+          </w:tcPr>
+          <w:p>
+            <w:pPr>
+              <w:spacing w:after="0" w:before="0"/>
+              <w:jc w:val="left"/>
+            </w:pPr>
+            <w:r>
+              <w:rPr>
+                <w:rFonts w:ascii="Calibri" w:cs="Calibri" w:eastAsia="Calibri" w:hAnsi="Calibri"/>
+                <w:sz w:val="18"/>
+                <w:szCs w:val="18"/>
+              </w:rPr>
+              <w:t xml:space="preserve">API messages</w:t>
+            </w:r>
+          </w:p>
+        </w:tc>
+        <w:tc>
+          <w:tcPr>
+            <w:tcW w:type="dxa" w:w="2404"/>
+            <w:tcBorders>
+              <w:top w:val="single" w:color="BFC5CE" w:sz="4"/>
+              <w:left w:val="single" w:color="BFC5CE" w:sz="4"/>
+              <w:bottom w:val="single" w:color="BFC5CE" w:sz="4"/>
+              <w:right w:val="single" w:color="BFC5CE" w:sz="4"/>
+            </w:tcBorders>
+            <w:tcMar>
+              <w:top w:type="dxa" w:w="40"/>
+              <w:left w:type="dxa" w:w="80"/>
+              <w:bottom w:type="dxa" w:w="40"/>
+              <w:right w:type="dxa" w:w="80"/>
+            </w:tcMar>
+          </w:tcPr>
+          <w:p>
+            <w:pPr>
+              <w:spacing w:after="0" w:before="0"/>
+              <w:jc w:val="left"/>
+            </w:pPr>
+            <w:r>
+              <w:rPr>
+                <w:rFonts w:ascii="Consolas" w:cs="Consolas" w:eastAsia="Consolas" w:hAnsi="Consolas"/>
+                <w:sz w:val="17"/>
+                <w:szCs w:val="17"/>
+              </w:rPr>
+              <w:t xml:space="preserve">crystal-backend/src/i18n/{en,zh,ru}.js</w:t>
+            </w:r>
+          </w:p>
+        </w:tc>
+        <w:tc>
+          <w:tcPr>
+            <w:tcW w:type="dxa" w:w="5919"/>
+            <w:tcBorders>
+              <w:top w:val="single" w:color="BFC5CE" w:sz="4"/>
+              <w:left w:val="single" w:color="BFC5CE" w:sz="4"/>
+              <w:bottom w:val="single" w:color="BFC5CE" w:sz="4"/>
+              <w:right w:val="single" w:color="BFC5CE" w:sz="4"/>
+            </w:tcBorders>
+            <w:tcMar>
+              <w:top w:type="dxa" w:w="40"/>
+              <w:left w:type="dxa" w:w="80"/>
+              <w:bottom w:type="dxa" w:w="40"/>
+              <w:right w:type="dxa" w:w="80"/>
+            </w:tcMar>
+          </w:tcPr>
+          <w:p>
+            <w:pPr>
+              <w:spacing w:after="0" w:before="0"/>
+              <w:jc w:val="left"/>
+            </w:pPr>
+            <w:r>
+              <w:rPr>
+                <w:rFonts w:ascii="Consolas" w:cs="Consolas" w:eastAsia="Consolas" w:hAnsi="Consolas"/>
+                <w:sz w:val="17"/>
+                <w:szCs w:val="17"/>
+              </w:rPr>
+              <w:t xml:space="preserve">crm.&lt;area&gt;.&lt;key&gt;</w:t>
+            </w:r>
+            <w:r>
+              <w:rPr>
+                <w:rFonts w:ascii="Calibri" w:cs="Calibri" w:eastAsia="Calibri" w:hAnsi="Calibri"/>
+                <w:sz w:val="18"/>
+                <w:szCs w:val="18"/>
+              </w:rPr>
+              <w:t xml:space="preserve">, one section per area, named after the service that throws it (</w:t>
+            </w:r>
+            <w:r>
+              <w:rPr>
+                <w:rFonts w:ascii="Consolas" w:cs="Consolas" w:eastAsia="Consolas" w:hAnsi="Consolas"/>
+                <w:sz w:val="17"/>
+                <w:szCs w:val="17"/>
+              </w:rPr>
+              <w:t xml:space="preserve">crm.customers</w:t>
+            </w:r>
+            <w:r>
+              <w:rPr>
+                <w:rFonts w:ascii="Calibri" w:cs="Calibri" w:eastAsia="Calibri" w:hAnsi="Calibri"/>
+                <w:sz w:val="18"/>
+                <w:szCs w:val="18"/>
+              </w:rPr>
+              <w:t xml:space="preserve">, </w:t>
+            </w:r>
+            <w:r>
+              <w:rPr>
+                <w:rFonts w:ascii="Consolas" w:cs="Consolas" w:eastAsia="Consolas" w:hAnsi="Consolas"/>
+                <w:sz w:val="17"/>
+                <w:szCs w:val="17"/>
+              </w:rPr>
+              <w:t xml:space="preserve">crm.products</w:t>
+            </w:r>
+            <w:r>
+              <w:rPr>
+                <w:rFonts w:ascii="Calibri" w:cs="Calibri" w:eastAsia="Calibri" w:hAnsi="Calibri"/>
+                <w:sz w:val="18"/>
+                <w:szCs w:val="18"/>
+              </w:rPr>
+              <w:t xml:space="preserve">, </w:t>
+            </w:r>
+            <w:r>
+              <w:rPr>
+                <w:rFonts w:ascii="Consolas" w:cs="Consolas" w:eastAsia="Consolas" w:hAnsi="Consolas"/>
+                <w:sz w:val="17"/>
+                <w:szCs w:val="17"/>
+              </w:rPr>
+              <w:t xml:space="preserve">crm.events</w:t>
+            </w:r>
+            <w:r>
+              <w:rPr>
+                <w:rFonts w:ascii="Calibri" w:cs="Calibri" w:eastAsia="Calibri" w:hAnsi="Calibri"/>
+                <w:sz w:val="18"/>
+                <w:szCs w:val="18"/>
+              </w:rPr>
+              <w:t xml:space="preserve">, </w:t>
+            </w:r>
+            <w:r>
+              <w:rPr>
+                <w:rFonts w:ascii="Consolas" w:cs="Consolas" w:eastAsia="Consolas" w:hAnsi="Consolas"/>
+                <w:sz w:val="17"/>
+                <w:szCs w:val="17"/>
+              </w:rPr>
+              <w:t xml:space="preserve">crm.marketing</w:t>
+            </w:r>
+            <w:r>
+              <w:rPr>
+                <w:rFonts w:ascii="Calibri" w:cs="Calibri" w:eastAsia="Calibri" w:hAnsi="Calibri"/>
+                <w:sz w:val="18"/>
+                <w:szCs w:val="18"/>
+              </w:rPr>
+              <w:t xml:space="preserve">, </w:t>
+            </w:r>
+            <w:r>
+              <w:rPr>
+                <w:rFonts w:ascii="Consolas" w:cs="Consolas" w:eastAsia="Consolas" w:hAnsi="Consolas"/>
+                <w:sz w:val="17"/>
+                <w:szCs w:val="17"/>
+              </w:rPr>
+              <w:t xml:space="preserve">crm.settings</w:t>
+            </w:r>
+            <w:r>
+              <w:rPr>
+                <w:rFonts w:ascii="Calibri" w:cs="Calibri" w:eastAsia="Calibri" w:hAnsi="Calibri"/>
+                <w:sz w:val="18"/>
+                <w:szCs w:val="18"/>
+              </w:rPr>
+              <w:t xml:space="preserve">, ...); </w:t>
+            </w:r>
+            <w:r>
+              <w:rPr>
+                <w:rFonts w:ascii="Consolas" w:cs="Consolas" w:eastAsia="Consolas" w:hAnsi="Consolas"/>
+                <w:sz w:val="17"/>
+                <w:szCs w:val="17"/>
+              </w:rPr>
+              <w:t xml:space="preserve">crm.common</w:t>
+            </w:r>
+            <w:r>
+              <w:rPr>
+                <w:rFonts w:ascii="Calibri" w:cs="Calibri" w:eastAsia="Calibri" w:hAnsi="Calibri"/>
+                <w:sz w:val="18"/>
+                <w:szCs w:val="18"/>
+              </w:rPr>
+              <w:t xml:space="preserve"> when several do.</w:t>
             </w:r>
           </w:p>
         </w:tc>
@@ -1041,7 +1549,7 @@
                 <w:sz w:val="18"/>
                 <w:szCs w:val="18"/>
               </w:rPr>
-              <w:t xml:space="preserve">One Dream business system (PLATFORM, CRYSTAL, EPRODUCT, ESHOP, APPSTORE, KARAOKE, BMEDIA, ...). Every external id is scoped to its project.</w:t>
+              <w:t xml:space="preserve">One Dream business system, defined by the administrator in Settings &gt; Projects (code, name, kind, identity role). Every external id is scoped to its project.</w:t>
             </w:r>
           </w:p>
         </w:tc>
@@ -4395,7 +4903,21 @@
         <w:rPr>
           <w:rFonts w:ascii="Calibri" w:cs="Calibri" w:eastAsia="Calibri" w:hAnsi="Calibri"/>
         </w:rPr>
-        <w:t xml:space="preserve">. A project is identified by </w:t>
+        <w:t xml:space="preserve">. Codes and names are the administrator's own. The Excel import and the User PK rule find their projects by </w:t>
+      </w:r>
+      <w:r>
+        <w:rPr>
+          <w:rFonts w:ascii="Calibri" w:cs="Calibri" w:eastAsia="Calibri" w:hAnsi="Calibri"/>
+          <w:b/>
+          <w:bCs/>
+        </w:rPr>
+        <w:t xml:space="preserve">identity role</w:t>
+      </w:r>
+      <w:r>
+        <w:rPr>
+          <w:rFonts w:ascii="Calibri" w:cs="Calibri" w:eastAsia="Calibri" w:hAnsi="Calibri"/>
+        </w:rPr>
+        <w:t xml:space="preserve">, never by code. Only the imports from the old systems look projects up by code: the Crystal import needs a project coded </w:t>
       </w:r>
       <w:r>
         <w:rPr>
@@ -4403,13 +4925,27 @@
           <w:sz w:val="19"/>
           <w:szCs w:val="19"/>
         </w:rPr>
-        <w:t xml:space="preserve">project_code</w:t>
-      </w:r>
-      <w:r>
-        <w:rPr>
-          <w:rFonts w:ascii="Calibri" w:cs="Calibri" w:eastAsia="Calibri" w:hAnsi="Calibri"/>
-        </w:rPr>
-        <w:t xml:space="preserve">; the code looks projects up by it (the Crystal import needs CRYSTAL, the Excel import needs ESHOP, the platform link needs PLATFORM, ...).</w:t>
+        <w:t xml:space="preserve">CRYSTAL</w:t>
+      </w:r>
+      <w:r>
+        <w:rPr>
+          <w:rFonts w:ascii="Calibri" w:cs="Calibri" w:eastAsia="Calibri" w:hAnsi="Calibri"/>
+        </w:rPr>
+        <w:t xml:space="preserve">, and platform-account links, point types without an owner project and campaigns without a project fall back to </w:t>
+      </w:r>
+      <w:r>
+        <w:rPr>
+          <w:rFonts w:ascii="Consolas" w:cs="Consolas" w:eastAsia="Consolas" w:hAnsi="Consolas"/>
+          <w:sz w:val="19"/>
+          <w:szCs w:val="19"/>
+        </w:rPr>
+        <w:t xml:space="preserve">PLATFORM</w:t>
+      </w:r>
+      <w:r>
+        <w:rPr>
+          <w:rFonts w:ascii="Calibri" w:cs="Calibri" w:eastAsia="Calibri" w:hAnsi="Calibri"/>
+        </w:rPr>
+        <w:t xml:space="preserve"> when one exists.</w:t>
       </w:r>
     </w:p>
     <w:tbl>
@@ -4425,9 +4961,9 @@
         </w:tblBorders>
       </w:tblPr>
       <w:tblGrid>
-        <w:gridCol w:w="2000"/>
-        <w:gridCol w:w="2388"/>
-        <w:gridCol w:w="5250"/>
+        <w:gridCol w:w="2062"/>
+        <w:gridCol w:w="2354"/>
+        <w:gridCol w:w="5222"/>
       </w:tblGrid>
       <w:tr>
         <w:trPr>
@@ -4435,7 +4971,7 @@
         </w:trPr>
         <w:tc>
           <w:tcPr>
-            <w:tcW w:type="dxa" w:w="2000"/>
+            <w:tcW w:type="dxa" w:w="2062"/>
             <w:tcBorders>
               <w:top w:val="single" w:color="BFC5CE" w:sz="4"/>
               <w:left w:val="single" w:color="BFC5CE" w:sz="4"/>
@@ -4469,7 +5005,7 @@
         </w:tc>
         <w:tc>
           <w:tcPr>
-            <w:tcW w:type="dxa" w:w="2388"/>
+            <w:tcW w:type="dxa" w:w="2354"/>
             <w:tcBorders>
               <w:top w:val="single" w:color="BFC5CE" w:sz="4"/>
               <w:left w:val="single" w:color="BFC5CE" w:sz="4"/>
@@ -4503,7 +5039,7 @@
         </w:tc>
         <w:tc>
           <w:tcPr>
-            <w:tcW w:type="dxa" w:w="5250"/>
+            <w:tcW w:type="dxa" w:w="5222"/>
             <w:tcBorders>
               <w:top w:val="single" w:color="BFC5CE" w:sz="4"/>
               <w:left w:val="single" w:color="BFC5CE" w:sz="4"/>
@@ -4542,7 +5078,7 @@
         </w:trPr>
         <w:tc>
           <w:tcPr>
-            <w:tcW w:type="dxa" w:w="2000"/>
+            <w:tcW w:type="dxa" w:w="2062"/>
             <w:tcBorders>
               <w:top w:val="single" w:color="BFC5CE" w:sz="4"/>
               <w:left w:val="single" w:color="BFC5CE" w:sz="4"/>
@@ -4589,7 +5125,7 @@
         </w:tc>
         <w:tc>
           <w:tcPr>
-            <w:tcW w:type="dxa" w:w="2388"/>
+            <w:tcW w:type="dxa" w:w="2354"/>
             <w:tcBorders>
               <w:top w:val="single" w:color="BFC5CE" w:sz="4"/>
               <w:left w:val="single" w:color="BFC5CE" w:sz="4"/>
@@ -4620,7 +5156,7 @@
         </w:tc>
         <w:tc>
           <w:tcPr>
-            <w:tcW w:type="dxa" w:w="5250"/>
+            <w:tcW w:type="dxa" w:w="5222"/>
             <w:tcBorders>
               <w:top w:val="single" w:color="BFC5CE" w:sz="4"/>
               <w:left w:val="single" w:color="BFC5CE" w:sz="4"/>
@@ -4656,32 +5192,32 @@
         </w:trPr>
         <w:tc>
           <w:tcPr>
-            <w:tcW w:type="dxa" w:w="2000"/>
-            <w:tcBorders>
-              <w:top w:val="single" w:color="BFC5CE" w:sz="4"/>
-              <w:left w:val="single" w:color="BFC5CE" w:sz="4"/>
-              <w:bottom w:val="single" w:color="BFC5CE" w:sz="4"/>
-              <w:right w:val="single" w:color="BFC5CE" w:sz="4"/>
-            </w:tcBorders>
-            <w:tcMar>
-              <w:top w:type="dxa" w:w="40"/>
-              <w:left w:type="dxa" w:w="80"/>
-              <w:bottom w:type="dxa" w:w="40"/>
-              <w:right w:type="dxa" w:w="80"/>
-            </w:tcMar>
-          </w:tcPr>
-          <w:p>
-            <w:pPr>
-              <w:spacing w:after="0" w:before="0"/>
-              <w:jc w:val="left"/>
-            </w:pPr>
-            <w:r>
-              <w:rPr>
-                <w:rFonts w:ascii="Calibri" w:cs="Calibri" w:eastAsia="Calibri" w:hAnsi="Calibri"/>
-                <w:sz w:val="18"/>
-                <w:szCs w:val="18"/>
-              </w:rPr>
-              <w:t xml:space="preserve">Code (</w:t>
+            <w:tcW w:type="dxa" w:w="2062"/>
+            <w:tcBorders>
+              <w:top w:val="single" w:color="BFC5CE" w:sz="4"/>
+              <w:left w:val="single" w:color="BFC5CE" w:sz="4"/>
+              <w:bottom w:val="single" w:color="BFC5CE" w:sz="4"/>
+              <w:right w:val="single" w:color="BFC5CE" w:sz="4"/>
+            </w:tcBorders>
+            <w:tcMar>
+              <w:top w:type="dxa" w:w="40"/>
+              <w:left w:type="dxa" w:w="80"/>
+              <w:bottom w:type="dxa" w:w="40"/>
+              <w:right w:type="dxa" w:w="80"/>
+            </w:tcMar>
+          </w:tcPr>
+          <w:p>
+            <w:pPr>
+              <w:spacing w:after="0" w:before="0"/>
+              <w:jc w:val="left"/>
+            </w:pPr>
+            <w:r>
+              <w:rPr>
+                <w:rFonts w:ascii="Calibri" w:cs="Calibri" w:eastAsia="Calibri" w:hAnsi="Calibri"/>
+                <w:sz w:val="18"/>
+                <w:szCs w:val="18"/>
+              </w:rPr>
+              <w:t xml:space="preserve">Identity role (</w:t>
             </w:r>
             <w:r>
               <w:rPr>
@@ -4689,7 +5225,7 @@
                 <w:sz w:val="17"/>
                 <w:szCs w:val="17"/>
               </w:rPr>
-              <w:t xml:space="preserve">project_code</w:t>
+              <w:t xml:space="preserve">identity_role</w:t>
             </w:r>
             <w:r>
               <w:rPr>
@@ -4703,63 +5239,91 @@
         </w:tc>
         <w:tc>
           <w:tcPr>
-            <w:tcW w:type="dxa" w:w="2388"/>
-            <w:tcBorders>
-              <w:top w:val="single" w:color="BFC5CE" w:sz="4"/>
-              <w:left w:val="single" w:color="BFC5CE" w:sz="4"/>
-              <w:bottom w:val="single" w:color="BFC5CE" w:sz="4"/>
-              <w:right w:val="single" w:color="BFC5CE" w:sz="4"/>
-            </w:tcBorders>
-            <w:tcMar>
-              <w:top w:type="dxa" w:w="40"/>
-              <w:left w:type="dxa" w:w="80"/>
-              <w:bottom w:type="dxa" w:w="40"/>
-              <w:right w:type="dxa" w:w="80"/>
-            </w:tcMar>
-          </w:tcPr>
-          <w:p>
-            <w:pPr>
-              <w:spacing w:after="0" w:before="0"/>
-              <w:jc w:val="left"/>
-            </w:pPr>
-            <w:r>
-              <w:rPr>
-                <w:rFonts w:ascii="Calibri" w:cs="Calibri" w:eastAsia="Calibri" w:hAnsi="Calibri"/>
-                <w:sz w:val="18"/>
-                <w:szCs w:val="18"/>
-              </w:rPr>
-              <w:t xml:space="preserve">Only while no row in any other table references the project</w:t>
-            </w:r>
-          </w:p>
-        </w:tc>
-        <w:tc>
-          <w:tcPr>
-            <w:tcW w:type="dxa" w:w="5250"/>
-            <w:tcBorders>
-              <w:top w:val="single" w:color="BFC5CE" w:sz="4"/>
-              <w:left w:val="single" w:color="BFC5CE" w:sz="4"/>
-              <w:bottom w:val="single" w:color="BFC5CE" w:sz="4"/>
-              <w:right w:val="single" w:color="BFC5CE" w:sz="4"/>
-            </w:tcBorders>
-            <w:tcMar>
-              <w:top w:type="dxa" w:w="40"/>
-              <w:left w:type="dxa" w:w="80"/>
-              <w:bottom w:type="dxa" w:w="40"/>
-              <w:right w:type="dxa" w:w="80"/>
-            </w:tcMar>
-          </w:tcPr>
-          <w:p>
-            <w:pPr>
-              <w:spacing w:after="0" w:before="0"/>
-              <w:jc w:val="left"/>
-            </w:pPr>
-            <w:r>
-              <w:rPr>
-                <w:rFonts w:ascii="Calibri" w:cs="Calibri" w:eastAsia="Calibri" w:hAnsi="Calibri"/>
-                <w:sz w:val="18"/>
-                <w:szCs w:val="18"/>
-              </w:rPr>
-              <w:t xml:space="preserve">The check reads the foreign keys from the database, so it covers every table. When blocked, the message names the tables that use the project.</w:t>
+            <w:tcW w:type="dxa" w:w="2354"/>
+            <w:tcBorders>
+              <w:top w:val="single" w:color="BFC5CE" w:sz="4"/>
+              <w:left w:val="single" w:color="BFC5CE" w:sz="4"/>
+              <w:bottom w:val="single" w:color="BFC5CE" w:sz="4"/>
+              <w:right w:val="single" w:color="BFC5CE" w:sz="4"/>
+            </w:tcBorders>
+            <w:tcMar>
+              <w:top w:type="dxa" w:w="40"/>
+              <w:left w:type="dxa" w:w="80"/>
+              <w:bottom w:type="dxa" w:w="40"/>
+              <w:right w:type="dxa" w:w="80"/>
+            </w:tcMar>
+          </w:tcPr>
+          <w:p>
+            <w:pPr>
+              <w:spacing w:after="0" w:before="0"/>
+              <w:jc w:val="left"/>
+            </w:pPr>
+            <w:r>
+              <w:rPr>
+                <w:rFonts w:ascii="Calibri" w:cs="Calibri" w:eastAsia="Calibri" w:hAnsi="Calibri"/>
+                <w:sz w:val="18"/>
+                <w:szCs w:val="18"/>
+              </w:rPr>
+              <w:t xml:space="preserve">Always; one project per role</w:t>
+            </w:r>
+          </w:p>
+        </w:tc>
+        <w:tc>
+          <w:tcPr>
+            <w:tcW w:type="dxa" w:w="5222"/>
+            <w:tcBorders>
+              <w:top w:val="single" w:color="BFC5CE" w:sz="4"/>
+              <w:left w:val="single" w:color="BFC5CE" w:sz="4"/>
+              <w:bottom w:val="single" w:color="BFC5CE" w:sz="4"/>
+              <w:right w:val="single" w:color="BFC5CE" w:sz="4"/>
+            </w:tcBorders>
+            <w:tcMar>
+              <w:top w:type="dxa" w:w="40"/>
+              <w:left w:type="dxa" w:w="80"/>
+              <w:bottom w:type="dxa" w:w="40"/>
+              <w:right w:type="dxa" w:w="80"/>
+            </w:tcMar>
+          </w:tcPr>
+          <w:p>
+            <w:pPr>
+              <w:spacing w:after="0" w:before="0"/>
+              <w:jc w:val="left"/>
+            </w:pPr>
+            <w:r>
+              <w:rPr>
+                <w:rFonts w:ascii="Calibri" w:cs="Calibri" w:eastAsia="Calibri" w:hAnsi="Calibri"/>
+                <w:b/>
+                <w:bCs/>
+                <w:sz w:val="18"/>
+                <w:szCs w:val="18"/>
+              </w:rPr>
+              <w:t xml:space="preserve">E-shop</w:t>
+            </w:r>
+            <w:r>
+              <w:rPr>
+                <w:rFonts w:ascii="Calibri" w:cs="Calibri" w:eastAsia="Calibri" w:hAnsi="Calibri"/>
+                <w:sz w:val="18"/>
+                <w:szCs w:val="18"/>
+              </w:rPr>
+              <w:t xml:space="preserve">: the project of the Excel import's E-shop PK / ID columns. </w:t>
+            </w:r>
+            <w:r>
+              <w:rPr>
+                <w:rFonts w:ascii="Calibri" w:cs="Calibri" w:eastAsia="Calibri" w:hAnsi="Calibri"/>
+                <w:b/>
+                <w:bCs/>
+                <w:sz w:val="18"/>
+                <w:szCs w:val="18"/>
+              </w:rPr>
+              <w:t xml:space="preserve">User management</w:t>
+            </w:r>
+            <w:r>
+              <w:rPr>
+                <w:rFonts w:ascii="Calibri" w:cs="Calibri" w:eastAsia="Calibri" w:hAnsi="Calibri"/>
+                <w:sz w:val="18"/>
+                <w:szCs w:val="18"/>
+              </w:rPr>
+              <w:t xml:space="preserve">: the project of its User PK / User ID columns, whose user_pk merges rows. The import refuses to run until both roles are given.</w:t>
             </w:r>
           </w:p>
         </w:tc>
@@ -4770,7 +5334,121 @@
         </w:trPr>
         <w:tc>
           <w:tcPr>
-            <w:tcW w:type="dxa" w:w="2000"/>
+            <w:tcW w:type="dxa" w:w="2062"/>
+            <w:tcBorders>
+              <w:top w:val="single" w:color="BFC5CE" w:sz="4"/>
+              <w:left w:val="single" w:color="BFC5CE" w:sz="4"/>
+              <w:bottom w:val="single" w:color="BFC5CE" w:sz="4"/>
+              <w:right w:val="single" w:color="BFC5CE" w:sz="4"/>
+            </w:tcBorders>
+            <w:tcMar>
+              <w:top w:type="dxa" w:w="40"/>
+              <w:left w:type="dxa" w:w="80"/>
+              <w:bottom w:type="dxa" w:w="40"/>
+              <w:right w:type="dxa" w:w="80"/>
+            </w:tcMar>
+          </w:tcPr>
+          <w:p>
+            <w:pPr>
+              <w:spacing w:after="0" w:before="0"/>
+              <w:jc w:val="left"/>
+            </w:pPr>
+            <w:r>
+              <w:rPr>
+                <w:rFonts w:ascii="Calibri" w:cs="Calibri" w:eastAsia="Calibri" w:hAnsi="Calibri"/>
+                <w:sz w:val="18"/>
+                <w:szCs w:val="18"/>
+              </w:rPr>
+              <w:t xml:space="preserve">Code (</w:t>
+            </w:r>
+            <w:r>
+              <w:rPr>
+                <w:rFonts w:ascii="Consolas" w:cs="Consolas" w:eastAsia="Consolas" w:hAnsi="Consolas"/>
+                <w:sz w:val="17"/>
+                <w:szCs w:val="17"/>
+              </w:rPr>
+              <w:t xml:space="preserve">project_code</w:t>
+            </w:r>
+            <w:r>
+              <w:rPr>
+                <w:rFonts w:ascii="Calibri" w:cs="Calibri" w:eastAsia="Calibri" w:hAnsi="Calibri"/>
+                <w:sz w:val="18"/>
+                <w:szCs w:val="18"/>
+              </w:rPr>
+              <w:t xml:space="preserve">)</w:t>
+            </w:r>
+          </w:p>
+        </w:tc>
+        <w:tc>
+          <w:tcPr>
+            <w:tcW w:type="dxa" w:w="2354"/>
+            <w:tcBorders>
+              <w:top w:val="single" w:color="BFC5CE" w:sz="4"/>
+              <w:left w:val="single" w:color="BFC5CE" w:sz="4"/>
+              <w:bottom w:val="single" w:color="BFC5CE" w:sz="4"/>
+              <w:right w:val="single" w:color="BFC5CE" w:sz="4"/>
+            </w:tcBorders>
+            <w:tcMar>
+              <w:top w:type="dxa" w:w="40"/>
+              <w:left w:type="dxa" w:w="80"/>
+              <w:bottom w:type="dxa" w:w="40"/>
+              <w:right w:type="dxa" w:w="80"/>
+            </w:tcMar>
+          </w:tcPr>
+          <w:p>
+            <w:pPr>
+              <w:spacing w:after="0" w:before="0"/>
+              <w:jc w:val="left"/>
+            </w:pPr>
+            <w:r>
+              <w:rPr>
+                <w:rFonts w:ascii="Calibri" w:cs="Calibri" w:eastAsia="Calibri" w:hAnsi="Calibri"/>
+                <w:sz w:val="18"/>
+                <w:szCs w:val="18"/>
+              </w:rPr>
+              <w:t xml:space="preserve">Only while no row in any other table references the project</w:t>
+            </w:r>
+          </w:p>
+        </w:tc>
+        <w:tc>
+          <w:tcPr>
+            <w:tcW w:type="dxa" w:w="5222"/>
+            <w:tcBorders>
+              <w:top w:val="single" w:color="BFC5CE" w:sz="4"/>
+              <w:left w:val="single" w:color="BFC5CE" w:sz="4"/>
+              <w:bottom w:val="single" w:color="BFC5CE" w:sz="4"/>
+              <w:right w:val="single" w:color="BFC5CE" w:sz="4"/>
+            </w:tcBorders>
+            <w:tcMar>
+              <w:top w:type="dxa" w:w="40"/>
+              <w:left w:type="dxa" w:w="80"/>
+              <w:bottom w:type="dxa" w:w="40"/>
+              <w:right w:type="dxa" w:w="80"/>
+            </w:tcMar>
+          </w:tcPr>
+          <w:p>
+            <w:pPr>
+              <w:spacing w:after="0" w:before="0"/>
+              <w:jc w:val="left"/>
+            </w:pPr>
+            <w:r>
+              <w:rPr>
+                <w:rFonts w:ascii="Calibri" w:cs="Calibri" w:eastAsia="Calibri" w:hAnsi="Calibri"/>
+                <w:sz w:val="18"/>
+                <w:szCs w:val="18"/>
+              </w:rPr>
+              <w:t xml:space="preserve">The check reads the foreign keys from the database, so it covers every table. When blocked, the message names the tables that use the project.</w:t>
+            </w:r>
+          </w:p>
+        </w:tc>
+      </w:tr>
+      <w:tr>
+        <w:trPr>
+          <w:cantSplit/>
+        </w:trPr>
+        <w:tc>
+          <w:tcPr>
+            <w:tcW w:type="dxa" w:w="2062"/>
             <w:tcBorders>
               <w:top w:val="single" w:color="BFC5CE" w:sz="4"/>
               <w:left w:val="single" w:color="BFC5CE" w:sz="4"/>
@@ -4801,7 +5479,7 @@
         </w:tc>
         <w:tc>
           <w:tcPr>
-            <w:tcW w:type="dxa" w:w="2388"/>
+            <w:tcW w:type="dxa" w:w="2354"/>
             <w:tcBorders>
               <w:top w:val="single" w:color="BFC5CE" w:sz="4"/>
               <w:left w:val="single" w:color="BFC5CE" w:sz="4"/>
@@ -4832,7 +5510,7 @@
         </w:tc>
         <w:tc>
           <w:tcPr>
-            <w:tcW w:type="dxa" w:w="5250"/>
+            <w:tcW w:type="dxa" w:w="5222"/>
             <w:tcBorders>
               <w:top w:val="single" w:color="BFC5CE" w:sz="4"/>
               <w:left w:val="single" w:color="BFC5CE" w:sz="4"/>
@@ -4876,7 +5554,35 @@
         <w:rPr>
           <w:rFonts w:ascii="Calibri" w:cs="Calibri" w:eastAsia="Calibri" w:hAnsi="Calibri"/>
         </w:rPr>
-        <w:t xml:space="preserve">On a fresh install the test data references PLATFORM, CRYSTAL, ESHOP and APPSTORE, so those keep their codes until that data is removed. Renaming a code the system looks up (e.g. ESHOP) means features that look it up will no longer find the project; do that only deliberately.</w:t>
+        <w:t xml:space="preserve">Renaming a code the old-system imports look up (</w:t>
+      </w:r>
+      <w:r>
+        <w:rPr>
+          <w:rFonts w:ascii="Consolas" w:cs="Consolas" w:eastAsia="Consolas" w:hAnsi="Consolas"/>
+          <w:sz w:val="19"/>
+          <w:szCs w:val="19"/>
+        </w:rPr>
+        <w:t xml:space="preserve">CRYSTAL</w:t>
+      </w:r>
+      <w:r>
+        <w:rPr>
+          <w:rFonts w:ascii="Calibri" w:cs="Calibri" w:eastAsia="Calibri" w:hAnsi="Calibri"/>
+        </w:rPr>
+        <w:t xml:space="preserve">, </w:t>
+      </w:r>
+      <w:r>
+        <w:rPr>
+          <w:rFonts w:ascii="Consolas" w:cs="Consolas" w:eastAsia="Consolas" w:hAnsi="Consolas"/>
+          <w:sz w:val="19"/>
+          <w:szCs w:val="19"/>
+        </w:rPr>
+        <w:t xml:space="preserve">PLATFORM</w:t>
+      </w:r>
+      <w:r>
+        <w:rPr>
+          <w:rFonts w:ascii="Calibri" w:cs="Calibri" w:eastAsia="Calibri" w:hAnsi="Calibri"/>
+        </w:rPr>
+        <w:t xml:space="preserve">) means those imports no longer find the project; do that only deliberately. Identity roles can be moved between projects at any time.</w:t>
       </w:r>
     </w:p>
     <w:p>
@@ -5128,7 +5834,7 @@
         <w:rPr>
           <w:rFonts w:ascii="Calibri" w:cs="Calibri" w:eastAsia="Calibri" w:hAnsi="Calibri"/>
         </w:rPr>
-        <w:t xml:space="preserve"> (digits only for phones) is used for matching and search.</w:t>
+        <w:t xml:space="preserve"> (digits only for phones) is used for matching and search. Merging keeps every phone (section 5.4), and the customer record shows all of them.</w:t>
       </w:r>
     </w:p>
     <w:tbl>
@@ -6943,6 +7649,22 @@
         <w:rPr>
           <w:rFonts w:ascii="Calibri" w:cs="Calibri" w:eastAsia="Calibri" w:hAnsi="Calibri"/>
         </w:rPr>
+        <w:t xml:space="preserve">The Excel file check treats rows the way the import will: a merged row becomes part of the customer it matched, a row going to review becomes a pending registration - so the tabs before *Add new users* match the result.</w:t>
+      </w:r>
+    </w:p>
+    <w:p>
+      <w:pPr>
+        <w:pStyle w:val="ListParagraph"/>
+        <w:numPr>
+          <w:ilvl w:val="0"/>
+          <w:numId w:val="2"/>
+        </w:numPr>
+        <w:spacing w:after="40"/>
+      </w:pPr>
+      <w:r>
+        <w:rPr>
+          <w:rFonts w:ascii="Calibri" w:cs="Calibri" w:eastAsia="Calibri" w:hAnsi="Calibri"/>
+        </w:rPr>
         <w:t xml:space="preserve">Matching also compares against pending intakes, so two uncertain copies of one person cannot both slip through.</w:t>
       </w:r>
     </w:p>
@@ -7649,8 +8371,16 @@
       <w:r>
         <w:rPr>
           <w:rFonts w:ascii="Calibri" w:cs="Calibri" w:eastAsia="Calibri" w:hAnsi="Calibri"/>
-        </w:rPr>
-        <w:t xml:space="preserve">Merging two customers moves their accounts, contacts, products, cases and points to the survivor, records the move in </w:t>
+          <w:b/>
+          <w:bCs/>
+        </w:rPr>
+        <w:t xml:space="preserve">Merging keeps every phone.</w:t>
+      </w:r>
+      <w:r>
+        <w:rPr>
+          <w:rFonts w:ascii="Calibri" w:cs="Calibri" w:eastAsia="Calibri" w:hAnsi="Calibri"/>
+        </w:rPr>
+        <w:t xml:space="preserve"> A reviewed merge (*Merge into selected*) adds the incoming person's phones and missing details to the customer. Merging two existing customers moves their accounts, contacts (every phone and email; a value both had is kept once), products, cases and points to the survivor, re-proposes pending account assignments to the survivor, records the move in </w:t>
       </w:r>
       <w:r>
         <w:rPr>
@@ -8293,7 +9023,25 @@
                 <w:sz w:val="18"/>
                 <w:szCs w:val="18"/>
               </w:rPr>
-              <w:t xml:space="preserve">Becomes the Account PK of the e-shop identifier.</w:t>
+              <w:t xml:space="preserve">Becomes the Account PK of the e-shop identifier (the project with the </w:t>
+            </w:r>
+            <w:r>
+              <w:rPr>
+                <w:rFonts w:ascii="Calibri" w:cs="Calibri" w:eastAsia="Calibri" w:hAnsi="Calibri"/>
+                <w:b/>
+                <w:bCs/>
+                <w:sz w:val="18"/>
+                <w:szCs w:val="18"/>
+              </w:rPr>
+              <w:t xml:space="preserve">E-shop</w:t>
+            </w:r>
+            <w:r>
+              <w:rPr>
+                <w:rFonts w:ascii="Calibri" w:cs="Calibri" w:eastAsia="Calibri" w:hAnsi="Calibri"/>
+                <w:sz w:val="18"/>
+                <w:szCs w:val="18"/>
+              </w:rPr>
+              <w:t xml:space="preserve"> identity role).</w:t>
             </w:r>
           </w:p>
         </w:tc>
@@ -8489,7 +9237,25 @@
                 <w:sz w:val="18"/>
                 <w:szCs w:val="18"/>
               </w:rPr>
-              <w:t xml:space="preserve">The customer's user_pk in the user management system (the PLATFORM project). Becomes the Account PK of that identifier.</w:t>
+              <w:t xml:space="preserve">The customer's user_pk in the user management system (the project with the </w:t>
+            </w:r>
+            <w:r>
+              <w:rPr>
+                <w:rFonts w:ascii="Calibri" w:cs="Calibri" w:eastAsia="Calibri" w:hAnsi="Calibri"/>
+                <w:b/>
+                <w:bCs/>
+                <w:sz w:val="18"/>
+                <w:szCs w:val="18"/>
+              </w:rPr>
+              <w:t xml:space="preserve">User management</w:t>
+            </w:r>
+            <w:r>
+              <w:rPr>
+                <w:rFonts w:ascii="Calibri" w:cs="Calibri" w:eastAsia="Calibri" w:hAnsi="Calibri"/>
+                <w:sz w:val="18"/>
+                <w:szCs w:val="18"/>
+              </w:rPr>
+              <w:t xml:space="preserve"> identity role). Becomes the Account PK of that identifier.</w:t>
             </w:r>
           </w:p>
         </w:tc>
@@ -9325,7 +10091,7 @@
           <w:sz w:val="19"/>
           <w:szCs w:val="19"/>
         </w:rPr>
-        <w:t xml:space="preserve">npm run crm:api-key -- issue ESHOP "Eshop production"</w:t>
+        <w:t xml:space="preserve">npm run crm:api-key -- issue &lt;PROJECT_CODE&gt; "Eshop production"</w:t>
       </w:r>
       <w:r>
         <w:rPr>
@@ -10142,7 +10908,7 @@
         <w:rPr>
           <w:rFonts w:ascii="Calibri" w:cs="Calibri" w:eastAsia="Calibri" w:hAnsi="Calibri"/>
         </w:rPr>
-        <w:t xml:space="preserve">This is a pull integration: after a QUEUED registration is decided (or a customer is merged) the department reads the customer key from the feed, stores it and acknowledges. No webhook is sent. The e-shop uses the same rules; only legacy e-shop links read from vendor data go to the e-shop assignment queue.</w:t>
+        <w:t xml:space="preserve">This is a pull integration: after a QUEUED registration is decided (or a customer is merged) the department reads the customer key from the feed, stores it and acknowledges. No webhook is sent. The e-shop uses the same rules; only legacy e-shop links read from vendor data (on the project with the E-shop identity role) go to account assignment.</w:t>
       </w:r>
     </w:p>
     <w:p>
@@ -10375,7 +11141,25 @@
                 <w:sz w:val="18"/>
                 <w:szCs w:val="18"/>
               </w:rPr>
-              <w:t xml:space="preserve">Grade (section 12.3), lifetime spend, orders, products held, open cases.</w:t>
+              <w:t xml:space="preserve">Name, gender, birthday, address (shown once), </w:t>
+            </w:r>
+            <w:r>
+              <w:rPr>
+                <w:rFonts w:ascii="Calibri" w:cs="Calibri" w:eastAsia="Calibri" w:hAnsi="Calibri"/>
+                <w:b/>
+                <w:bCs/>
+                <w:sz w:val="18"/>
+                <w:szCs w:val="18"/>
+              </w:rPr>
+              <w:t xml:space="preserve">every phone and email</w:t>
+            </w:r>
+            <w:r>
+              <w:rPr>
+                <w:rFonts w:ascii="Calibri" w:cs="Calibri" w:eastAsia="Calibri" w:hAnsi="Calibri"/>
+                <w:sz w:val="18"/>
+                <w:szCs w:val="18"/>
+              </w:rPr>
+              <w:t xml:space="preserve">, grade (section 12.3), lifetime spend, orders, products held, open cases.</w:t>
             </w:r>
           </w:p>
         </w:tc>
@@ -10442,7 +11226,7 @@
                 <w:sz w:val="18"/>
                 <w:szCs w:val="18"/>
               </w:rPr>
-              <w:t xml:space="preserve">Value and RFM, service summary, contacts and consent, relationships, tags and segments, key cards with "View all".</w:t>
+              <w:t xml:space="preserve">Value and RFM, service summary, contact points (one line per phone and email), consent, relationships, tags and segments, key cards with "View all". Order, product and case rows open their details over the record.</w:t>
             </w:r>
           </w:p>
         </w:tc>
@@ -10643,7 +11427,7 @@
                 <w:sz w:val="18"/>
                 <w:szCs w:val="18"/>
               </w:rPr>
-              <w:t xml:space="preserve">Products held now and before, counts per class, transfers.</w:t>
+              <w:t xml:space="preserve">Products held now and before (search and filters; clicking one opens its details over the record), counts per class, transfers.</w:t>
             </w:r>
           </w:p>
         </w:tc>
@@ -10813,6 +11597,83 @@
                 <w:sz w:val="18"/>
                 <w:szCs w:val="18"/>
               </w:rPr>
+              <w:t xml:space="preserve">Consent tab</w:t>
+            </w:r>
+          </w:p>
+        </w:tc>
+        <w:tc>
+          <w:tcPr>
+            <w:tcW w:type="dxa" w:w="8032"/>
+            <w:tcBorders>
+              <w:top w:val="single" w:color="BFC5CE" w:sz="4"/>
+              <w:left w:val="single" w:color="BFC5CE" w:sz="4"/>
+              <w:bottom w:val="single" w:color="BFC5CE" w:sz="4"/>
+              <w:right w:val="single" w:color="BFC5CE" w:sz="4"/>
+            </w:tcBorders>
+            <w:tcMar>
+              <w:top w:type="dxa" w:w="40"/>
+              <w:left w:type="dxa" w:w="80"/>
+              <w:bottom w:type="dxa" w:w="40"/>
+              <w:right w:type="dxa" w:w="80"/>
+            </w:tcMar>
+          </w:tcPr>
+          <w:p>
+            <w:pPr>
+              <w:spacing w:after="0" w:before="0"/>
+              <w:jc w:val="left"/>
+            </w:pPr>
+            <w:r>
+              <w:rPr>
+                <w:rFonts w:ascii="Calibri" w:cs="Calibri" w:eastAsia="Calibri" w:hAnsi="Calibri"/>
+                <w:b/>
+                <w:bCs/>
+                <w:sz w:val="18"/>
+                <w:szCs w:val="18"/>
+              </w:rPr>
+              <w:t xml:space="preserve">Contact points</w:t>
+            </w:r>
+            <w:r>
+              <w:rPr>
+                <w:rFonts w:ascii="Calibri" w:cs="Calibri" w:eastAsia="Calibri" w:hAnsi="Calibri"/>
+                <w:sz w:val="18"/>
+                <w:szCs w:val="18"/>
+              </w:rPr>
+              <w:t xml:space="preserve">: every phone, email and other contact with type, primary, verified, status and date added (*Add* for another); channel consent at a glance; consent per project, purpose and channel.</w:t>
+            </w:r>
+          </w:p>
+        </w:tc>
+      </w:tr>
+      <w:tr>
+        <w:trPr>
+          <w:cantSplit/>
+        </w:trPr>
+        <w:tc>
+          <w:tcPr>
+            <w:tcW w:type="dxa" w:w="1606"/>
+            <w:tcBorders>
+              <w:top w:val="single" w:color="BFC5CE" w:sz="4"/>
+              <w:left w:val="single" w:color="BFC5CE" w:sz="4"/>
+              <w:bottom w:val="single" w:color="BFC5CE" w:sz="4"/>
+              <w:right w:val="single" w:color="BFC5CE" w:sz="4"/>
+            </w:tcBorders>
+            <w:tcMar>
+              <w:top w:type="dxa" w:w="40"/>
+              <w:left w:type="dxa" w:w="80"/>
+              <w:bottom w:type="dxa" w:w="40"/>
+              <w:right w:type="dxa" w:w="80"/>
+            </w:tcMar>
+          </w:tcPr>
+          <w:p>
+            <w:pPr>
+              <w:spacing w:after="0" w:before="0"/>
+              <w:jc w:val="left"/>
+            </w:pPr>
+            <w:r>
+              <w:rPr>
+                <w:rFonts w:ascii="Calibri" w:cs="Calibri" w:eastAsia="Calibri" w:hAnsi="Calibri"/>
+                <w:sz w:val="18"/>
+                <w:szCs w:val="18"/>
+              </w:rPr>
               <w:t xml:space="preserve">Notes and files</w:t>
             </w:r>
           </w:p>
@@ -10844,7 +11705,7 @@
                 <w:sz w:val="18"/>
                 <w:szCs w:val="18"/>
               </w:rPr>
-              <w:t xml:space="preserve">Notes (one can be pinned) and files, stored in a private folder and only downloadable through the CRM.</w:t>
+              <w:t xml:space="preserve">Notes (one can be pinned) and files, stored in a private folder and only downloadable through the CRM. *Recent activity* (orders, refunds, cases, registrations, visits, tier changes, entries) scrolls in a fixed height; an order, case or product in it opens over the record.</w:t>
             </w:r>
           </w:p>
         </w:tc>
@@ -16422,7 +17283,21 @@
         <w:rPr>
           <w:rFonts w:ascii="Calibri" w:cs="Calibri" w:eastAsia="Calibri" w:hAnsi="Calibri"/>
         </w:rPr>
-        <w:t xml:space="preserve"> edits the basic lists: projects, currencies, product classes, project tiers, point types and point event types, service center activity types, case types, service statuses and the status map, priorities, issue, fault, root-cause and resolution categories, corporate grades, relationship types, purchase purposes, usage and acquisition types, registration questions, channels, communication purposes and options, organization types, contact roles, industries, tags, job titles, locations (refreshed from the vendor), metric definitions and departments.</w:t>
+        <w:t xml:space="preserve"> edits the basic lists: projects, currencies, product classes, project tiers, point types and point event types, service center activity types, case types, service statuses and the status map, priorities, issue, fault, root-cause and resolution categories, corporate grades, ways to hold a product, relationships between customers, purchase purposes, usage and acquisition types, registration questions, channels, communication purposes and options, organization types, contact roles, industries, tags, job titles, </w:t>
+      </w:r>
+      <w:r>
+        <w:rPr>
+          <w:rFonts w:ascii="Calibri" w:cs="Calibri" w:eastAsia="Calibri" w:hAnsi="Calibri"/>
+          <w:b/>
+          <w:bCs/>
+        </w:rPr>
+        <w:t xml:space="preserve">locations</w:t>
+      </w:r>
+      <w:r>
+        <w:rPr>
+          <w:rFonts w:ascii="Calibri" w:cs="Calibri" w:eastAsia="Calibri" w:hAnsi="Calibri"/>
+        </w:rPr>
+        <w:t xml:space="preserve"> (*Refresh from vendor* copies the vendor's list again: new ones added, changed ones updated, none removed), metric definitions and departments.</w:t>
       </w:r>
     </w:p>
     <w:tbl>
@@ -16728,34 +17603,16 @@
       <w:r>
         <w:rPr>
           <w:rFonts w:ascii="Calibri" w:cs="Calibri" w:eastAsia="Calibri" w:hAnsi="Calibri"/>
-        </w:rPr>
-        <w:t xml:space="preserve">Departments (</w:t>
-      </w:r>
-      <w:r>
-        <w:rPr>
-          <w:rFonts w:ascii="Consolas" w:cs="Consolas" w:eastAsia="Consolas" w:hAnsi="Consolas"/>
-          <w:sz w:val="19"/>
-          <w:szCs w:val="19"/>
-        </w:rPr>
-        <w:t xml:space="preserve">crm_department</w:t>
-      </w:r>
-      <w:r>
-        <w:rPr>
-          <w:rFonts w:ascii="Calibri" w:cs="Calibri" w:eastAsia="Calibri" w:hAnsi="Calibri"/>
-        </w:rPr>
-        <w:t xml:space="preserve">) describe the internal organization: each manager belongs to one, and a role can be reserved for a department. Permissions themselves always come from roles.</w:t>
-      </w:r>
-    </w:p>
-    <w:p>
-      <w:pPr>
-        <w:pStyle w:val="Heading2"/>
-        <w:keepNext/>
-      </w:pPr>
-      <w:r>
-        <w:rPr>
-          <w:rFonts w:ascii="Calibri" w:cs="Calibri" w:eastAsia="Calibri" w:hAnsi="Calibri"/>
-        </w:rPr>
-        <w:t xml:space="preserve">15. Testing, verification and documentation</w:t>
+          <w:b/>
+          <w:bCs/>
+        </w:rPr>
+        <w:t xml:space="preserve">Starting from an empty CRM</w:t>
+      </w:r>
+      <w:r>
+        <w:rPr>
+          <w:rFonts w:ascii="Calibri" w:cs="Calibri" w:eastAsia="Calibri" w:hAnsi="Calibri"/>
+        </w:rPr>
+        <w:t xml:space="preserve">, enter the basic data first. Codes are free except these, which the program looks up:</w:t>
       </w:r>
     </w:p>
     <w:tbl>
@@ -16771,9 +17628,8 @@
         </w:tblBorders>
       </w:tblPr>
       <w:tblGrid>
-        <w:gridCol w:w="2462"/>
-        <w:gridCol w:w="5567"/>
-        <w:gridCol w:w="1609"/>
+        <w:gridCol w:w="2344"/>
+        <w:gridCol w:w="7294"/>
       </w:tblGrid>
       <w:tr>
         <w:trPr>
@@ -16781,7 +17637,7 @@
         </w:trPr>
         <w:tc>
           <w:tcPr>
-            <w:tcW w:type="dxa" w:w="2462"/>
+            <w:tcW w:type="dxa" w:w="2344"/>
             <w:tcBorders>
               <w:top w:val="single" w:color="BFC5CE" w:sz="4"/>
               <w:left w:val="single" w:color="BFC5CE" w:sz="4"/>
@@ -16809,13 +17665,13 @@
                 <w:sz w:val="18"/>
                 <w:szCs w:val="18"/>
               </w:rPr>
-              <w:t xml:space="preserve">Command</w:t>
-            </w:r>
-          </w:p>
-        </w:tc>
-        <w:tc>
-          <w:tcPr>
-            <w:tcW w:type="dxa" w:w="5567"/>
+              <w:t xml:space="preserve">List</w:t>
+            </w:r>
+          </w:p>
+        </w:tc>
+        <w:tc>
+          <w:tcPr>
+            <w:tcW w:type="dxa" w:w="7294"/>
             <w:tcBorders>
               <w:top w:val="single" w:color="BFC5CE" w:sz="4"/>
               <w:left w:val="single" w:color="BFC5CE" w:sz="4"/>
@@ -16843,41 +17699,7 @@
                 <w:sz w:val="18"/>
                 <w:szCs w:val="18"/>
               </w:rPr>
-              <w:t xml:space="preserve">What it does</w:t>
-            </w:r>
-          </w:p>
-        </w:tc>
-        <w:tc>
-          <w:tcPr>
-            <w:tcW w:type="dxa" w:w="1609"/>
-            <w:tcBorders>
-              <w:top w:val="single" w:color="BFC5CE" w:sz="4"/>
-              <w:left w:val="single" w:color="BFC5CE" w:sz="4"/>
-              <w:bottom w:val="single" w:color="BFC5CE" w:sz="4"/>
-              <w:right w:val="single" w:color="BFC5CE" w:sz="4"/>
-            </w:tcBorders>
-            <w:shd w:fill="E8ECF2" w:color="auto" w:val="clear"/>
-            <w:tcMar>
-              <w:top w:type="dxa" w:w="40"/>
-              <w:left w:type="dxa" w:w="80"/>
-              <w:bottom w:type="dxa" w:w="40"/>
-              <w:right w:type="dxa" w:w="80"/>
-            </w:tcMar>
-          </w:tcPr>
-          <w:p>
-            <w:pPr>
-              <w:spacing w:after="0" w:before="0"/>
-              <w:jc w:val="left"/>
-            </w:pPr>
-            <w:r>
-              <w:rPr>
-                <w:rFonts w:ascii="Calibri" w:cs="Calibri" w:eastAsia="Calibri" w:hAnsi="Calibri"/>
-                <w:b/>
-                <w:bCs/>
-                <w:sz w:val="18"/>
-                <w:szCs w:val="18"/>
-              </w:rPr>
-              <w:t xml:space="preserve">Needs</w:t>
+              <w:t xml:space="preserve">Codes the program uses</w:t>
             </w:r>
           </w:p>
         </w:tc>
@@ -16888,94 +17710,115 @@
         </w:trPr>
         <w:tc>
           <w:tcPr>
-            <w:tcW w:type="dxa" w:w="2462"/>
-            <w:tcBorders>
-              <w:top w:val="single" w:color="BFC5CE" w:sz="4"/>
-              <w:left w:val="single" w:color="BFC5CE" w:sz="4"/>
-              <w:bottom w:val="single" w:color="BFC5CE" w:sz="4"/>
-              <w:right w:val="single" w:color="BFC5CE" w:sz="4"/>
-            </w:tcBorders>
-            <w:tcMar>
-              <w:top w:type="dxa" w:w="40"/>
-              <w:left w:type="dxa" w:w="80"/>
-              <w:bottom w:type="dxa" w:w="40"/>
-              <w:right w:type="dxa" w:w="80"/>
-            </w:tcMar>
-          </w:tcPr>
-          <w:p>
-            <w:pPr>
-              <w:spacing w:after="0" w:before="0"/>
-              <w:jc w:val="left"/>
-            </w:pPr>
+            <w:tcW w:type="dxa" w:w="2344"/>
+            <w:tcBorders>
+              <w:top w:val="single" w:color="BFC5CE" w:sz="4"/>
+              <w:left w:val="single" w:color="BFC5CE" w:sz="4"/>
+              <w:bottom w:val="single" w:color="BFC5CE" w:sz="4"/>
+              <w:right w:val="single" w:color="BFC5CE" w:sz="4"/>
+            </w:tcBorders>
+            <w:tcMar>
+              <w:top w:type="dxa" w:w="40"/>
+              <w:left w:type="dxa" w:w="80"/>
+              <w:bottom w:type="dxa" w:w="40"/>
+              <w:right w:type="dxa" w:w="80"/>
+            </w:tcMar>
+          </w:tcPr>
+          <w:p>
+            <w:pPr>
+              <w:spacing w:after="0" w:before="0"/>
+              <w:jc w:val="left"/>
+            </w:pPr>
+            <w:r>
+              <w:rPr>
+                <w:rFonts w:ascii="Calibri" w:cs="Calibri" w:eastAsia="Calibri" w:hAnsi="Calibri"/>
+                <w:sz w:val="18"/>
+                <w:szCs w:val="18"/>
+              </w:rPr>
+              <w:t xml:space="preserve">Projects</w:t>
+            </w:r>
+          </w:p>
+        </w:tc>
+        <w:tc>
+          <w:tcPr>
+            <w:tcW w:type="dxa" w:w="7294"/>
+            <w:tcBorders>
+              <w:top w:val="single" w:color="BFC5CE" w:sz="4"/>
+              <w:left w:val="single" w:color="BFC5CE" w:sz="4"/>
+              <w:bottom w:val="single" w:color="BFC5CE" w:sz="4"/>
+              <w:right w:val="single" w:color="BFC5CE" w:sz="4"/>
+            </w:tcBorders>
+            <w:tcMar>
+              <w:top w:type="dxa" w:w="40"/>
+              <w:left w:type="dxa" w:w="80"/>
+              <w:bottom w:type="dxa" w:w="40"/>
+              <w:right w:type="dxa" w:w="80"/>
+            </w:tcMar>
+          </w:tcPr>
+          <w:p>
+            <w:pPr>
+              <w:spacing w:after="0" w:before="0"/>
+              <w:jc w:val="left"/>
+            </w:pPr>
+            <w:r>
+              <w:rPr>
+                <w:rFonts w:ascii="Calibri" w:cs="Calibri" w:eastAsia="Calibri" w:hAnsi="Calibri"/>
+                <w:sz w:val="18"/>
+                <w:szCs w:val="18"/>
+              </w:rPr>
+              <w:t xml:space="preserve">Identity roles </w:t>
+            </w:r>
+            <w:r>
+              <w:rPr>
+                <w:rFonts w:ascii="Calibri" w:cs="Calibri" w:eastAsia="Calibri" w:hAnsi="Calibri"/>
+                <w:b/>
+                <w:bCs/>
+                <w:sz w:val="18"/>
+                <w:szCs w:val="18"/>
+              </w:rPr>
+              <w:t xml:space="preserve">E-shop</w:t>
+            </w:r>
+            <w:r>
+              <w:rPr>
+                <w:rFonts w:ascii="Calibri" w:cs="Calibri" w:eastAsia="Calibri" w:hAnsi="Calibri"/>
+                <w:sz w:val="18"/>
+                <w:szCs w:val="18"/>
+              </w:rPr>
+              <w:t xml:space="preserve"> and </w:t>
+            </w:r>
+            <w:r>
+              <w:rPr>
+                <w:rFonts w:ascii="Calibri" w:cs="Calibri" w:eastAsia="Calibri" w:hAnsi="Calibri"/>
+                <w:b/>
+                <w:bCs/>
+                <w:sz w:val="18"/>
+                <w:szCs w:val="18"/>
+              </w:rPr>
+              <w:t xml:space="preserve">User management</w:t>
+            </w:r>
+            <w:r>
+              <w:rPr>
+                <w:rFonts w:ascii="Calibri" w:cs="Calibri" w:eastAsia="Calibri" w:hAnsi="Calibri"/>
+                <w:sz w:val="18"/>
+                <w:szCs w:val="18"/>
+              </w:rPr>
+              <w:t xml:space="preserve"> on two projects (needed by the Excel import); </w:t>
+            </w:r>
             <w:r>
               <w:rPr>
                 <w:rFonts w:ascii="Consolas" w:cs="Consolas" w:eastAsia="Consolas" w:hAnsi="Consolas"/>
                 <w:sz w:val="17"/>
                 <w:szCs w:val="17"/>
               </w:rPr>
-              <w:t xml:space="preserve">npm run test:identity</w:t>
-            </w:r>
-          </w:p>
-        </w:tc>
-        <w:tc>
-          <w:tcPr>
-            <w:tcW w:type="dxa" w:w="5567"/>
-            <w:tcBorders>
-              <w:top w:val="single" w:color="BFC5CE" w:sz="4"/>
-              <w:left w:val="single" w:color="BFC5CE" w:sz="4"/>
-              <w:bottom w:val="single" w:color="BFC5CE" w:sz="4"/>
-              <w:right w:val="single" w:color="BFC5CE" w:sz="4"/>
-            </w:tcBorders>
-            <w:tcMar>
-              <w:top w:type="dxa" w:w="40"/>
-              <w:left w:type="dxa" w:w="80"/>
-              <w:bottom w:type="dxa" w:w="40"/>
-              <w:right w:type="dxa" w:w="80"/>
-            </w:tcMar>
-          </w:tcPr>
-          <w:p>
-            <w:pPr>
-              <w:spacing w:after="0" w:before="0"/>
-              <w:jc w:val="left"/>
-            </w:pPr>
-            <w:r>
-              <w:rPr>
-                <w:rFonts w:ascii="Calibri" w:cs="Calibri" w:eastAsia="Calibri" w:hAnsi="Calibri"/>
-                <w:sz w:val="18"/>
-                <w:szCs w:val="18"/>
-              </w:rPr>
-              <w:t xml:space="preserve">Matching scores, intake/merge/review workflow, Excel parsing and import, e-shop staging, department API rules (in memory).</w:t>
-            </w:r>
-          </w:p>
-        </w:tc>
-        <w:tc>
-          <w:tcPr>
-            <w:tcW w:type="dxa" w:w="1609"/>
-            <w:tcBorders>
-              <w:top w:val="single" w:color="BFC5CE" w:sz="4"/>
-              <w:left w:val="single" w:color="BFC5CE" w:sz="4"/>
-              <w:bottom w:val="single" w:color="BFC5CE" w:sz="4"/>
-              <w:right w:val="single" w:color="BFC5CE" w:sz="4"/>
-            </w:tcBorders>
-            <w:tcMar>
-              <w:top w:type="dxa" w:w="40"/>
-              <w:left w:type="dxa" w:w="80"/>
-              <w:bottom w:type="dxa" w:w="40"/>
-              <w:right w:type="dxa" w:w="80"/>
-            </w:tcMar>
-          </w:tcPr>
-          <w:p>
-            <w:pPr>
-              <w:spacing w:after="0" w:before="0"/>
-              <w:jc w:val="left"/>
-            </w:pPr>
-            <w:r>
-              <w:rPr>
-                <w:rFonts w:ascii="Calibri" w:cs="Calibri" w:eastAsia="Calibri" w:hAnsi="Calibri"/>
-                <w:sz w:val="18"/>
-                <w:szCs w:val="18"/>
-              </w:rPr>
-              <w:t xml:space="preserve">nothing</w:t>
+              <w:t xml:space="preserve">CRYSTAL</w:t>
+            </w:r>
+            <w:r>
+              <w:rPr>
+                <w:rFonts w:ascii="Calibri" w:cs="Calibri" w:eastAsia="Calibri" w:hAnsi="Calibri"/>
+                <w:sz w:val="18"/>
+                <w:szCs w:val="18"/>
+              </w:rPr>
+              <w:t xml:space="preserve"> only for the Crystal import</w:t>
             </w:r>
           </w:p>
         </w:tc>
@@ -16986,7 +17829,38 @@
         </w:trPr>
         <w:tc>
           <w:tcPr>
-            <w:tcW w:type="dxa" w:w="2462"/>
+            <w:tcW w:type="dxa" w:w="2344"/>
+            <w:tcBorders>
+              <w:top w:val="single" w:color="BFC5CE" w:sz="4"/>
+              <w:left w:val="single" w:color="BFC5CE" w:sz="4"/>
+              <w:bottom w:val="single" w:color="BFC5CE" w:sz="4"/>
+              <w:right w:val="single" w:color="BFC5CE" w:sz="4"/>
+            </w:tcBorders>
+            <w:tcMar>
+              <w:top w:type="dxa" w:w="40"/>
+              <w:left w:type="dxa" w:w="80"/>
+              <w:bottom w:type="dxa" w:w="40"/>
+              <w:right w:type="dxa" w:w="80"/>
+            </w:tcMar>
+          </w:tcPr>
+          <w:p>
+            <w:pPr>
+              <w:spacing w:after="0" w:before="0"/>
+              <w:jc w:val="left"/>
+            </w:pPr>
+            <w:r>
+              <w:rPr>
+                <w:rFonts w:ascii="Calibri" w:cs="Calibri" w:eastAsia="Calibri" w:hAnsi="Calibri"/>
+                <w:sz w:val="18"/>
+                <w:szCs w:val="18"/>
+              </w:rPr>
+              <w:t xml:space="preserve">Currencies</w:t>
+            </w:r>
+          </w:p>
+        </w:tc>
+        <w:tc>
+          <w:tcPr>
+            <w:tcW w:type="dxa" w:w="7294"/>
             <w:tcBorders>
               <w:top w:val="single" w:color="BFC5CE" w:sz="4"/>
               <w:left w:val="single" w:color="BFC5CE" w:sz="4"/>
@@ -17011,69 +17885,15 @@
                 <w:sz w:val="17"/>
                 <w:szCs w:val="17"/>
               </w:rPr>
-              <w:t xml:space="preserve">node scripts/check-crm.js &lt;url&gt;</w:t>
-            </w:r>
-          </w:p>
-        </w:tc>
-        <w:tc>
-          <w:tcPr>
-            <w:tcW w:type="dxa" w:w="5567"/>
-            <w:tcBorders>
-              <w:top w:val="single" w:color="BFC5CE" w:sz="4"/>
-              <w:left w:val="single" w:color="BFC5CE" w:sz="4"/>
-              <w:bottom w:val="single" w:color="BFC5CE" w:sz="4"/>
-              <w:right w:val="single" w:color="BFC5CE" w:sz="4"/>
-            </w:tcBorders>
-            <w:tcMar>
-              <w:top w:type="dxa" w:w="40"/>
-              <w:left w:type="dxa" w:w="80"/>
-              <w:bottom w:type="dxa" w:w="40"/>
-              <w:right w:type="dxa" w:w="80"/>
-            </w:tcMar>
-          </w:tcPr>
-          <w:p>
-            <w:pPr>
-              <w:spacing w:after="0" w:before="0"/>
-              <w:jc w:val="left"/>
-            </w:pPr>
-            <w:r>
-              <w:rPr>
-                <w:rFonts w:ascii="Calibri" w:cs="Calibri" w:eastAsia="Calibri" w:hAnsi="Calibri"/>
-                <w:sz w:val="18"/>
-                <w:szCs w:val="18"/>
-              </w:rPr>
-              <w:t xml:space="preserve">End-to-end checks through the console API: permissions, customers, Excel import and e-shop staging, products and transfers, points, events, segments, campaigns, sites.</w:t>
-            </w:r>
-          </w:p>
-        </w:tc>
-        <w:tc>
-          <w:tcPr>
-            <w:tcW w:type="dxa" w:w="1609"/>
-            <w:tcBorders>
-              <w:top w:val="single" w:color="BFC5CE" w:sz="4"/>
-              <w:left w:val="single" w:color="BFC5CE" w:sz="4"/>
-              <w:bottom w:val="single" w:color="BFC5CE" w:sz="4"/>
-              <w:right w:val="single" w:color="BFC5CE" w:sz="4"/>
-            </w:tcBorders>
-            <w:tcMar>
-              <w:top w:type="dxa" w:w="40"/>
-              <w:left w:type="dxa" w:w="80"/>
-              <w:bottom w:type="dxa" w:w="40"/>
-              <w:right w:type="dxa" w:w="80"/>
-            </w:tcMar>
-          </w:tcPr>
-          <w:p>
-            <w:pPr>
-              <w:spacing w:after="0" w:before="0"/>
-              <w:jc w:val="left"/>
-            </w:pPr>
-            <w:r>
-              <w:rPr>
-                <w:rFonts w:ascii="Calibri" w:cs="Calibri" w:eastAsia="Calibri" w:hAnsi="Calibri"/>
-                <w:sz w:val="18"/>
-                <w:szCs w:val="18"/>
-              </w:rPr>
-              <w:t xml:space="preserve">running API on a dev database</w:t>
+              <w:t xml:space="preserve">USD</w:t>
+            </w:r>
+            <w:r>
+              <w:rPr>
+                <w:rFonts w:ascii="Calibri" w:cs="Calibri" w:eastAsia="Calibri" w:hAnsi="Calibri"/>
+                <w:sz w:val="18"/>
+                <w:szCs w:val="18"/>
+              </w:rPr>
+              <w:t xml:space="preserve">, one currency marked as the reporting currency</w:t>
             </w:r>
           </w:p>
         </w:tc>
@@ -17084,7 +17904,38 @@
         </w:trPr>
         <w:tc>
           <w:tcPr>
-            <w:tcW w:type="dxa" w:w="2462"/>
+            <w:tcW w:type="dxa" w:w="2344"/>
+            <w:tcBorders>
+              <w:top w:val="single" w:color="BFC5CE" w:sz="4"/>
+              <w:left w:val="single" w:color="BFC5CE" w:sz="4"/>
+              <w:bottom w:val="single" w:color="BFC5CE" w:sz="4"/>
+              <w:right w:val="single" w:color="BFC5CE" w:sz="4"/>
+            </w:tcBorders>
+            <w:tcMar>
+              <w:top w:type="dxa" w:w="40"/>
+              <w:left w:type="dxa" w:w="80"/>
+              <w:bottom w:type="dxa" w:w="40"/>
+              <w:right w:type="dxa" w:w="80"/>
+            </w:tcMar>
+          </w:tcPr>
+          <w:p>
+            <w:pPr>
+              <w:spacing w:after="0" w:before="0"/>
+              <w:jc w:val="left"/>
+            </w:pPr>
+            <w:r>
+              <w:rPr>
+                <w:rFonts w:ascii="Calibri" w:cs="Calibri" w:eastAsia="Calibri" w:hAnsi="Calibri"/>
+                <w:sz w:val="18"/>
+                <w:szCs w:val="18"/>
+              </w:rPr>
+              <w:t xml:space="preserve">Point types / point event types</w:t>
+            </w:r>
+          </w:p>
+        </w:tc>
+        <w:tc>
+          <w:tcPr>
+            <w:tcW w:type="dxa" w:w="7294"/>
             <w:tcBorders>
               <w:top w:val="single" w:color="BFC5CE" w:sz="4"/>
               <w:left w:val="single" w:color="BFC5CE" w:sz="4"/>
@@ -17109,69 +17960,135 @@
                 <w:sz w:val="17"/>
                 <w:szCs w:val="17"/>
               </w:rPr>
-              <w:t xml:space="preserve">PG_SCHEMA=&lt;schema&gt; node scripts/check-crm-integration.js &lt;url&gt;</w:t>
-            </w:r>
-          </w:p>
-        </w:tc>
-        <w:tc>
-          <w:tcPr>
-            <w:tcW w:type="dxa" w:w="5567"/>
-            <w:tcBorders>
-              <w:top w:val="single" w:color="BFC5CE" w:sz="4"/>
-              <w:left w:val="single" w:color="BFC5CE" w:sz="4"/>
-              <w:bottom w:val="single" w:color="BFC5CE" w:sz="4"/>
-              <w:right w:val="single" w:color="BFC5CE" w:sz="4"/>
-            </w:tcBorders>
-            <w:tcMar>
-              <w:top w:type="dxa" w:w="40"/>
-              <w:left w:type="dxa" w:w="80"/>
-              <w:bottom w:type="dxa" w:w="40"/>
-              <w:right w:type="dxa" w:w="80"/>
-            </w:tcMar>
-          </w:tcPr>
-          <w:p>
-            <w:pPr>
-              <w:spacing w:after="0" w:before="0"/>
-              <w:jc w:val="left"/>
-            </w:pPr>
-            <w:r>
-              <w:rPr>
-                <w:rFonts w:ascii="Calibri" w:cs="Calibri" w:eastAsia="Calibri" w:hAnsi="Calibri"/>
-                <w:sz w:val="18"/>
-                <w:szCs w:val="18"/>
-              </w:rPr>
-              <w:t xml:space="preserve">Department API (keys, CREATED/MERGED/EXISTING/QUEUED, feed, acknowledge, validation, e-shop) and project editing rules.</w:t>
-            </w:r>
-          </w:p>
-        </w:tc>
-        <w:tc>
-          <w:tcPr>
-            <w:tcW w:type="dxa" w:w="1609"/>
-            <w:tcBorders>
-              <w:top w:val="single" w:color="BFC5CE" w:sz="4"/>
-              <w:left w:val="single" w:color="BFC5CE" w:sz="4"/>
-              <w:bottom w:val="single" w:color="BFC5CE" w:sz="4"/>
-              <w:right w:val="single" w:color="BFC5CE" w:sz="4"/>
-            </w:tcBorders>
-            <w:tcMar>
-              <w:top w:type="dxa" w:w="40"/>
-              <w:left w:type="dxa" w:w="80"/>
-              <w:bottom w:type="dxa" w:w="40"/>
-              <w:right w:type="dxa" w:w="80"/>
-            </w:tcMar>
-          </w:tcPr>
-          <w:p>
-            <w:pPr>
-              <w:spacing w:after="0" w:before="0"/>
-              <w:jc w:val="left"/>
-            </w:pPr>
-            <w:r>
-              <w:rPr>
-                <w:rFonts w:ascii="Calibri" w:cs="Calibri" w:eastAsia="Calibri" w:hAnsi="Calibri"/>
-                <w:sz w:val="18"/>
-                <w:szCs w:val="18"/>
-              </w:rPr>
-              <w:t xml:space="preserve">running API on a dev database</w:t>
+              <w:t xml:space="preserve">CRYSTAL</w:t>
+            </w:r>
+            <w:r>
+              <w:rPr>
+                <w:rFonts w:ascii="Calibri" w:cs="Calibri" w:eastAsia="Calibri" w:hAnsi="Calibri"/>
+                <w:sz w:val="18"/>
+                <w:szCs w:val="18"/>
+              </w:rPr>
+              <w:t xml:space="preserve"> / </w:t>
+            </w:r>
+            <w:r>
+              <w:rPr>
+                <w:rFonts w:ascii="Consolas" w:cs="Consolas" w:eastAsia="Consolas" w:hAnsi="Consolas"/>
+                <w:sz w:val="17"/>
+                <w:szCs w:val="17"/>
+              </w:rPr>
+              <w:t xml:space="preserve">EARN</w:t>
+            </w:r>
+            <w:r>
+              <w:rPr>
+                <w:rFonts w:ascii="Calibri" w:cs="Calibri" w:eastAsia="Calibri" w:hAnsi="Calibri"/>
+                <w:sz w:val="18"/>
+                <w:szCs w:val="18"/>
+              </w:rPr>
+              <w:t xml:space="preserve">, </w:t>
+            </w:r>
+            <w:r>
+              <w:rPr>
+                <w:rFonts w:ascii="Consolas" w:cs="Consolas" w:eastAsia="Consolas" w:hAnsi="Consolas"/>
+                <w:sz w:val="17"/>
+                <w:szCs w:val="17"/>
+              </w:rPr>
+              <w:t xml:space="preserve">REDEEM</w:t>
+            </w:r>
+            <w:r>
+              <w:rPr>
+                <w:rFonts w:ascii="Calibri" w:cs="Calibri" w:eastAsia="Calibri" w:hAnsi="Calibri"/>
+                <w:sz w:val="18"/>
+                <w:szCs w:val="18"/>
+              </w:rPr>
+              <w:t xml:space="preserve">, </w:t>
+            </w:r>
+            <w:r>
+              <w:rPr>
+                <w:rFonts w:ascii="Consolas" w:cs="Consolas" w:eastAsia="Consolas" w:hAnsi="Consolas"/>
+                <w:sz w:val="17"/>
+                <w:szCs w:val="17"/>
+              </w:rPr>
+              <w:t xml:space="preserve">EXPIRE</w:t>
+            </w:r>
+            <w:r>
+              <w:rPr>
+                <w:rFonts w:ascii="Calibri" w:cs="Calibri" w:eastAsia="Calibri" w:hAnsi="Calibri"/>
+                <w:sz w:val="18"/>
+                <w:szCs w:val="18"/>
+              </w:rPr>
+              <w:t xml:space="preserve">, </w:t>
+            </w:r>
+            <w:r>
+              <w:rPr>
+                <w:rFonts w:ascii="Consolas" w:cs="Consolas" w:eastAsia="Consolas" w:hAnsi="Consolas"/>
+                <w:sz w:val="17"/>
+                <w:szCs w:val="17"/>
+              </w:rPr>
+              <w:t xml:space="preserve">ADJUST</w:t>
+            </w:r>
+            <w:r>
+              <w:rPr>
+                <w:rFonts w:ascii="Calibri" w:cs="Calibri" w:eastAsia="Calibri" w:hAnsi="Calibri"/>
+                <w:sz w:val="18"/>
+                <w:szCs w:val="18"/>
+              </w:rPr>
+              <w:t xml:space="preserve">, </w:t>
+            </w:r>
+            <w:r>
+              <w:rPr>
+                <w:rFonts w:ascii="Consolas" w:cs="Consolas" w:eastAsia="Consolas" w:hAnsi="Consolas"/>
+                <w:sz w:val="17"/>
+                <w:szCs w:val="17"/>
+              </w:rPr>
+              <w:t xml:space="preserve">REFUND</w:t>
+            </w:r>
+            <w:r>
+              <w:rPr>
+                <w:rFonts w:ascii="Calibri" w:cs="Calibri" w:eastAsia="Calibri" w:hAnsi="Calibri"/>
+                <w:sz w:val="18"/>
+                <w:szCs w:val="18"/>
+              </w:rPr>
+              <w:t xml:space="preserve">, </w:t>
+            </w:r>
+            <w:r>
+              <w:rPr>
+                <w:rFonts w:ascii="Consolas" w:cs="Consolas" w:eastAsia="Consolas" w:hAnsi="Consolas"/>
+                <w:sz w:val="17"/>
+                <w:szCs w:val="17"/>
+              </w:rPr>
+              <w:t xml:space="preserve">RESERVATION_COST</w:t>
+            </w:r>
+            <w:r>
+              <w:rPr>
+                <w:rFonts w:ascii="Calibri" w:cs="Calibri" w:eastAsia="Calibri" w:hAnsi="Calibri"/>
+                <w:sz w:val="18"/>
+                <w:szCs w:val="18"/>
+              </w:rPr>
+              <w:t xml:space="preserve">, </w:t>
+            </w:r>
+            <w:r>
+              <w:rPr>
+                <w:rFonts w:ascii="Consolas" w:cs="Consolas" w:eastAsia="Consolas" w:hAnsi="Consolas"/>
+                <w:sz w:val="17"/>
+                <w:szCs w:val="17"/>
+              </w:rPr>
+              <w:t xml:space="preserve">EVENT_AWARD</w:t>
+            </w:r>
+            <w:r>
+              <w:rPr>
+                <w:rFonts w:ascii="Calibri" w:cs="Calibri" w:eastAsia="Calibri" w:hAnsi="Calibri"/>
+                <w:sz w:val="18"/>
+                <w:szCs w:val="18"/>
+              </w:rPr>
+              <w:t xml:space="preserve">, </w:t>
+            </w:r>
+            <w:r>
+              <w:rPr>
+                <w:rFonts w:ascii="Consolas" w:cs="Consolas" w:eastAsia="Consolas" w:hAnsi="Consolas"/>
+                <w:sz w:val="17"/>
+                <w:szCs w:val="17"/>
+              </w:rPr>
+              <w:t xml:space="preserve">MERGE_CARRY_OVER</w:t>
             </w:r>
           </w:p>
         </w:tc>
@@ -17182,7 +18099,38 @@
         </w:trPr>
         <w:tc>
           <w:tcPr>
-            <w:tcW w:type="dxa" w:w="2462"/>
+            <w:tcW w:type="dxa" w:w="2344"/>
+            <w:tcBorders>
+              <w:top w:val="single" w:color="BFC5CE" w:sz="4"/>
+              <w:left w:val="single" w:color="BFC5CE" w:sz="4"/>
+              <w:bottom w:val="single" w:color="BFC5CE" w:sz="4"/>
+              <w:right w:val="single" w:color="BFC5CE" w:sz="4"/>
+            </w:tcBorders>
+            <w:tcMar>
+              <w:top w:type="dxa" w:w="40"/>
+              <w:left w:type="dxa" w:w="80"/>
+              <w:bottom w:type="dxa" w:w="40"/>
+              <w:right w:type="dxa" w:w="80"/>
+            </w:tcMar>
+          </w:tcPr>
+          <w:p>
+            <w:pPr>
+              <w:spacing w:after="0" w:before="0"/>
+              <w:jc w:val="left"/>
+            </w:pPr>
+            <w:r>
+              <w:rPr>
+                <w:rFonts w:ascii="Calibri" w:cs="Calibri" w:eastAsia="Calibri" w:hAnsi="Calibri"/>
+                <w:sz w:val="18"/>
+                <w:szCs w:val="18"/>
+              </w:rPr>
+              <w:t xml:space="preserve">Product classes</w:t>
+            </w:r>
+          </w:p>
+        </w:tc>
+        <w:tc>
+          <w:tcPr>
+            <w:tcW w:type="dxa" w:w="7294"/>
             <w:tcBorders>
               <w:top w:val="single" w:color="BFC5CE" w:sz="4"/>
               <w:left w:val="single" w:color="BFC5CE" w:sz="4"/>
@@ -17207,38 +18155,15 @@
                 <w:sz w:val="17"/>
                 <w:szCs w:val="17"/>
               </w:rPr>
-              <w:t xml:space="preserve">node scripts/verify-migrations.js</w:t>
-            </w:r>
-          </w:p>
-        </w:tc>
-        <w:tc>
-          <w:tcPr>
-            <w:tcW w:type="dxa" w:w="5567"/>
-            <w:tcBorders>
-              <w:top w:val="single" w:color="BFC5CE" w:sz="4"/>
-              <w:left w:val="single" w:color="BFC5CE" w:sz="4"/>
-              <w:bottom w:val="single" w:color="BFC5CE" w:sz="4"/>
-              <w:right w:val="single" w:color="BFC5CE" w:sz="4"/>
-            </w:tcBorders>
-            <w:tcMar>
-              <w:top w:type="dxa" w:w="40"/>
-              <w:left w:type="dxa" w:w="80"/>
-              <w:bottom w:type="dxa" w:w="40"/>
-              <w:right w:type="dxa" w:w="80"/>
-            </w:tcMar>
-          </w:tcPr>
-          <w:p>
-            <w:pPr>
-              <w:spacing w:after="0" w:before="0"/>
-              <w:jc w:val="left"/>
-            </w:pPr>
-            <w:r>
-              <w:rPr>
-                <w:rFonts w:ascii="Calibri" w:cs="Calibri" w:eastAsia="Calibri" w:hAnsi="Calibri"/>
-                <w:sz w:val="18"/>
-                <w:szCs w:val="18"/>
-              </w:rPr>
-              <w:t xml:space="preserve">Builds the full migration chain in a throwaway schema and compares it with </w:t>
+              <w:t xml:space="preserve">SMARTPHONE</w:t>
+            </w:r>
+            <w:r>
+              <w:rPr>
+                <w:rFonts w:ascii="Calibri" w:cs="Calibri" w:eastAsia="Calibri" w:hAnsi="Calibri"/>
+                <w:sz w:val="18"/>
+                <w:szCs w:val="18"/>
+              </w:rPr>
+              <w:t xml:space="preserve">, </w:t>
             </w:r>
             <w:r>
               <w:rPr>
@@ -17246,46 +18171,103 @@
                 <w:sz w:val="17"/>
                 <w:szCs w:val="17"/>
               </w:rPr>
-              <w:t xml:space="preserve">schema.sql</w:t>
-            </w:r>
-            <w:r>
-              <w:rPr>
-                <w:rFonts w:ascii="Calibri" w:cs="Calibri" w:eastAsia="Calibri" w:hAnsi="Calibri"/>
-                <w:sz w:val="18"/>
-                <w:szCs w:val="18"/>
-              </w:rPr>
-              <w:t xml:space="preserve">.</w:t>
-            </w:r>
-          </w:p>
-        </w:tc>
-        <w:tc>
-          <w:tcPr>
-            <w:tcW w:type="dxa" w:w="1609"/>
-            <w:tcBorders>
-              <w:top w:val="single" w:color="BFC5CE" w:sz="4"/>
-              <w:left w:val="single" w:color="BFC5CE" w:sz="4"/>
-              <w:bottom w:val="single" w:color="BFC5CE" w:sz="4"/>
-              <w:right w:val="single" w:color="BFC5CE" w:sz="4"/>
-            </w:tcBorders>
-            <w:tcMar>
-              <w:top w:type="dxa" w:w="40"/>
-              <w:left w:type="dxa" w:w="80"/>
-              <w:bottom w:type="dxa" w:w="40"/>
-              <w:right w:type="dxa" w:w="80"/>
-            </w:tcMar>
-          </w:tcPr>
-          <w:p>
-            <w:pPr>
-              <w:spacing w:after="0" w:before="0"/>
-              <w:jc w:val="left"/>
-            </w:pPr>
-            <w:r>
-              <w:rPr>
-                <w:rFonts w:ascii="Calibri" w:cs="Calibri" w:eastAsia="Calibri" w:hAnsi="Calibri"/>
-                <w:sz w:val="18"/>
-                <w:szCs w:val="18"/>
-              </w:rPr>
-              <w:t xml:space="preserve">dev database</w:t>
+              <w:t xml:space="preserve">EPRODUCT</w:t>
+            </w:r>
+            <w:r>
+              <w:rPr>
+                <w:rFonts w:ascii="Calibri" w:cs="Calibri" w:eastAsia="Calibri" w:hAnsi="Calibri"/>
+                <w:sz w:val="18"/>
+                <w:szCs w:val="18"/>
+              </w:rPr>
+              <w:t xml:space="preserve">, </w:t>
+            </w:r>
+            <w:r>
+              <w:rPr>
+                <w:rFonts w:ascii="Consolas" w:cs="Consolas" w:eastAsia="Consolas" w:hAnsi="Consolas"/>
+                <w:sz w:val="17"/>
+                <w:szCs w:val="17"/>
+              </w:rPr>
+              <w:t xml:space="preserve">SOFTWARE</w:t>
+            </w:r>
+            <w:r>
+              <w:rPr>
+                <w:rFonts w:ascii="Calibri" w:cs="Calibri" w:eastAsia="Calibri" w:hAnsi="Calibri"/>
+                <w:sz w:val="18"/>
+                <w:szCs w:val="18"/>
+              </w:rPr>
+              <w:t xml:space="preserve">, </w:t>
+            </w:r>
+            <w:r>
+              <w:rPr>
+                <w:rFonts w:ascii="Consolas" w:cs="Consolas" w:eastAsia="Consolas" w:hAnsi="Consolas"/>
+                <w:sz w:val="17"/>
+                <w:szCs w:val="17"/>
+              </w:rPr>
+              <w:t xml:space="preserve">STB</w:t>
+            </w:r>
+            <w:r>
+              <w:rPr>
+                <w:rFonts w:ascii="Calibri" w:cs="Calibri" w:eastAsia="Calibri" w:hAnsi="Calibri"/>
+                <w:sz w:val="18"/>
+                <w:szCs w:val="18"/>
+              </w:rPr>
+              <w:t xml:space="preserve">, </w:t>
+            </w:r>
+            <w:r>
+              <w:rPr>
+                <w:rFonts w:ascii="Consolas" w:cs="Consolas" w:eastAsia="Consolas" w:hAnsi="Consolas"/>
+                <w:sz w:val="17"/>
+                <w:szCs w:val="17"/>
+              </w:rPr>
+              <w:t xml:space="preserve">PC</w:t>
+            </w:r>
+            <w:r>
+              <w:rPr>
+                <w:rFonts w:ascii="Calibri" w:cs="Calibri" w:eastAsia="Calibri" w:hAnsi="Calibri"/>
+                <w:sz w:val="18"/>
+                <w:szCs w:val="18"/>
+              </w:rPr>
+              <w:t xml:space="preserve">, </w:t>
+            </w:r>
+            <w:r>
+              <w:rPr>
+                <w:rFonts w:ascii="Consolas" w:cs="Consolas" w:eastAsia="Consolas" w:hAnsi="Consolas"/>
+                <w:sz w:val="17"/>
+                <w:szCs w:val="17"/>
+              </w:rPr>
+              <w:t xml:space="preserve">CAMERA</w:t>
+            </w:r>
+            <w:r>
+              <w:rPr>
+                <w:rFonts w:ascii="Calibri" w:cs="Calibri" w:eastAsia="Calibri" w:hAnsi="Calibri"/>
+                <w:sz w:val="18"/>
+                <w:szCs w:val="18"/>
+              </w:rPr>
+              <w:t xml:space="preserve">, </w:t>
+            </w:r>
+            <w:r>
+              <w:rPr>
+                <w:rFonts w:ascii="Consolas" w:cs="Consolas" w:eastAsia="Consolas" w:hAnsi="Consolas"/>
+                <w:sz w:val="17"/>
+                <w:szCs w:val="17"/>
+              </w:rPr>
+              <w:t xml:space="preserve">KARAOKE_LICENCE</w:t>
+            </w:r>
+            <w:r>
+              <w:rPr>
+                <w:rFonts w:ascii="Calibri" w:cs="Calibri" w:eastAsia="Calibri" w:hAnsi="Calibri"/>
+                <w:sz w:val="18"/>
+                <w:szCs w:val="18"/>
+              </w:rPr>
+              <w:t xml:space="preserve">, </w:t>
+            </w:r>
+            <w:r>
+              <w:rPr>
+                <w:rFonts w:ascii="Consolas" w:cs="Consolas" w:eastAsia="Consolas" w:hAnsi="Consolas"/>
+                <w:sz w:val="17"/>
+                <w:szCs w:val="17"/>
+              </w:rPr>
+              <w:t xml:space="preserve">MEDIA_LICENCE</w:t>
             </w:r>
           </w:p>
         </w:tc>
@@ -17296,7 +18278,38 @@
         </w:trPr>
         <w:tc>
           <w:tcPr>
-            <w:tcW w:type="dxa" w:w="2462"/>
+            <w:tcW w:type="dxa" w:w="2344"/>
+            <w:tcBorders>
+              <w:top w:val="single" w:color="BFC5CE" w:sz="4"/>
+              <w:left w:val="single" w:color="BFC5CE" w:sz="4"/>
+              <w:bottom w:val="single" w:color="BFC5CE" w:sz="4"/>
+              <w:right w:val="single" w:color="BFC5CE" w:sz="4"/>
+            </w:tcBorders>
+            <w:tcMar>
+              <w:top w:type="dxa" w:w="40"/>
+              <w:left w:type="dxa" w:w="80"/>
+              <w:bottom w:type="dxa" w:w="40"/>
+              <w:right w:type="dxa" w:w="80"/>
+            </w:tcMar>
+          </w:tcPr>
+          <w:p>
+            <w:pPr>
+              <w:spacing w:after="0" w:before="0"/>
+              <w:jc w:val="left"/>
+            </w:pPr>
+            <w:r>
+              <w:rPr>
+                <w:rFonts w:ascii="Calibri" w:cs="Calibri" w:eastAsia="Calibri" w:hAnsi="Calibri"/>
+                <w:sz w:val="18"/>
+                <w:szCs w:val="18"/>
+              </w:rPr>
+              <w:t xml:space="preserve">Ways to hold a product</w:t>
+            </w:r>
+          </w:p>
+        </w:tc>
+        <w:tc>
+          <w:tcPr>
+            <w:tcW w:type="dxa" w:w="7294"/>
             <w:tcBorders>
               <w:top w:val="single" w:color="BFC5CE" w:sz="4"/>
               <w:left w:val="single" w:color="BFC5CE" w:sz="4"/>
@@ -17321,38 +18334,15 @@
                 <w:sz w:val="17"/>
                 <w:szCs w:val="17"/>
               </w:rPr>
-              <w:t xml:space="preserve">npm run crm:docs</w:t>
-            </w:r>
-          </w:p>
-        </w:tc>
-        <w:tc>
-          <w:tcPr>
-            <w:tcW w:type="dxa" w:w="5567"/>
-            <w:tcBorders>
-              <w:top w:val="single" w:color="BFC5CE" w:sz="4"/>
-              <w:left w:val="single" w:color="BFC5CE" w:sz="4"/>
-              <w:bottom w:val="single" w:color="BFC5CE" w:sz="4"/>
-              <w:right w:val="single" w:color="BFC5CE" w:sz="4"/>
-            </w:tcBorders>
-            <w:tcMar>
-              <w:top w:type="dxa" w:w="40"/>
-              <w:left w:type="dxa" w:w="80"/>
-              <w:bottom w:type="dxa" w:w="40"/>
-              <w:right w:type="dxa" w:w="80"/>
-            </w:tcMar>
-          </w:tcPr>
-          <w:p>
-            <w:pPr>
-              <w:spacing w:after="0" w:before="0"/>
-              <w:jc w:val="left"/>
-            </w:pPr>
-            <w:r>
-              <w:rPr>
-                <w:rFonts w:ascii="Calibri" w:cs="Calibri" w:eastAsia="Calibri" w:hAnsi="Calibri"/>
-                <w:sz w:val="18"/>
-                <w:szCs w:val="18"/>
-              </w:rPr>
-              <w:t xml:space="preserve">Regenerates </w:t>
+              <w:t xml:space="preserve">OWNER</w:t>
+            </w:r>
+            <w:r>
+              <w:rPr>
+                <w:rFonts w:ascii="Calibri" w:cs="Calibri" w:eastAsia="Calibri" w:hAnsi="Calibri"/>
+                <w:sz w:val="18"/>
+                <w:szCs w:val="18"/>
+              </w:rPr>
+              <w:t xml:space="preserve">, </w:t>
             </w:r>
             <w:r>
               <w:rPr>
@@ -17360,46 +18350,55 @@
                 <w:sz w:val="17"/>
                 <w:szCs w:val="17"/>
               </w:rPr>
-              <w:t xml:space="preserve">crm-database.md</w:t>
-            </w:r>
-            <w:r>
-              <w:rPr>
-                <w:rFonts w:ascii="Calibri" w:cs="Calibri" w:eastAsia="Calibri" w:hAnsi="Calibri"/>
-                <w:sz w:val="18"/>
-                <w:szCs w:val="18"/>
-              </w:rPr>
-              <w:t xml:space="preserve"> (refuses while any field is undocumented) and writes the Word copies of both documents.</w:t>
-            </w:r>
-          </w:p>
-        </w:tc>
-        <w:tc>
-          <w:tcPr>
-            <w:tcW w:type="dxa" w:w="1609"/>
-            <w:tcBorders>
-              <w:top w:val="single" w:color="BFC5CE" w:sz="4"/>
-              <w:left w:val="single" w:color="BFC5CE" w:sz="4"/>
-              <w:bottom w:val="single" w:color="BFC5CE" w:sz="4"/>
-              <w:right w:val="single" w:color="BFC5CE" w:sz="4"/>
-            </w:tcBorders>
-            <w:tcMar>
-              <w:top w:type="dxa" w:w="40"/>
-              <w:left w:type="dxa" w:w="80"/>
-              <w:bottom w:type="dxa" w:w="40"/>
-              <w:right w:type="dxa" w:w="80"/>
-            </w:tcMar>
-          </w:tcPr>
-          <w:p>
-            <w:pPr>
-              <w:spacing w:after="0" w:before="0"/>
-              <w:jc w:val="left"/>
-            </w:pPr>
-            <w:r>
-              <w:rPr>
-                <w:rFonts w:ascii="Calibri" w:cs="Calibri" w:eastAsia="Calibri" w:hAnsi="Calibri"/>
-                <w:sz w:val="18"/>
-                <w:szCs w:val="18"/>
-              </w:rPr>
-              <w:t xml:space="preserve">dev database</w:t>
+              <w:t xml:space="preserve">USER</w:t>
+            </w:r>
+            <w:r>
+              <w:rPr>
+                <w:rFonts w:ascii="Calibri" w:cs="Calibri" w:eastAsia="Calibri" w:hAnsi="Calibri"/>
+                <w:sz w:val="18"/>
+                <w:szCs w:val="18"/>
+              </w:rPr>
+              <w:t xml:space="preserve">, </w:t>
+            </w:r>
+            <w:r>
+              <w:rPr>
+                <w:rFonts w:ascii="Consolas" w:cs="Consolas" w:eastAsia="Consolas" w:hAnsi="Consolas"/>
+                <w:sz w:val="17"/>
+                <w:szCs w:val="17"/>
+              </w:rPr>
+              <w:t xml:space="preserve">REGISTERED_USER</w:t>
+            </w:r>
+            <w:r>
+              <w:rPr>
+                <w:rFonts w:ascii="Calibri" w:cs="Calibri" w:eastAsia="Calibri" w:hAnsi="Calibri"/>
+                <w:sz w:val="18"/>
+                <w:szCs w:val="18"/>
+              </w:rPr>
+              <w:t xml:space="preserve">, </w:t>
+            </w:r>
+            <w:r>
+              <w:rPr>
+                <w:rFonts w:ascii="Consolas" w:cs="Consolas" w:eastAsia="Consolas" w:hAnsi="Consolas"/>
+                <w:sz w:val="17"/>
+                <w:szCs w:val="17"/>
+              </w:rPr>
+              <w:t xml:space="preserve">LESSEE</w:t>
+            </w:r>
+            <w:r>
+              <w:rPr>
+                <w:rFonts w:ascii="Calibri" w:cs="Calibri" w:eastAsia="Calibri" w:hAnsi="Calibri"/>
+                <w:sz w:val="18"/>
+                <w:szCs w:val="18"/>
+              </w:rPr>
+              <w:t xml:space="preserve">, </w:t>
+            </w:r>
+            <w:r>
+              <w:rPr>
+                <w:rFonts w:ascii="Consolas" w:cs="Consolas" w:eastAsia="Consolas" w:hAnsi="Consolas"/>
+                <w:sz w:val="17"/>
+                <w:szCs w:val="17"/>
+              </w:rPr>
+              <w:t xml:space="preserve">LICENSEE</w:t>
             </w:r>
           </w:p>
         </w:tc>
@@ -17410,7 +18409,38 @@
         </w:trPr>
         <w:tc>
           <w:tcPr>
-            <w:tcW w:type="dxa" w:w="2462"/>
+            <w:tcW w:type="dxa" w:w="2344"/>
+            <w:tcBorders>
+              <w:top w:val="single" w:color="BFC5CE" w:sz="4"/>
+              <w:left w:val="single" w:color="BFC5CE" w:sz="4"/>
+              <w:bottom w:val="single" w:color="BFC5CE" w:sz="4"/>
+              <w:right w:val="single" w:color="BFC5CE" w:sz="4"/>
+            </w:tcBorders>
+            <w:tcMar>
+              <w:top w:type="dxa" w:w="40"/>
+              <w:left w:type="dxa" w:w="80"/>
+              <w:bottom w:type="dxa" w:w="40"/>
+              <w:right w:type="dxa" w:w="80"/>
+            </w:tcMar>
+          </w:tcPr>
+          <w:p>
+            <w:pPr>
+              <w:spacing w:after="0" w:before="0"/>
+              <w:jc w:val="left"/>
+            </w:pPr>
+            <w:r>
+              <w:rPr>
+                <w:rFonts w:ascii="Calibri" w:cs="Calibri" w:eastAsia="Calibri" w:hAnsi="Calibri"/>
+                <w:sz w:val="18"/>
+                <w:szCs w:val="18"/>
+              </w:rPr>
+              <w:t xml:space="preserve">Acquisition types</w:t>
+            </w:r>
+          </w:p>
+        </w:tc>
+        <w:tc>
+          <w:tcPr>
+            <w:tcW w:type="dxa" w:w="7294"/>
             <w:tcBorders>
               <w:top w:val="single" w:color="BFC5CE" w:sz="4"/>
               <w:left w:val="single" w:color="BFC5CE" w:sz="4"/>
@@ -17435,13 +18465,1635 @@
                 <w:sz w:val="17"/>
                 <w:szCs w:val="17"/>
               </w:rPr>
+              <w:t xml:space="preserve">PURCHASED</w:t>
+            </w:r>
+            <w:r>
+              <w:rPr>
+                <w:rFonts w:ascii="Calibri" w:cs="Calibri" w:eastAsia="Calibri" w:hAnsi="Calibri"/>
+                <w:sz w:val="18"/>
+                <w:szCs w:val="18"/>
+              </w:rPr>
+              <w:t xml:space="preserve">, </w:t>
+            </w:r>
+            <w:r>
+              <w:rPr>
+                <w:rFonts w:ascii="Consolas" w:cs="Consolas" w:eastAsia="Consolas" w:hAnsi="Consolas"/>
+                <w:sz w:val="17"/>
+                <w:szCs w:val="17"/>
+              </w:rPr>
+              <w:t xml:space="preserve">TRANSFER</w:t>
+            </w:r>
+            <w:r>
+              <w:rPr>
+                <w:rFonts w:ascii="Calibri" w:cs="Calibri" w:eastAsia="Calibri" w:hAnsi="Calibri"/>
+                <w:sz w:val="18"/>
+                <w:szCs w:val="18"/>
+              </w:rPr>
+              <w:t xml:space="preserve">, </w:t>
+            </w:r>
+            <w:r>
+              <w:rPr>
+                <w:rFonts w:ascii="Consolas" w:cs="Consolas" w:eastAsia="Consolas" w:hAnsi="Consolas"/>
+                <w:sz w:val="17"/>
+                <w:szCs w:val="17"/>
+              </w:rPr>
+              <w:t xml:space="preserve">COMPANY_ASSIGNED</w:t>
+            </w:r>
+          </w:p>
+        </w:tc>
+      </w:tr>
+      <w:tr>
+        <w:trPr>
+          <w:cantSplit/>
+        </w:trPr>
+        <w:tc>
+          <w:tcPr>
+            <w:tcW w:type="dxa" w:w="2344"/>
+            <w:tcBorders>
+              <w:top w:val="single" w:color="BFC5CE" w:sz="4"/>
+              <w:left w:val="single" w:color="BFC5CE" w:sz="4"/>
+              <w:bottom w:val="single" w:color="BFC5CE" w:sz="4"/>
+              <w:right w:val="single" w:color="BFC5CE" w:sz="4"/>
+            </w:tcBorders>
+            <w:tcMar>
+              <w:top w:type="dxa" w:w="40"/>
+              <w:left w:type="dxa" w:w="80"/>
+              <w:bottom w:type="dxa" w:w="40"/>
+              <w:right w:type="dxa" w:w="80"/>
+            </w:tcMar>
+          </w:tcPr>
+          <w:p>
+            <w:pPr>
+              <w:spacing w:after="0" w:before="0"/>
+              <w:jc w:val="left"/>
+            </w:pPr>
+            <w:r>
+              <w:rPr>
+                <w:rFonts w:ascii="Calibri" w:cs="Calibri" w:eastAsia="Calibri" w:hAnsi="Calibri"/>
+                <w:sz w:val="18"/>
+                <w:szCs w:val="18"/>
+              </w:rPr>
+              <w:t xml:space="preserve">Service center activity types</w:t>
+            </w:r>
+          </w:p>
+        </w:tc>
+        <w:tc>
+          <w:tcPr>
+            <w:tcW w:type="dxa" w:w="7294"/>
+            <w:tcBorders>
+              <w:top w:val="single" w:color="BFC5CE" w:sz="4"/>
+              <w:left w:val="single" w:color="BFC5CE" w:sz="4"/>
+              <w:bottom w:val="single" w:color="BFC5CE" w:sz="4"/>
+              <w:right w:val="single" w:color="BFC5CE" w:sz="4"/>
+            </w:tcBorders>
+            <w:tcMar>
+              <w:top w:type="dxa" w:w="40"/>
+              <w:left w:type="dxa" w:w="80"/>
+              <w:bottom w:type="dxa" w:w="40"/>
+              <w:right w:type="dxa" w:w="80"/>
+            </w:tcMar>
+          </w:tcPr>
+          <w:p>
+            <w:pPr>
+              <w:spacing w:after="0" w:before="0"/>
+              <w:jc w:val="left"/>
+            </w:pPr>
+            <w:r>
+              <w:rPr>
+                <w:rFonts w:ascii="Consolas" w:cs="Consolas" w:eastAsia="Consolas" w:hAnsi="Consolas"/>
+                <w:sz w:val="17"/>
+                <w:szCs w:val="17"/>
+              </w:rPr>
+              <w:t xml:space="preserve">REPAIR_INTAKE</w:t>
+            </w:r>
+            <w:r>
+              <w:rPr>
+                <w:rFonts w:ascii="Calibri" w:cs="Calibri" w:eastAsia="Calibri" w:hAnsi="Calibri"/>
+                <w:sz w:val="18"/>
+                <w:szCs w:val="18"/>
+              </w:rPr>
+              <w:t xml:space="preserve">, </w:t>
+            </w:r>
+            <w:r>
+              <w:rPr>
+                <w:rFonts w:ascii="Consolas" w:cs="Consolas" w:eastAsia="Consolas" w:hAnsi="Consolas"/>
+                <w:sz w:val="17"/>
+                <w:szCs w:val="17"/>
+              </w:rPr>
+              <w:t xml:space="preserve">REPAIR_DELIVERY</w:t>
+            </w:r>
+            <w:r>
+              <w:rPr>
+                <w:rFonts w:ascii="Calibri" w:cs="Calibri" w:eastAsia="Calibri" w:hAnsi="Calibri"/>
+                <w:sz w:val="18"/>
+                <w:szCs w:val="18"/>
+              </w:rPr>
+              <w:t xml:space="preserve">, </w:t>
+            </w:r>
+            <w:r>
+              <w:rPr>
+                <w:rFonts w:ascii="Consolas" w:cs="Consolas" w:eastAsia="Consolas" w:hAnsi="Consolas"/>
+                <w:sz w:val="17"/>
+                <w:szCs w:val="17"/>
+              </w:rPr>
+              <w:t xml:space="preserve">RESERVATION_PICKUP</w:t>
+            </w:r>
+            <w:r>
+              <w:rPr>
+                <w:rFonts w:ascii="Calibri" w:cs="Calibri" w:eastAsia="Calibri" w:hAnsi="Calibri"/>
+                <w:sz w:val="18"/>
+                <w:szCs w:val="18"/>
+              </w:rPr>
+              <w:t xml:space="preserve">, </w:t>
+            </w:r>
+            <w:r>
+              <w:rPr>
+                <w:rFonts w:ascii="Consolas" w:cs="Consolas" w:eastAsia="Consolas" w:hAnsi="Consolas"/>
+                <w:sz w:val="17"/>
+                <w:szCs w:val="17"/>
+              </w:rPr>
+              <w:t xml:space="preserve">PRIZE_HANDOVER</w:t>
+            </w:r>
+            <w:r>
+              <w:rPr>
+                <w:rFonts w:ascii="Calibri" w:cs="Calibri" w:eastAsia="Calibri" w:hAnsi="Calibri"/>
+                <w:sz w:val="18"/>
+                <w:szCs w:val="18"/>
+              </w:rPr>
+              <w:t xml:space="preserve">, </w:t>
+            </w:r>
+            <w:r>
+              <w:rPr>
+                <w:rFonts w:ascii="Consolas" w:cs="Consolas" w:eastAsia="Consolas" w:hAnsi="Consolas"/>
+                <w:sz w:val="17"/>
+                <w:szCs w:val="17"/>
+              </w:rPr>
+              <w:t xml:space="preserve">REGISTRATION_ASSIST</w:t>
+            </w:r>
+          </w:p>
+        </w:tc>
+      </w:tr>
+      <w:tr>
+        <w:trPr>
+          <w:cantSplit/>
+        </w:trPr>
+        <w:tc>
+          <w:tcPr>
+            <w:tcW w:type="dxa" w:w="2344"/>
+            <w:tcBorders>
+              <w:top w:val="single" w:color="BFC5CE" w:sz="4"/>
+              <w:left w:val="single" w:color="BFC5CE" w:sz="4"/>
+              <w:bottom w:val="single" w:color="BFC5CE" w:sz="4"/>
+              <w:right w:val="single" w:color="BFC5CE" w:sz="4"/>
+            </w:tcBorders>
+            <w:tcMar>
+              <w:top w:type="dxa" w:w="40"/>
+              <w:left w:type="dxa" w:w="80"/>
+              <w:bottom w:type="dxa" w:w="40"/>
+              <w:right w:type="dxa" w:w="80"/>
+            </w:tcMar>
+          </w:tcPr>
+          <w:p>
+            <w:pPr>
+              <w:spacing w:after="0" w:before="0"/>
+              <w:jc w:val="left"/>
+            </w:pPr>
+            <w:r>
+              <w:rPr>
+                <w:rFonts w:ascii="Calibri" w:cs="Calibri" w:eastAsia="Calibri" w:hAnsi="Calibri"/>
+                <w:sz w:val="18"/>
+                <w:szCs w:val="18"/>
+              </w:rPr>
+              <w:t xml:space="preserve">Case types / service statuses / priorities</w:t>
+            </w:r>
+          </w:p>
+        </w:tc>
+        <w:tc>
+          <w:tcPr>
+            <w:tcW w:type="dxa" w:w="7294"/>
+            <w:tcBorders>
+              <w:top w:val="single" w:color="BFC5CE" w:sz="4"/>
+              <w:left w:val="single" w:color="BFC5CE" w:sz="4"/>
+              <w:bottom w:val="single" w:color="BFC5CE" w:sz="4"/>
+              <w:right w:val="single" w:color="BFC5CE" w:sz="4"/>
+            </w:tcBorders>
+            <w:tcMar>
+              <w:top w:type="dxa" w:w="40"/>
+              <w:left w:type="dxa" w:w="80"/>
+              <w:bottom w:type="dxa" w:w="40"/>
+              <w:right w:type="dxa" w:w="80"/>
+            </w:tcMar>
+          </w:tcPr>
+          <w:p>
+            <w:pPr>
+              <w:spacing w:after="0" w:before="0"/>
+              <w:jc w:val="left"/>
+            </w:pPr>
+            <w:r>
+              <w:rPr>
+                <w:rFonts w:ascii="Consolas" w:cs="Consolas" w:eastAsia="Consolas" w:hAnsi="Consolas"/>
+                <w:sz w:val="17"/>
+                <w:szCs w:val="17"/>
+              </w:rPr>
+              <w:t xml:space="preserve">REPAIR</w:t>
+            </w:r>
+            <w:r>
+              <w:rPr>
+                <w:rFonts w:ascii="Calibri" w:cs="Calibri" w:eastAsia="Calibri" w:hAnsi="Calibri"/>
+                <w:sz w:val="18"/>
+                <w:szCs w:val="18"/>
+              </w:rPr>
+              <w:t xml:space="preserve">, </w:t>
+            </w:r>
+            <w:r>
+              <w:rPr>
+                <w:rFonts w:ascii="Consolas" w:cs="Consolas" w:eastAsia="Consolas" w:hAnsi="Consolas"/>
+                <w:sz w:val="17"/>
+                <w:szCs w:val="17"/>
+              </w:rPr>
+              <w:t xml:space="preserve">WARRANTY_REPAIR</w:t>
+            </w:r>
+            <w:r>
+              <w:rPr>
+                <w:rFonts w:ascii="Calibri" w:cs="Calibri" w:eastAsia="Calibri" w:hAnsi="Calibri"/>
+                <w:sz w:val="18"/>
+                <w:szCs w:val="18"/>
+              </w:rPr>
+              <w:t xml:space="preserve"> / </w:t>
+            </w:r>
+            <w:r>
+              <w:rPr>
+                <w:rFonts w:ascii="Consolas" w:cs="Consolas" w:eastAsia="Consolas" w:hAnsi="Consolas"/>
+                <w:sz w:val="17"/>
+                <w:szCs w:val="17"/>
+              </w:rPr>
+              <w:t xml:space="preserve">CLOSED</w:t>
+            </w:r>
+            <w:r>
+              <w:rPr>
+                <w:rFonts w:ascii="Calibri" w:cs="Calibri" w:eastAsia="Calibri" w:hAnsi="Calibri"/>
+                <w:sz w:val="18"/>
+                <w:szCs w:val="18"/>
+              </w:rPr>
+              <w:t xml:space="preserve">, </w:t>
+            </w:r>
+            <w:r>
+              <w:rPr>
+                <w:rFonts w:ascii="Consolas" w:cs="Consolas" w:eastAsia="Consolas" w:hAnsi="Consolas"/>
+                <w:sz w:val="17"/>
+                <w:szCs w:val="17"/>
+              </w:rPr>
+              <w:t xml:space="preserve">CANCELLED</w:t>
+            </w:r>
+            <w:r>
+              <w:rPr>
+                <w:rFonts w:ascii="Calibri" w:cs="Calibri" w:eastAsia="Calibri" w:hAnsi="Calibri"/>
+                <w:sz w:val="18"/>
+                <w:szCs w:val="18"/>
+              </w:rPr>
+              <w:t xml:space="preserve"> (final) / </w:t>
+            </w:r>
+            <w:r>
+              <w:rPr>
+                <w:rFonts w:ascii="Consolas" w:cs="Consolas" w:eastAsia="Consolas" w:hAnsi="Consolas"/>
+                <w:sz w:val="17"/>
+                <w:szCs w:val="17"/>
+              </w:rPr>
+              <w:t xml:space="preserve">LOW</w:t>
+            </w:r>
+            <w:r>
+              <w:rPr>
+                <w:rFonts w:ascii="Calibri" w:cs="Calibri" w:eastAsia="Calibri" w:hAnsi="Calibri"/>
+                <w:sz w:val="18"/>
+                <w:szCs w:val="18"/>
+              </w:rPr>
+              <w:t xml:space="preserve">, </w:t>
+            </w:r>
+            <w:r>
+              <w:rPr>
+                <w:rFonts w:ascii="Consolas" w:cs="Consolas" w:eastAsia="Consolas" w:hAnsi="Consolas"/>
+                <w:sz w:val="17"/>
+                <w:szCs w:val="17"/>
+              </w:rPr>
+              <w:t xml:space="preserve">NORMAL</w:t>
+            </w:r>
+            <w:r>
+              <w:rPr>
+                <w:rFonts w:ascii="Calibri" w:cs="Calibri" w:eastAsia="Calibri" w:hAnsi="Calibri"/>
+                <w:sz w:val="18"/>
+                <w:szCs w:val="18"/>
+              </w:rPr>
+              <w:t xml:space="preserve">, </w:t>
+            </w:r>
+            <w:r>
+              <w:rPr>
+                <w:rFonts w:ascii="Consolas" w:cs="Consolas" w:eastAsia="Consolas" w:hAnsi="Consolas"/>
+                <w:sz w:val="17"/>
+                <w:szCs w:val="17"/>
+              </w:rPr>
+              <w:t xml:space="preserve">HIGH</w:t>
+            </w:r>
+          </w:p>
+        </w:tc>
+      </w:tr>
+      <w:tr>
+        <w:trPr>
+          <w:cantSplit/>
+        </w:trPr>
+        <w:tc>
+          <w:tcPr>
+            <w:tcW w:type="dxa" w:w="2344"/>
+            <w:tcBorders>
+              <w:top w:val="single" w:color="BFC5CE" w:sz="4"/>
+              <w:left w:val="single" w:color="BFC5CE" w:sz="4"/>
+              <w:bottom w:val="single" w:color="BFC5CE" w:sz="4"/>
+              <w:right w:val="single" w:color="BFC5CE" w:sz="4"/>
+            </w:tcBorders>
+            <w:tcMar>
+              <w:top w:type="dxa" w:w="40"/>
+              <w:left w:type="dxa" w:w="80"/>
+              <w:bottom w:type="dxa" w:w="40"/>
+              <w:right w:type="dxa" w:w="80"/>
+            </w:tcMar>
+          </w:tcPr>
+          <w:p>
+            <w:pPr>
+              <w:spacing w:after="0" w:before="0"/>
+              <w:jc w:val="left"/>
+            </w:pPr>
+            <w:r>
+              <w:rPr>
+                <w:rFonts w:ascii="Calibri" w:cs="Calibri" w:eastAsia="Calibri" w:hAnsi="Calibri"/>
+                <w:sz w:val="18"/>
+                <w:szCs w:val="18"/>
+              </w:rPr>
+              <w:t xml:space="preserve">Relationships between customers</w:t>
+            </w:r>
+          </w:p>
+        </w:tc>
+        <w:tc>
+          <w:tcPr>
+            <w:tcW w:type="dxa" w:w="7294"/>
+            <w:tcBorders>
+              <w:top w:val="single" w:color="BFC5CE" w:sz="4"/>
+              <w:left w:val="single" w:color="BFC5CE" w:sz="4"/>
+              <w:bottom w:val="single" w:color="BFC5CE" w:sz="4"/>
+              <w:right w:val="single" w:color="BFC5CE" w:sz="4"/>
+            </w:tcBorders>
+            <w:tcMar>
+              <w:top w:type="dxa" w:w="40"/>
+              <w:left w:type="dxa" w:w="80"/>
+              <w:bottom w:type="dxa" w:w="40"/>
+              <w:right w:type="dxa" w:w="80"/>
+            </w:tcMar>
+          </w:tcPr>
+          <w:p>
+            <w:pPr>
+              <w:spacing w:after="0" w:before="0"/>
+              <w:jc w:val="left"/>
+            </w:pPr>
+            <w:r>
+              <w:rPr>
+                <w:rFonts w:ascii="Consolas" w:cs="Consolas" w:eastAsia="Consolas" w:hAnsi="Consolas"/>
+                <w:sz w:val="17"/>
+                <w:szCs w:val="17"/>
+              </w:rPr>
+              <w:t xml:space="preserve">SPOUSE</w:t>
+            </w:r>
+            <w:r>
+              <w:rPr>
+                <w:rFonts w:ascii="Calibri" w:cs="Calibri" w:eastAsia="Calibri" w:hAnsi="Calibri"/>
+                <w:sz w:val="18"/>
+                <w:szCs w:val="18"/>
+              </w:rPr>
+              <w:t xml:space="preserve">, </w:t>
+            </w:r>
+            <w:r>
+              <w:rPr>
+                <w:rFonts w:ascii="Consolas" w:cs="Consolas" w:eastAsia="Consolas" w:hAnsi="Consolas"/>
+                <w:sz w:val="17"/>
+                <w:szCs w:val="17"/>
+              </w:rPr>
+              <w:t xml:space="preserve">PARENT</w:t>
+            </w:r>
+            <w:r>
+              <w:rPr>
+                <w:rFonts w:ascii="Calibri" w:cs="Calibri" w:eastAsia="Calibri" w:hAnsi="Calibri"/>
+                <w:sz w:val="18"/>
+                <w:szCs w:val="18"/>
+              </w:rPr>
+              <w:t xml:space="preserve">, </w:t>
+            </w:r>
+            <w:r>
+              <w:rPr>
+                <w:rFonts w:ascii="Consolas" w:cs="Consolas" w:eastAsia="Consolas" w:hAnsi="Consolas"/>
+                <w:sz w:val="17"/>
+                <w:szCs w:val="17"/>
+              </w:rPr>
+              <w:t xml:space="preserve">CHILD</w:t>
+            </w:r>
+            <w:r>
+              <w:rPr>
+                <w:rFonts w:ascii="Calibri" w:cs="Calibri" w:eastAsia="Calibri" w:hAnsi="Calibri"/>
+                <w:sz w:val="18"/>
+                <w:szCs w:val="18"/>
+              </w:rPr>
+              <w:t xml:space="preserve">, </w:t>
+            </w:r>
+            <w:r>
+              <w:rPr>
+                <w:rFonts w:ascii="Consolas" w:cs="Consolas" w:eastAsia="Consolas" w:hAnsi="Consolas"/>
+                <w:sz w:val="17"/>
+                <w:szCs w:val="17"/>
+              </w:rPr>
+              <w:t xml:space="preserve">SIBLING</w:t>
+            </w:r>
+            <w:r>
+              <w:rPr>
+                <w:rFonts w:ascii="Calibri" w:cs="Calibri" w:eastAsia="Calibri" w:hAnsi="Calibri"/>
+                <w:sz w:val="18"/>
+                <w:szCs w:val="18"/>
+              </w:rPr>
+              <w:t xml:space="preserve">, </w:t>
+            </w:r>
+            <w:r>
+              <w:rPr>
+                <w:rFonts w:ascii="Consolas" w:cs="Consolas" w:eastAsia="Consolas" w:hAnsi="Consolas"/>
+                <w:sz w:val="17"/>
+                <w:szCs w:val="17"/>
+              </w:rPr>
+              <w:t xml:space="preserve">RELATIVE</w:t>
+            </w:r>
+            <w:r>
+              <w:rPr>
+                <w:rFonts w:ascii="Calibri" w:cs="Calibri" w:eastAsia="Calibri" w:hAnsi="Calibri"/>
+                <w:sz w:val="18"/>
+                <w:szCs w:val="18"/>
+              </w:rPr>
+              <w:t xml:space="preserve">, </w:t>
+            </w:r>
+            <w:r>
+              <w:rPr>
+                <w:rFonts w:ascii="Consolas" w:cs="Consolas" w:eastAsia="Consolas" w:hAnsi="Consolas"/>
+                <w:sz w:val="17"/>
+                <w:szCs w:val="17"/>
+              </w:rPr>
+              <w:t xml:space="preserve">REFERRER</w:t>
+            </w:r>
+            <w:r>
+              <w:rPr>
+                <w:rFonts w:ascii="Calibri" w:cs="Calibri" w:eastAsia="Calibri" w:hAnsi="Calibri"/>
+                <w:sz w:val="18"/>
+                <w:szCs w:val="18"/>
+              </w:rPr>
+              <w:t xml:space="preserve">, </w:t>
+            </w:r>
+            <w:r>
+              <w:rPr>
+                <w:rFonts w:ascii="Consolas" w:cs="Consolas" w:eastAsia="Consolas" w:hAnsi="Consolas"/>
+                <w:sz w:val="17"/>
+                <w:szCs w:val="17"/>
+              </w:rPr>
+              <w:t xml:space="preserve">REFERRAL</w:t>
+            </w:r>
+            <w:r>
+              <w:rPr>
+                <w:rFonts w:ascii="Calibri" w:cs="Calibri" w:eastAsia="Calibri" w:hAnsi="Calibri"/>
+                <w:sz w:val="18"/>
+                <w:szCs w:val="18"/>
+              </w:rPr>
+              <w:t xml:space="preserve">, </w:t>
+            </w:r>
+            <w:r>
+              <w:rPr>
+                <w:rFonts w:ascii="Consolas" w:cs="Consolas" w:eastAsia="Consolas" w:hAnsi="Consolas"/>
+                <w:sz w:val="17"/>
+                <w:szCs w:val="17"/>
+              </w:rPr>
+              <w:t xml:space="preserve">PARENT_COMPANY</w:t>
+            </w:r>
+            <w:r>
+              <w:rPr>
+                <w:rFonts w:ascii="Calibri" w:cs="Calibri" w:eastAsia="Calibri" w:hAnsi="Calibri"/>
+                <w:sz w:val="18"/>
+                <w:szCs w:val="18"/>
+              </w:rPr>
+              <w:t xml:space="preserve">, </w:t>
+            </w:r>
+            <w:r>
+              <w:rPr>
+                <w:rFonts w:ascii="Consolas" w:cs="Consolas" w:eastAsia="Consolas" w:hAnsi="Consolas"/>
+                <w:sz w:val="17"/>
+                <w:szCs w:val="17"/>
+              </w:rPr>
+              <w:t xml:space="preserve">SUBSIDIARY</w:t>
+            </w:r>
+            <w:r>
+              <w:rPr>
+                <w:rFonts w:ascii="Calibri" w:cs="Calibri" w:eastAsia="Calibri" w:hAnsi="Calibri"/>
+                <w:sz w:val="18"/>
+                <w:szCs w:val="18"/>
+              </w:rPr>
+              <w:t xml:space="preserve">, </w:t>
+            </w:r>
+            <w:r>
+              <w:rPr>
+                <w:rFonts w:ascii="Consolas" w:cs="Consolas" w:eastAsia="Consolas" w:hAnsi="Consolas"/>
+                <w:sz w:val="17"/>
+                <w:szCs w:val="17"/>
+              </w:rPr>
+              <w:t xml:space="preserve">AFFILIATE</w:t>
+            </w:r>
+            <w:r>
+              <w:rPr>
+                <w:rFonts w:ascii="Calibri" w:cs="Calibri" w:eastAsia="Calibri" w:hAnsi="Calibri"/>
+                <w:sz w:val="18"/>
+                <w:szCs w:val="18"/>
+              </w:rPr>
+              <w:t xml:space="preserve">, </w:t>
+            </w:r>
+            <w:r>
+              <w:rPr>
+                <w:rFonts w:ascii="Consolas" w:cs="Consolas" w:eastAsia="Consolas" w:hAnsi="Consolas"/>
+                <w:sz w:val="17"/>
+                <w:szCs w:val="17"/>
+              </w:rPr>
+              <w:t xml:space="preserve">PARTNER</w:t>
+            </w:r>
+          </w:p>
+        </w:tc>
+      </w:tr>
+      <w:tr>
+        <w:trPr>
+          <w:cantSplit/>
+        </w:trPr>
+        <w:tc>
+          <w:tcPr>
+            <w:tcW w:type="dxa" w:w="2344"/>
+            <w:tcBorders>
+              <w:top w:val="single" w:color="BFC5CE" w:sz="4"/>
+              <w:left w:val="single" w:color="BFC5CE" w:sz="4"/>
+              <w:bottom w:val="single" w:color="BFC5CE" w:sz="4"/>
+              <w:right w:val="single" w:color="BFC5CE" w:sz="4"/>
+            </w:tcBorders>
+            <w:tcMar>
+              <w:top w:type="dxa" w:w="40"/>
+              <w:left w:type="dxa" w:w="80"/>
+              <w:bottom w:type="dxa" w:w="40"/>
+              <w:right w:type="dxa" w:w="80"/>
+            </w:tcMar>
+          </w:tcPr>
+          <w:p>
+            <w:pPr>
+              <w:spacing w:after="0" w:before="0"/>
+              <w:jc w:val="left"/>
+            </w:pPr>
+            <w:r>
+              <w:rPr>
+                <w:rFonts w:ascii="Calibri" w:cs="Calibri" w:eastAsia="Calibri" w:hAnsi="Calibri"/>
+                <w:sz w:val="18"/>
+                <w:szCs w:val="18"/>
+              </w:rPr>
+              <w:t xml:space="preserve">Metric definitions</w:t>
+            </w:r>
+          </w:p>
+        </w:tc>
+        <w:tc>
+          <w:tcPr>
+            <w:tcW w:type="dxa" w:w="7294"/>
+            <w:tcBorders>
+              <w:top w:val="single" w:color="BFC5CE" w:sz="4"/>
+              <w:left w:val="single" w:color="BFC5CE" w:sz="4"/>
+              <w:bottom w:val="single" w:color="BFC5CE" w:sz="4"/>
+              <w:right w:val="single" w:color="BFC5CE" w:sz="4"/>
+            </w:tcBorders>
+            <w:tcMar>
+              <w:top w:type="dxa" w:w="40"/>
+              <w:left w:type="dxa" w:w="80"/>
+              <w:bottom w:type="dxa" w:w="40"/>
+              <w:right w:type="dxa" w:w="80"/>
+            </w:tcMar>
+          </w:tcPr>
+          <w:p>
+            <w:pPr>
+              <w:spacing w:after="0" w:before="0"/>
+              <w:jc w:val="left"/>
+            </w:pPr>
+            <w:r>
+              <w:rPr>
+                <w:rFonts w:ascii="Consolas" w:cs="Consolas" w:eastAsia="Consolas" w:hAnsi="Consolas"/>
+                <w:sz w:val="17"/>
+                <w:szCs w:val="17"/>
+              </w:rPr>
+              <w:t xml:space="preserve">DAYS_SINCE_LAST_PURCHASE</w:t>
+            </w:r>
+            <w:r>
+              <w:rPr>
+                <w:rFonts w:ascii="Calibri" w:cs="Calibri" w:eastAsia="Calibri" w:hAnsi="Calibri"/>
+                <w:sz w:val="18"/>
+                <w:szCs w:val="18"/>
+              </w:rPr>
+              <w:t xml:space="preserve">, </w:t>
+            </w:r>
+            <w:r>
+              <w:rPr>
+                <w:rFonts w:ascii="Consolas" w:cs="Consolas" w:eastAsia="Consolas" w:hAnsi="Consolas"/>
+                <w:sz w:val="17"/>
+                <w:szCs w:val="17"/>
+              </w:rPr>
+              <w:t xml:space="preserve">CROSS_PROJECT_COUNT</w:t>
+            </w:r>
+            <w:r>
+              <w:rPr>
+                <w:rFonts w:ascii="Calibri" w:cs="Calibri" w:eastAsia="Calibri" w:hAnsi="Calibri"/>
+                <w:sz w:val="18"/>
+                <w:szCs w:val="18"/>
+              </w:rPr>
+              <w:t xml:space="preserve">, </w:t>
+            </w:r>
+            <w:r>
+              <w:rPr>
+                <w:rFonts w:ascii="Consolas" w:cs="Consolas" w:eastAsia="Consolas" w:hAnsi="Consolas"/>
+                <w:sz w:val="17"/>
+                <w:szCs w:val="17"/>
+              </w:rPr>
+              <w:t xml:space="preserve">PRODUCT_OWNERSHIP_COUNT</w:t>
+            </w:r>
+            <w:r>
+              <w:rPr>
+                <w:rFonts w:ascii="Calibri" w:cs="Calibri" w:eastAsia="Calibri" w:hAnsi="Calibri"/>
+                <w:sz w:val="18"/>
+                <w:szCs w:val="18"/>
+              </w:rPr>
+              <w:t xml:space="preserve">, </w:t>
+            </w:r>
+            <w:r>
+              <w:rPr>
+                <w:rFonts w:ascii="Consolas" w:cs="Consolas" w:eastAsia="Consolas" w:hAnsi="Consolas"/>
+                <w:sz w:val="17"/>
+                <w:szCs w:val="17"/>
+              </w:rPr>
+              <w:t xml:space="preserve">CHURN_RISK</w:t>
+            </w:r>
+            <w:r>
+              <w:rPr>
+                <w:rFonts w:ascii="Calibri" w:cs="Calibri" w:eastAsia="Calibri" w:hAnsi="Calibri"/>
+                <w:sz w:val="18"/>
+                <w:szCs w:val="18"/>
+              </w:rPr>
+              <w:t xml:space="preserve">, </w:t>
+            </w:r>
+            <w:r>
+              <w:rPr>
+                <w:rFonts w:ascii="Consolas" w:cs="Consolas" w:eastAsia="Consolas" w:hAnsi="Consolas"/>
+                <w:sz w:val="17"/>
+                <w:szCs w:val="17"/>
+              </w:rPr>
+              <w:t xml:space="preserve">POINTS_BALANCE</w:t>
+            </w:r>
+            <w:r>
+              <w:rPr>
+                <w:rFonts w:ascii="Calibri" w:cs="Calibri" w:eastAsia="Calibri" w:hAnsi="Calibri"/>
+                <w:sz w:val="18"/>
+                <w:szCs w:val="18"/>
+              </w:rPr>
+              <w:t xml:space="preserve">, </w:t>
+            </w:r>
+            <w:r>
+              <w:rPr>
+                <w:rFonts w:ascii="Consolas" w:cs="Consolas" w:eastAsia="Consolas" w:hAnsi="Consolas"/>
+                <w:sz w:val="17"/>
+                <w:szCs w:val="17"/>
+              </w:rPr>
+              <w:t xml:space="preserve">IS_MULTI_PROJECT</w:t>
+            </w:r>
+            <w:r>
+              <w:rPr>
+                <w:rFonts w:ascii="Calibri" w:cs="Calibri" w:eastAsia="Calibri" w:hAnsi="Calibri"/>
+                <w:sz w:val="18"/>
+                <w:szCs w:val="18"/>
+              </w:rPr>
+              <w:t xml:space="preserve">, </w:t>
+            </w:r>
+            <w:r>
+              <w:rPr>
+                <w:rFonts w:ascii="Consolas" w:cs="Consolas" w:eastAsia="Consolas" w:hAnsi="Consolas"/>
+                <w:sz w:val="17"/>
+                <w:szCs w:val="17"/>
+              </w:rPr>
+              <w:t xml:space="preserve">LAST_SERVICE_DATE</w:t>
+            </w:r>
+          </w:p>
+        </w:tc>
+      </w:tr>
+      <w:tr>
+        <w:trPr>
+          <w:cantSplit/>
+        </w:trPr>
+        <w:tc>
+          <w:tcPr>
+            <w:tcW w:type="dxa" w:w="2344"/>
+            <w:tcBorders>
+              <w:top w:val="single" w:color="BFC5CE" w:sz="4"/>
+              <w:left w:val="single" w:color="BFC5CE" w:sz="4"/>
+              <w:bottom w:val="single" w:color="BFC5CE" w:sz="4"/>
+              <w:right w:val="single" w:color="BFC5CE" w:sz="4"/>
+            </w:tcBorders>
+            <w:tcMar>
+              <w:top w:type="dxa" w:w="40"/>
+              <w:left w:type="dxa" w:w="80"/>
+              <w:bottom w:type="dxa" w:w="40"/>
+              <w:right w:type="dxa" w:w="80"/>
+            </w:tcMar>
+          </w:tcPr>
+          <w:p>
+            <w:pPr>
+              <w:spacing w:after="0" w:before="0"/>
+              <w:jc w:val="left"/>
+            </w:pPr>
+            <w:r>
+              <w:rPr>
+                <w:rFonts w:ascii="Calibri" w:cs="Calibri" w:eastAsia="Calibri" w:hAnsi="Calibri"/>
+                <w:sz w:val="18"/>
+                <w:szCs w:val="18"/>
+              </w:rPr>
+              <w:t xml:space="preserve">Locations, job titles</w:t>
+            </w:r>
+          </w:p>
+        </w:tc>
+        <w:tc>
+          <w:tcPr>
+            <w:tcW w:type="dxa" w:w="7294"/>
+            <w:tcBorders>
+              <w:top w:val="single" w:color="BFC5CE" w:sz="4"/>
+              <w:left w:val="single" w:color="BFC5CE" w:sz="4"/>
+              <w:bottom w:val="single" w:color="BFC5CE" w:sz="4"/>
+              <w:right w:val="single" w:color="BFC5CE" w:sz="4"/>
+            </w:tcBorders>
+            <w:tcMar>
+              <w:top w:type="dxa" w:w="40"/>
+              <w:left w:type="dxa" w:w="80"/>
+              <w:bottom w:type="dxa" w:w="40"/>
+              <w:right w:type="dxa" w:w="80"/>
+            </w:tcMar>
+          </w:tcPr>
+          <w:p>
+            <w:pPr>
+              <w:spacing w:after="0" w:before="0"/>
+              <w:jc w:val="left"/>
+            </w:pPr>
+            <w:r>
+              <w:rPr>
+                <w:rFonts w:ascii="Calibri" w:cs="Calibri" w:eastAsia="Calibri" w:hAnsi="Calibri"/>
+                <w:sz w:val="18"/>
+                <w:szCs w:val="18"/>
+              </w:rPr>
+              <w:t xml:space="preserve">Any; the Excel import checks its Location ID and Job title ID columns against them</w:t>
+            </w:r>
+          </w:p>
+        </w:tc>
+      </w:tr>
+    </w:tbl>
+    <w:p>
+      <w:pPr>
+        <w:spacing w:after="60" w:before="0"/>
+      </w:pPr>
+    </w:p>
+    <w:p>
+      <w:pPr>
+        <w:spacing w:after="120"/>
+      </w:pPr>
+      <w:r>
+        <w:rPr>
+          <w:rFonts w:ascii="Calibri" w:cs="Calibri" w:eastAsia="Calibri" w:hAnsi="Calibri"/>
+        </w:rPr>
+        <w:t xml:space="preserve">Departments (</w:t>
+      </w:r>
+      <w:r>
+        <w:rPr>
+          <w:rFonts w:ascii="Consolas" w:cs="Consolas" w:eastAsia="Consolas" w:hAnsi="Consolas"/>
+          <w:sz w:val="19"/>
+          <w:szCs w:val="19"/>
+        </w:rPr>
+        <w:t xml:space="preserve">crm_department</w:t>
+      </w:r>
+      <w:r>
+        <w:rPr>
+          <w:rFonts w:ascii="Calibri" w:cs="Calibri" w:eastAsia="Calibri" w:hAnsi="Calibri"/>
+        </w:rPr>
+        <w:t xml:space="preserve">) describe the internal organization: each manager belongs to one, and a role can be reserved for a department. Permissions themselves always come from roles.</w:t>
+      </w:r>
+    </w:p>
+    <w:p>
+      <w:pPr>
+        <w:pStyle w:val="Heading2"/>
+        <w:keepNext/>
+      </w:pPr>
+      <w:r>
+        <w:rPr>
+          <w:rFonts w:ascii="Calibri" w:cs="Calibri" w:eastAsia="Calibri" w:hAnsi="Calibri"/>
+        </w:rPr>
+        <w:t xml:space="preserve">15. Testing, verification and documentation</w:t>
+      </w:r>
+    </w:p>
+    <w:tbl>
+      <w:tblPr>
+        <w:tblW w:type="dxa" w:w="9638"/>
+        <w:tblBorders>
+          <w:top w:val="single" w:color="auto" w:sz="4"/>
+          <w:left w:val="single" w:color="auto" w:sz="4"/>
+          <w:bottom w:val="single" w:color="auto" w:sz="4"/>
+          <w:right w:val="single" w:color="auto" w:sz="4"/>
+          <w:insideH w:val="single" w:color="auto" w:sz="4"/>
+          <w:insideV w:val="single" w:color="auto" w:sz="4"/>
+        </w:tblBorders>
+      </w:tblPr>
+      <w:tblGrid>
+        <w:gridCol w:w="2418"/>
+        <w:gridCol w:w="5601"/>
+        <w:gridCol w:w="1619"/>
+      </w:tblGrid>
+      <w:tr>
+        <w:trPr>
+          <w:tblHeader/>
+        </w:trPr>
+        <w:tc>
+          <w:tcPr>
+            <w:tcW w:type="dxa" w:w="2418"/>
+            <w:tcBorders>
+              <w:top w:val="single" w:color="BFC5CE" w:sz="4"/>
+              <w:left w:val="single" w:color="BFC5CE" w:sz="4"/>
+              <w:bottom w:val="single" w:color="BFC5CE" w:sz="4"/>
+              <w:right w:val="single" w:color="BFC5CE" w:sz="4"/>
+            </w:tcBorders>
+            <w:shd w:fill="E8ECF2" w:color="auto" w:val="clear"/>
+            <w:tcMar>
+              <w:top w:type="dxa" w:w="40"/>
+              <w:left w:type="dxa" w:w="80"/>
+              <w:bottom w:type="dxa" w:w="40"/>
+              <w:right w:type="dxa" w:w="80"/>
+            </w:tcMar>
+          </w:tcPr>
+          <w:p>
+            <w:pPr>
+              <w:spacing w:after="0" w:before="0"/>
+              <w:jc w:val="left"/>
+            </w:pPr>
+            <w:r>
+              <w:rPr>
+                <w:rFonts w:ascii="Calibri" w:cs="Calibri" w:eastAsia="Calibri" w:hAnsi="Calibri"/>
+                <w:b/>
+                <w:bCs/>
+                <w:sz w:val="18"/>
+                <w:szCs w:val="18"/>
+              </w:rPr>
+              <w:t xml:space="preserve">Command</w:t>
+            </w:r>
+          </w:p>
+        </w:tc>
+        <w:tc>
+          <w:tcPr>
+            <w:tcW w:type="dxa" w:w="5601"/>
+            <w:tcBorders>
+              <w:top w:val="single" w:color="BFC5CE" w:sz="4"/>
+              <w:left w:val="single" w:color="BFC5CE" w:sz="4"/>
+              <w:bottom w:val="single" w:color="BFC5CE" w:sz="4"/>
+              <w:right w:val="single" w:color="BFC5CE" w:sz="4"/>
+            </w:tcBorders>
+            <w:shd w:fill="E8ECF2" w:color="auto" w:val="clear"/>
+            <w:tcMar>
+              <w:top w:type="dxa" w:w="40"/>
+              <w:left w:type="dxa" w:w="80"/>
+              <w:bottom w:type="dxa" w:w="40"/>
+              <w:right w:type="dxa" w:w="80"/>
+            </w:tcMar>
+          </w:tcPr>
+          <w:p>
+            <w:pPr>
+              <w:spacing w:after="0" w:before="0"/>
+              <w:jc w:val="left"/>
+            </w:pPr>
+            <w:r>
+              <w:rPr>
+                <w:rFonts w:ascii="Calibri" w:cs="Calibri" w:eastAsia="Calibri" w:hAnsi="Calibri"/>
+                <w:b/>
+                <w:bCs/>
+                <w:sz w:val="18"/>
+                <w:szCs w:val="18"/>
+              </w:rPr>
+              <w:t xml:space="preserve">What it does</w:t>
+            </w:r>
+          </w:p>
+        </w:tc>
+        <w:tc>
+          <w:tcPr>
+            <w:tcW w:type="dxa" w:w="1619"/>
+            <w:tcBorders>
+              <w:top w:val="single" w:color="BFC5CE" w:sz="4"/>
+              <w:left w:val="single" w:color="BFC5CE" w:sz="4"/>
+              <w:bottom w:val="single" w:color="BFC5CE" w:sz="4"/>
+              <w:right w:val="single" w:color="BFC5CE" w:sz="4"/>
+            </w:tcBorders>
+            <w:shd w:fill="E8ECF2" w:color="auto" w:val="clear"/>
+            <w:tcMar>
+              <w:top w:type="dxa" w:w="40"/>
+              <w:left w:type="dxa" w:w="80"/>
+              <w:bottom w:type="dxa" w:w="40"/>
+              <w:right w:type="dxa" w:w="80"/>
+            </w:tcMar>
+          </w:tcPr>
+          <w:p>
+            <w:pPr>
+              <w:spacing w:after="0" w:before="0"/>
+              <w:jc w:val="left"/>
+            </w:pPr>
+            <w:r>
+              <w:rPr>
+                <w:rFonts w:ascii="Calibri" w:cs="Calibri" w:eastAsia="Calibri" w:hAnsi="Calibri"/>
+                <w:b/>
+                <w:bCs/>
+                <w:sz w:val="18"/>
+                <w:szCs w:val="18"/>
+              </w:rPr>
+              <w:t xml:space="preserve">Needs</w:t>
+            </w:r>
+          </w:p>
+        </w:tc>
+      </w:tr>
+      <w:tr>
+        <w:trPr>
+          <w:cantSplit/>
+        </w:trPr>
+        <w:tc>
+          <w:tcPr>
+            <w:tcW w:type="dxa" w:w="2418"/>
+            <w:tcBorders>
+              <w:top w:val="single" w:color="BFC5CE" w:sz="4"/>
+              <w:left w:val="single" w:color="BFC5CE" w:sz="4"/>
+              <w:bottom w:val="single" w:color="BFC5CE" w:sz="4"/>
+              <w:right w:val="single" w:color="BFC5CE" w:sz="4"/>
+            </w:tcBorders>
+            <w:tcMar>
+              <w:top w:type="dxa" w:w="40"/>
+              <w:left w:type="dxa" w:w="80"/>
+              <w:bottom w:type="dxa" w:w="40"/>
+              <w:right w:type="dxa" w:w="80"/>
+            </w:tcMar>
+          </w:tcPr>
+          <w:p>
+            <w:pPr>
+              <w:spacing w:after="0" w:before="0"/>
+              <w:jc w:val="left"/>
+            </w:pPr>
+            <w:r>
+              <w:rPr>
+                <w:rFonts w:ascii="Consolas" w:cs="Consolas" w:eastAsia="Consolas" w:hAnsi="Consolas"/>
+                <w:sz w:val="17"/>
+                <w:szCs w:val="17"/>
+              </w:rPr>
+              <w:t xml:space="preserve">npm run test:identity</w:t>
+            </w:r>
+          </w:p>
+        </w:tc>
+        <w:tc>
+          <w:tcPr>
+            <w:tcW w:type="dxa" w:w="5601"/>
+            <w:tcBorders>
+              <w:top w:val="single" w:color="BFC5CE" w:sz="4"/>
+              <w:left w:val="single" w:color="BFC5CE" w:sz="4"/>
+              <w:bottom w:val="single" w:color="BFC5CE" w:sz="4"/>
+              <w:right w:val="single" w:color="BFC5CE" w:sz="4"/>
+            </w:tcBorders>
+            <w:tcMar>
+              <w:top w:type="dxa" w:w="40"/>
+              <w:left w:type="dxa" w:w="80"/>
+              <w:bottom w:type="dxa" w:w="40"/>
+              <w:right w:type="dxa" w:w="80"/>
+            </w:tcMar>
+          </w:tcPr>
+          <w:p>
+            <w:pPr>
+              <w:spacing w:after="0" w:before="0"/>
+              <w:jc w:val="left"/>
+            </w:pPr>
+            <w:r>
+              <w:rPr>
+                <w:rFonts w:ascii="Calibri" w:cs="Calibri" w:eastAsia="Calibri" w:hAnsi="Calibri"/>
+                <w:sz w:val="18"/>
+                <w:szCs w:val="18"/>
+              </w:rPr>
+              <w:t xml:space="preserve">Matching scores, intake/merge/review workflow, Excel parsing and import, e-shop staging, department API rules (in memory).</w:t>
+            </w:r>
+          </w:p>
+        </w:tc>
+        <w:tc>
+          <w:tcPr>
+            <w:tcW w:type="dxa" w:w="1619"/>
+            <w:tcBorders>
+              <w:top w:val="single" w:color="BFC5CE" w:sz="4"/>
+              <w:left w:val="single" w:color="BFC5CE" w:sz="4"/>
+              <w:bottom w:val="single" w:color="BFC5CE" w:sz="4"/>
+              <w:right w:val="single" w:color="BFC5CE" w:sz="4"/>
+            </w:tcBorders>
+            <w:tcMar>
+              <w:top w:type="dxa" w:w="40"/>
+              <w:left w:type="dxa" w:w="80"/>
+              <w:bottom w:type="dxa" w:w="40"/>
+              <w:right w:type="dxa" w:w="80"/>
+            </w:tcMar>
+          </w:tcPr>
+          <w:p>
+            <w:pPr>
+              <w:spacing w:after="0" w:before="0"/>
+              <w:jc w:val="left"/>
+            </w:pPr>
+            <w:r>
+              <w:rPr>
+                <w:rFonts w:ascii="Calibri" w:cs="Calibri" w:eastAsia="Calibri" w:hAnsi="Calibri"/>
+                <w:sz w:val="18"/>
+                <w:szCs w:val="18"/>
+              </w:rPr>
+              <w:t xml:space="preserve">nothing</w:t>
+            </w:r>
+          </w:p>
+        </w:tc>
+      </w:tr>
+      <w:tr>
+        <w:trPr>
+          <w:cantSplit/>
+        </w:trPr>
+        <w:tc>
+          <w:tcPr>
+            <w:tcW w:type="dxa" w:w="2418"/>
+            <w:tcBorders>
+              <w:top w:val="single" w:color="BFC5CE" w:sz="4"/>
+              <w:left w:val="single" w:color="BFC5CE" w:sz="4"/>
+              <w:bottom w:val="single" w:color="BFC5CE" w:sz="4"/>
+              <w:right w:val="single" w:color="BFC5CE" w:sz="4"/>
+            </w:tcBorders>
+            <w:tcMar>
+              <w:top w:type="dxa" w:w="40"/>
+              <w:left w:type="dxa" w:w="80"/>
+              <w:bottom w:type="dxa" w:w="40"/>
+              <w:right w:type="dxa" w:w="80"/>
+            </w:tcMar>
+          </w:tcPr>
+          <w:p>
+            <w:pPr>
+              <w:spacing w:after="0" w:before="0"/>
+              <w:jc w:val="left"/>
+            </w:pPr>
+            <w:r>
+              <w:rPr>
+                <w:rFonts w:ascii="Consolas" w:cs="Consolas" w:eastAsia="Consolas" w:hAnsi="Consolas"/>
+                <w:sz w:val="17"/>
+                <w:szCs w:val="17"/>
+              </w:rPr>
+              <w:t xml:space="preserve">node scripts/check-crm.js &lt;url&gt;</w:t>
+            </w:r>
+          </w:p>
+        </w:tc>
+        <w:tc>
+          <w:tcPr>
+            <w:tcW w:type="dxa" w:w="5601"/>
+            <w:tcBorders>
+              <w:top w:val="single" w:color="BFC5CE" w:sz="4"/>
+              <w:left w:val="single" w:color="BFC5CE" w:sz="4"/>
+              <w:bottom w:val="single" w:color="BFC5CE" w:sz="4"/>
+              <w:right w:val="single" w:color="BFC5CE" w:sz="4"/>
+            </w:tcBorders>
+            <w:tcMar>
+              <w:top w:type="dxa" w:w="40"/>
+              <w:left w:type="dxa" w:w="80"/>
+              <w:bottom w:type="dxa" w:w="40"/>
+              <w:right w:type="dxa" w:w="80"/>
+            </w:tcMar>
+          </w:tcPr>
+          <w:p>
+            <w:pPr>
+              <w:spacing w:after="0" w:before="0"/>
+              <w:jc w:val="left"/>
+            </w:pPr>
+            <w:r>
+              <w:rPr>
+                <w:rFonts w:ascii="Calibri" w:cs="Calibri" w:eastAsia="Calibri" w:hAnsi="Calibri"/>
+                <w:sz w:val="18"/>
+                <w:szCs w:val="18"/>
+              </w:rPr>
+              <w:t xml:space="preserve">End-to-end checks through the console API: permissions, customers, Excel import and e-shop staging, products and transfers, points, events, segments, campaigns, sites.</w:t>
+            </w:r>
+          </w:p>
+        </w:tc>
+        <w:tc>
+          <w:tcPr>
+            <w:tcW w:type="dxa" w:w="1619"/>
+            <w:tcBorders>
+              <w:top w:val="single" w:color="BFC5CE" w:sz="4"/>
+              <w:left w:val="single" w:color="BFC5CE" w:sz="4"/>
+              <w:bottom w:val="single" w:color="BFC5CE" w:sz="4"/>
+              <w:right w:val="single" w:color="BFC5CE" w:sz="4"/>
+            </w:tcBorders>
+            <w:tcMar>
+              <w:top w:type="dxa" w:w="40"/>
+              <w:left w:type="dxa" w:w="80"/>
+              <w:bottom w:type="dxa" w:w="40"/>
+              <w:right w:type="dxa" w:w="80"/>
+            </w:tcMar>
+          </w:tcPr>
+          <w:p>
+            <w:pPr>
+              <w:spacing w:after="0" w:before="0"/>
+              <w:jc w:val="left"/>
+            </w:pPr>
+            <w:r>
+              <w:rPr>
+                <w:rFonts w:ascii="Calibri" w:cs="Calibri" w:eastAsia="Calibri" w:hAnsi="Calibri"/>
+                <w:sz w:val="18"/>
+                <w:szCs w:val="18"/>
+              </w:rPr>
+              <w:t xml:space="preserve">running API on a dev database</w:t>
+            </w:r>
+          </w:p>
+        </w:tc>
+      </w:tr>
+      <w:tr>
+        <w:trPr>
+          <w:cantSplit/>
+        </w:trPr>
+        <w:tc>
+          <w:tcPr>
+            <w:tcW w:type="dxa" w:w="2418"/>
+            <w:tcBorders>
+              <w:top w:val="single" w:color="BFC5CE" w:sz="4"/>
+              <w:left w:val="single" w:color="BFC5CE" w:sz="4"/>
+              <w:bottom w:val="single" w:color="BFC5CE" w:sz="4"/>
+              <w:right w:val="single" w:color="BFC5CE" w:sz="4"/>
+            </w:tcBorders>
+            <w:tcMar>
+              <w:top w:type="dxa" w:w="40"/>
+              <w:left w:type="dxa" w:w="80"/>
+              <w:bottom w:type="dxa" w:w="40"/>
+              <w:right w:type="dxa" w:w="80"/>
+            </w:tcMar>
+          </w:tcPr>
+          <w:p>
+            <w:pPr>
+              <w:spacing w:after="0" w:before="0"/>
+              <w:jc w:val="left"/>
+            </w:pPr>
+            <w:r>
+              <w:rPr>
+                <w:rFonts w:ascii="Consolas" w:cs="Consolas" w:eastAsia="Consolas" w:hAnsi="Consolas"/>
+                <w:sz w:val="17"/>
+                <w:szCs w:val="17"/>
+              </w:rPr>
+              <w:t xml:space="preserve">PG_SCHEMA=&lt;schema&gt; node scripts/check-crm-integration.js &lt;url&gt;</w:t>
+            </w:r>
+          </w:p>
+        </w:tc>
+        <w:tc>
+          <w:tcPr>
+            <w:tcW w:type="dxa" w:w="5601"/>
+            <w:tcBorders>
+              <w:top w:val="single" w:color="BFC5CE" w:sz="4"/>
+              <w:left w:val="single" w:color="BFC5CE" w:sz="4"/>
+              <w:bottom w:val="single" w:color="BFC5CE" w:sz="4"/>
+              <w:right w:val="single" w:color="BFC5CE" w:sz="4"/>
+            </w:tcBorders>
+            <w:tcMar>
+              <w:top w:type="dxa" w:w="40"/>
+              <w:left w:type="dxa" w:w="80"/>
+              <w:bottom w:type="dxa" w:w="40"/>
+              <w:right w:type="dxa" w:w="80"/>
+            </w:tcMar>
+          </w:tcPr>
+          <w:p>
+            <w:pPr>
+              <w:spacing w:after="0" w:before="0"/>
+              <w:jc w:val="left"/>
+            </w:pPr>
+            <w:r>
+              <w:rPr>
+                <w:rFonts w:ascii="Calibri" w:cs="Calibri" w:eastAsia="Calibri" w:hAnsi="Calibri"/>
+                <w:sz w:val="18"/>
+                <w:szCs w:val="18"/>
+              </w:rPr>
+              <w:t xml:space="preserve">Department API (keys, CREATED/MERGED/EXISTING/QUEUED, feed, acknowledge, validation, e-shop) and project editing rules.</w:t>
+            </w:r>
+          </w:p>
+        </w:tc>
+        <w:tc>
+          <w:tcPr>
+            <w:tcW w:type="dxa" w:w="1619"/>
+            <w:tcBorders>
+              <w:top w:val="single" w:color="BFC5CE" w:sz="4"/>
+              <w:left w:val="single" w:color="BFC5CE" w:sz="4"/>
+              <w:bottom w:val="single" w:color="BFC5CE" w:sz="4"/>
+              <w:right w:val="single" w:color="BFC5CE" w:sz="4"/>
+            </w:tcBorders>
+            <w:tcMar>
+              <w:top w:type="dxa" w:w="40"/>
+              <w:left w:type="dxa" w:w="80"/>
+              <w:bottom w:type="dxa" w:w="40"/>
+              <w:right w:type="dxa" w:w="80"/>
+            </w:tcMar>
+          </w:tcPr>
+          <w:p>
+            <w:pPr>
+              <w:spacing w:after="0" w:before="0"/>
+              <w:jc w:val="left"/>
+            </w:pPr>
+            <w:r>
+              <w:rPr>
+                <w:rFonts w:ascii="Calibri" w:cs="Calibri" w:eastAsia="Calibri" w:hAnsi="Calibri"/>
+                <w:sz w:val="18"/>
+                <w:szCs w:val="18"/>
+              </w:rPr>
+              <w:t xml:space="preserve">running API on a dev database</w:t>
+            </w:r>
+          </w:p>
+        </w:tc>
+      </w:tr>
+      <w:tr>
+        <w:trPr>
+          <w:cantSplit/>
+        </w:trPr>
+        <w:tc>
+          <w:tcPr>
+            <w:tcW w:type="dxa" w:w="2418"/>
+            <w:tcBorders>
+              <w:top w:val="single" w:color="BFC5CE" w:sz="4"/>
+              <w:left w:val="single" w:color="BFC5CE" w:sz="4"/>
+              <w:bottom w:val="single" w:color="BFC5CE" w:sz="4"/>
+              <w:right w:val="single" w:color="BFC5CE" w:sz="4"/>
+            </w:tcBorders>
+            <w:tcMar>
+              <w:top w:type="dxa" w:w="40"/>
+              <w:left w:type="dxa" w:w="80"/>
+              <w:bottom w:type="dxa" w:w="40"/>
+              <w:right w:type="dxa" w:w="80"/>
+            </w:tcMar>
+          </w:tcPr>
+          <w:p>
+            <w:pPr>
+              <w:spacing w:after="0" w:before="0"/>
+              <w:jc w:val="left"/>
+            </w:pPr>
+            <w:r>
+              <w:rPr>
+                <w:rFonts w:ascii="Consolas" w:cs="Consolas" w:eastAsia="Consolas" w:hAnsi="Consolas"/>
+                <w:sz w:val="17"/>
+                <w:szCs w:val="17"/>
+              </w:rPr>
+              <w:t xml:space="preserve">node scripts/verify-migrations.js</w:t>
+            </w:r>
+          </w:p>
+        </w:tc>
+        <w:tc>
+          <w:tcPr>
+            <w:tcW w:type="dxa" w:w="5601"/>
+            <w:tcBorders>
+              <w:top w:val="single" w:color="BFC5CE" w:sz="4"/>
+              <w:left w:val="single" w:color="BFC5CE" w:sz="4"/>
+              <w:bottom w:val="single" w:color="BFC5CE" w:sz="4"/>
+              <w:right w:val="single" w:color="BFC5CE" w:sz="4"/>
+            </w:tcBorders>
+            <w:tcMar>
+              <w:top w:type="dxa" w:w="40"/>
+              <w:left w:type="dxa" w:w="80"/>
+              <w:bottom w:type="dxa" w:w="40"/>
+              <w:right w:type="dxa" w:w="80"/>
+            </w:tcMar>
+          </w:tcPr>
+          <w:p>
+            <w:pPr>
+              <w:spacing w:after="0" w:before="0"/>
+              <w:jc w:val="left"/>
+            </w:pPr>
+            <w:r>
+              <w:rPr>
+                <w:rFonts w:ascii="Calibri" w:cs="Calibri" w:eastAsia="Calibri" w:hAnsi="Calibri"/>
+                <w:sz w:val="18"/>
+                <w:szCs w:val="18"/>
+              </w:rPr>
+              <w:t xml:space="preserve">Builds the full migration chain in a throwaway schema and compares it with </w:t>
+            </w:r>
+            <w:r>
+              <w:rPr>
+                <w:rFonts w:ascii="Consolas" w:cs="Consolas" w:eastAsia="Consolas" w:hAnsi="Consolas"/>
+                <w:sz w:val="17"/>
+                <w:szCs w:val="17"/>
+              </w:rPr>
+              <w:t xml:space="preserve">schema.sql</w:t>
+            </w:r>
+            <w:r>
+              <w:rPr>
+                <w:rFonts w:ascii="Calibri" w:cs="Calibri" w:eastAsia="Calibri" w:hAnsi="Calibri"/>
+                <w:sz w:val="18"/>
+                <w:szCs w:val="18"/>
+              </w:rPr>
+              <w:t xml:space="preserve">.</w:t>
+            </w:r>
+          </w:p>
+        </w:tc>
+        <w:tc>
+          <w:tcPr>
+            <w:tcW w:type="dxa" w:w="1619"/>
+            <w:tcBorders>
+              <w:top w:val="single" w:color="BFC5CE" w:sz="4"/>
+              <w:left w:val="single" w:color="BFC5CE" w:sz="4"/>
+              <w:bottom w:val="single" w:color="BFC5CE" w:sz="4"/>
+              <w:right w:val="single" w:color="BFC5CE" w:sz="4"/>
+            </w:tcBorders>
+            <w:tcMar>
+              <w:top w:type="dxa" w:w="40"/>
+              <w:left w:type="dxa" w:w="80"/>
+              <w:bottom w:type="dxa" w:w="40"/>
+              <w:right w:type="dxa" w:w="80"/>
+            </w:tcMar>
+          </w:tcPr>
+          <w:p>
+            <w:pPr>
+              <w:spacing w:after="0" w:before="0"/>
+              <w:jc w:val="left"/>
+            </w:pPr>
+            <w:r>
+              <w:rPr>
+                <w:rFonts w:ascii="Calibri" w:cs="Calibri" w:eastAsia="Calibri" w:hAnsi="Calibri"/>
+                <w:sz w:val="18"/>
+                <w:szCs w:val="18"/>
+              </w:rPr>
+              <w:t xml:space="preserve">dev database</w:t>
+            </w:r>
+          </w:p>
+        </w:tc>
+      </w:tr>
+      <w:tr>
+        <w:trPr>
+          <w:cantSplit/>
+        </w:trPr>
+        <w:tc>
+          <w:tcPr>
+            <w:tcW w:type="dxa" w:w="2418"/>
+            <w:tcBorders>
+              <w:top w:val="single" w:color="BFC5CE" w:sz="4"/>
+              <w:left w:val="single" w:color="BFC5CE" w:sz="4"/>
+              <w:bottom w:val="single" w:color="BFC5CE" w:sz="4"/>
+              <w:right w:val="single" w:color="BFC5CE" w:sz="4"/>
+            </w:tcBorders>
+            <w:tcMar>
+              <w:top w:type="dxa" w:w="40"/>
+              <w:left w:type="dxa" w:w="80"/>
+              <w:bottom w:type="dxa" w:w="40"/>
+              <w:right w:type="dxa" w:w="80"/>
+            </w:tcMar>
+          </w:tcPr>
+          <w:p>
+            <w:pPr>
+              <w:spacing w:after="0" w:before="0"/>
+              <w:jc w:val="left"/>
+            </w:pPr>
+            <w:r>
+              <w:rPr>
+                <w:rFonts w:ascii="Consolas" w:cs="Consolas" w:eastAsia="Consolas" w:hAnsi="Consolas"/>
+                <w:sz w:val="17"/>
+                <w:szCs w:val="17"/>
+              </w:rPr>
+              <w:t xml:space="preserve">npm run crm:docs</w:t>
+            </w:r>
+          </w:p>
+        </w:tc>
+        <w:tc>
+          <w:tcPr>
+            <w:tcW w:type="dxa" w:w="5601"/>
+            <w:tcBorders>
+              <w:top w:val="single" w:color="BFC5CE" w:sz="4"/>
+              <w:left w:val="single" w:color="BFC5CE" w:sz="4"/>
+              <w:bottom w:val="single" w:color="BFC5CE" w:sz="4"/>
+              <w:right w:val="single" w:color="BFC5CE" w:sz="4"/>
+            </w:tcBorders>
+            <w:tcMar>
+              <w:top w:type="dxa" w:w="40"/>
+              <w:left w:type="dxa" w:w="80"/>
+              <w:bottom w:type="dxa" w:w="40"/>
+              <w:right w:type="dxa" w:w="80"/>
+            </w:tcMar>
+          </w:tcPr>
+          <w:p>
+            <w:pPr>
+              <w:spacing w:after="0" w:before="0"/>
+              <w:jc w:val="left"/>
+            </w:pPr>
+            <w:r>
+              <w:rPr>
+                <w:rFonts w:ascii="Calibri" w:cs="Calibri" w:eastAsia="Calibri" w:hAnsi="Calibri"/>
+                <w:sz w:val="18"/>
+                <w:szCs w:val="18"/>
+              </w:rPr>
+              <w:t xml:space="preserve">Regenerates </w:t>
+            </w:r>
+            <w:r>
+              <w:rPr>
+                <w:rFonts w:ascii="Consolas" w:cs="Consolas" w:eastAsia="Consolas" w:hAnsi="Consolas"/>
+                <w:sz w:val="17"/>
+                <w:szCs w:val="17"/>
+              </w:rPr>
+              <w:t xml:space="preserve">crm-database.md</w:t>
+            </w:r>
+            <w:r>
+              <w:rPr>
+                <w:rFonts w:ascii="Calibri" w:cs="Calibri" w:eastAsia="Calibri" w:hAnsi="Calibri"/>
+                <w:sz w:val="18"/>
+                <w:szCs w:val="18"/>
+              </w:rPr>
+              <w:t xml:space="preserve"> (refuses while any field is undocumented) and writes the Word copies of both documents.</w:t>
+            </w:r>
+          </w:p>
+        </w:tc>
+        <w:tc>
+          <w:tcPr>
+            <w:tcW w:type="dxa" w:w="1619"/>
+            <w:tcBorders>
+              <w:top w:val="single" w:color="BFC5CE" w:sz="4"/>
+              <w:left w:val="single" w:color="BFC5CE" w:sz="4"/>
+              <w:bottom w:val="single" w:color="BFC5CE" w:sz="4"/>
+              <w:right w:val="single" w:color="BFC5CE" w:sz="4"/>
+            </w:tcBorders>
+            <w:tcMar>
+              <w:top w:type="dxa" w:w="40"/>
+              <w:left w:type="dxa" w:w="80"/>
+              <w:bottom w:type="dxa" w:w="40"/>
+              <w:right w:type="dxa" w:w="80"/>
+            </w:tcMar>
+          </w:tcPr>
+          <w:p>
+            <w:pPr>
+              <w:spacing w:after="0" w:before="0"/>
+              <w:jc w:val="left"/>
+            </w:pPr>
+            <w:r>
+              <w:rPr>
+                <w:rFonts w:ascii="Calibri" w:cs="Calibri" w:eastAsia="Calibri" w:hAnsi="Calibri"/>
+                <w:sz w:val="18"/>
+                <w:szCs w:val="18"/>
+              </w:rPr>
+              <w:t xml:space="preserve">dev database</w:t>
+            </w:r>
+          </w:p>
+        </w:tc>
+      </w:tr>
+      <w:tr>
+        <w:trPr>
+          <w:cantSplit/>
+        </w:trPr>
+        <w:tc>
+          <w:tcPr>
+            <w:tcW w:type="dxa" w:w="2418"/>
+            <w:tcBorders>
+              <w:top w:val="single" w:color="BFC5CE" w:sz="4"/>
+              <w:left w:val="single" w:color="BFC5CE" w:sz="4"/>
+              <w:bottom w:val="single" w:color="BFC5CE" w:sz="4"/>
+              <w:right w:val="single" w:color="BFC5CE" w:sz="4"/>
+            </w:tcBorders>
+            <w:tcMar>
+              <w:top w:type="dxa" w:w="40"/>
+              <w:left w:type="dxa" w:w="80"/>
+              <w:bottom w:type="dxa" w:w="40"/>
+              <w:right w:type="dxa" w:w="80"/>
+            </w:tcMar>
+          </w:tcPr>
+          <w:p>
+            <w:pPr>
+              <w:spacing w:after="0" w:before="0"/>
+              <w:jc w:val="left"/>
+            </w:pPr>
+            <w:r>
+              <w:rPr>
+                <w:rFonts w:ascii="Consolas" w:cs="Consolas" w:eastAsia="Consolas" w:hAnsi="Consolas"/>
+                <w:sz w:val="17"/>
+                <w:szCs w:val="17"/>
+              </w:rPr>
+              <w:t xml:space="preserve">npm run crm:mock-import</w:t>
+            </w:r>
+          </w:p>
+        </w:tc>
+        <w:tc>
+          <w:tcPr>
+            <w:tcW w:type="dxa" w:w="5601"/>
+            <w:tcBorders>
+              <w:top w:val="single" w:color="BFC5CE" w:sz="4"/>
+              <w:left w:val="single" w:color="BFC5CE" w:sz="4"/>
+              <w:bottom w:val="single" w:color="BFC5CE" w:sz="4"/>
+              <w:right w:val="single" w:color="BFC5CE" w:sz="4"/>
+            </w:tcBorders>
+            <w:tcMar>
+              <w:top w:type="dxa" w:w="40"/>
+              <w:left w:type="dxa" w:w="80"/>
+              <w:bottom w:type="dxa" w:w="40"/>
+              <w:right w:type="dxa" w:w="80"/>
+            </w:tcMar>
+          </w:tcPr>
+          <w:p>
+            <w:pPr>
+              <w:spacing w:after="0" w:before="0"/>
+              <w:jc w:val="left"/>
+            </w:pPr>
+            <w:r>
+              <w:rPr>
+                <w:rFonts w:ascii="Calibri" w:cs="Calibri" w:eastAsia="Calibri" w:hAnsi="Calibri"/>
+                <w:sz w:val="18"/>
+                <w:szCs w:val="18"/>
+              </w:rPr>
+              <w:t xml:space="preserve">Writes </w:t>
+            </w:r>
+            <w:r>
+              <w:rPr>
+                <w:rFonts w:ascii="Consolas" w:cs="Consolas" w:eastAsia="Consolas" w:hAnsi="Consolas"/>
+                <w:sz w:val="17"/>
+                <w:szCs w:val="17"/>
+              </w:rPr>
+              <w:t xml:space="preserve">docs/samples/crm-customers-test-import.xlsx</w:t>
+            </w:r>
+            <w:r>
+              <w:rPr>
+                <w:rFonts w:ascii="Calibri" w:cs="Calibri" w:eastAsia="Calibri" w:hAnsi="Calibri"/>
+                <w:sz w:val="18"/>
+                <w:szCs w:val="18"/>
+              </w:rPr>
+              <w:t xml:space="preserve">: 260+ rows covering new customers, one person on several rows (one per phone), exact copies, a second account for the same person, review cases (50 and 65 points), copies of rows under review, look-alikes that are different people, and every kind of error. Its *Test cases* sheet says what each row should become. IDs are read from the database's own lists.</w:t>
+            </w:r>
+          </w:p>
+        </w:tc>
+        <w:tc>
+          <w:tcPr>
+            <w:tcW w:type="dxa" w:w="1619"/>
+            <w:tcBorders>
+              <w:top w:val="single" w:color="BFC5CE" w:sz="4"/>
+              <w:left w:val="single" w:color="BFC5CE" w:sz="4"/>
+              <w:bottom w:val="single" w:color="BFC5CE" w:sz="4"/>
+              <w:right w:val="single" w:color="BFC5CE" w:sz="4"/>
+            </w:tcBorders>
+            <w:tcMar>
+              <w:top w:type="dxa" w:w="40"/>
+              <w:left w:type="dxa" w:w="80"/>
+              <w:bottom w:type="dxa" w:w="40"/>
+              <w:right w:type="dxa" w:w="80"/>
+            </w:tcMar>
+          </w:tcPr>
+          <w:p>
+            <w:pPr>
+              <w:spacing w:after="0" w:before="0"/>
+              <w:jc w:val="left"/>
+            </w:pPr>
+            <w:r>
+              <w:rPr>
+                <w:rFonts w:ascii="Calibri" w:cs="Calibri" w:eastAsia="Calibri" w:hAnsi="Calibri"/>
+                <w:sz w:val="18"/>
+                <w:szCs w:val="18"/>
+              </w:rPr>
+              <w:t xml:space="preserve">dev database</w:t>
+            </w:r>
+          </w:p>
+        </w:tc>
+      </w:tr>
+      <w:tr>
+        <w:trPr>
+          <w:cantSplit/>
+        </w:trPr>
+        <w:tc>
+          <w:tcPr>
+            <w:tcW w:type="dxa" w:w="2418"/>
+            <w:tcBorders>
+              <w:top w:val="single" w:color="BFC5CE" w:sz="4"/>
+              <w:left w:val="single" w:color="BFC5CE" w:sz="4"/>
+              <w:bottom w:val="single" w:color="BFC5CE" w:sz="4"/>
+              <w:right w:val="single" w:color="BFC5CE" w:sz="4"/>
+            </w:tcBorders>
+            <w:tcMar>
+              <w:top w:type="dxa" w:w="40"/>
+              <w:left w:type="dxa" w:w="80"/>
+              <w:bottom w:type="dxa" w:w="40"/>
+              <w:right w:type="dxa" w:w="80"/>
+            </w:tcMar>
+          </w:tcPr>
+          <w:p>
+            <w:pPr>
+              <w:spacing w:after="0" w:before="0"/>
+              <w:jc w:val="left"/>
+            </w:pPr>
+            <w:r>
+              <w:rPr>
+                <w:rFonts w:ascii="Consolas" w:cs="Consolas" w:eastAsia="Consolas" w:hAnsi="Consolas"/>
+                <w:sz w:val="17"/>
+                <w:szCs w:val="17"/>
+              </w:rPr>
               <w:t xml:space="preserve">node scripts/crm-docs-word.js</w:t>
             </w:r>
           </w:p>
         </w:tc>
         <w:tc>
           <w:tcPr>
-            <w:tcW w:type="dxa" w:w="5567"/>
+            <w:tcW w:type="dxa" w:w="5601"/>
             <w:tcBorders>
               <w:top w:val="single" w:color="BFC5CE" w:sz="4"/>
               <w:left w:val="single" w:color="BFC5CE" w:sz="4"/>
@@ -17472,7 +20124,7 @@
         </w:tc>
         <w:tc>
           <w:tcPr>
-            <w:tcW w:type="dxa" w:w="1609"/>
+            <w:tcW w:type="dxa" w:w="1619"/>
             <w:tcBorders>
               <w:top w:val="single" w:color="BFC5CE" w:sz="4"/>
               <w:left w:val="single" w:color="BFC5CE" w:sz="4"/>

</xml_diff>